<commit_message>
1. Added a new column called 'eutUnitPowerRating'  in the 'emi_eut_table'. 2. Added the same field in Jobcard document print out also. 3. Added View change log button and feature in EMIJCPreview,jsx to view the change log. 4. Added new .env vraiables for both frontend and backend for better management of development and production process.
</commit_message>
<xml_diff>
--- a/frontend/src/templates/TS2_JC_TEMPLATE.docx
+++ b/frontend/src/templates/TS2_JC_TEMPLATE.docx
@@ -183,13 +183,14 @@
         <w:tblLook w:val="01E0" w:firstRow="1" w:lastRow="1" w:firstColumn="1" w:lastColumn="1" w:noHBand="0" w:noVBand="0"/>
       </w:tblPr>
       <w:tblGrid>
-        <w:gridCol w:w="1135"/>
-        <w:gridCol w:w="3685"/>
-        <w:gridCol w:w="809"/>
-        <w:gridCol w:w="1752"/>
-        <w:gridCol w:w="1266"/>
-        <w:gridCol w:w="294"/>
-        <w:gridCol w:w="1791"/>
+        <w:gridCol w:w="709"/>
+        <w:gridCol w:w="3402"/>
+        <w:gridCol w:w="851"/>
+        <w:gridCol w:w="1417"/>
+        <w:gridCol w:w="1276"/>
+        <w:gridCol w:w="992"/>
+        <w:gridCol w:w="567"/>
+        <w:gridCol w:w="1518"/>
       </w:tblGrid>
       <w:tr>
         <w:trPr>
@@ -198,7 +199,7 @@
         <w:tc>
           <w:tcPr>
             <w:tcW w:w="8647" w:type="dxa"/>
-            <w:gridSpan w:val="5"/>
+            <w:gridSpan w:val="6"/>
             <w:tcBorders>
               <w:top w:val="nil"/>
               <w:left w:val="nil"/>
@@ -280,7 +281,31 @@
                 <w:sz w:val="24"/>
                 <w:szCs w:val="28"/>
               </w:rPr>
-              <w:t>{jcNumber}</w:t>
+              <w:t>{</w:t>
+            </w:r>
+            <w:proofErr w:type="spellStart"/>
+            <w:r>
+              <w:rPr>
+                <w:rFonts w:ascii="Calibri" w:eastAsia="Calibri" w:hAnsi="Calibri" w:cs="Calibri"/>
+                <w:b/>
+                <w:bCs/>
+                <w:spacing w:val="-5"/>
+                <w:sz w:val="24"/>
+                <w:szCs w:val="28"/>
+              </w:rPr>
+              <w:t>jcNumber</w:t>
+            </w:r>
+            <w:proofErr w:type="spellEnd"/>
+            <w:r>
+              <w:rPr>
+                <w:rFonts w:ascii="Calibri" w:eastAsia="Calibri" w:hAnsi="Calibri" w:cs="Calibri"/>
+                <w:b/>
+                <w:bCs/>
+                <w:spacing w:val="-5"/>
+                <w:sz w:val="24"/>
+                <w:szCs w:val="28"/>
+              </w:rPr>
+              <w:t>}</w:t>
             </w:r>
           </w:p>
         </w:tc>
@@ -292,7 +317,7 @@
         <w:tc>
           <w:tcPr>
             <w:tcW w:w="10732" w:type="dxa"/>
-            <w:gridSpan w:val="7"/>
+            <w:gridSpan w:val="8"/>
             <w:tcBorders>
               <w:bottom w:val="single" w:sz="8" w:space="0" w:color="000000"/>
             </w:tcBorders>
@@ -387,6 +412,7 @@
               </w:rPr>
               <w:t xml:space="preserve"> {</w:t>
             </w:r>
+            <w:proofErr w:type="spellStart"/>
             <w:r>
               <w:rPr>
                 <w:rFonts w:ascii="Calibri" w:eastAsia="Calibri" w:hAnsi="Calibri" w:cs="Calibri"/>
@@ -395,6 +421,7 @@
               </w:rPr>
               <w:t>itemReceivedDate</w:t>
             </w:r>
+            <w:proofErr w:type="spellEnd"/>
             <w:r>
               <w:rPr>
                 <w:rFonts w:ascii="Calibri" w:eastAsia="Calibri" w:hAnsi="Calibri" w:cs="Calibri"/>
@@ -462,6 +489,7 @@
               </w:rPr>
               <w:t>Start: {</w:t>
             </w:r>
+            <w:proofErr w:type="spellStart"/>
             <w:r>
               <w:rPr>
                 <w:rFonts w:ascii="Calibri" w:eastAsia="Calibri" w:hAnsi="Calibri" w:cs="Calibri"/>
@@ -469,6 +497,7 @@
               </w:rPr>
               <w:t>jcOpenDate</w:t>
             </w:r>
+            <w:proofErr w:type="spellEnd"/>
             <w:r>
               <w:rPr>
                 <w:rFonts w:ascii="Calibri" w:eastAsia="Calibri" w:hAnsi="Calibri" w:cs="Calibri"/>
@@ -550,6 +579,7 @@
               </w:rPr>
               <w:t>{</w:t>
             </w:r>
+            <w:proofErr w:type="spellStart"/>
             <w:r>
               <w:rPr>
                 <w:rFonts w:ascii="Calibri" w:eastAsia="Calibri" w:hAnsi="Calibri" w:cs="Calibri"/>
@@ -557,6 +587,7 @@
               </w:rPr>
               <w:t>jcClosedDate</w:t>
             </w:r>
+            <w:proofErr w:type="spellEnd"/>
             <w:r>
               <w:rPr>
                 <w:rFonts w:ascii="Calibri" w:eastAsia="Calibri" w:hAnsi="Calibri" w:cs="Calibri"/>
@@ -608,7 +639,23 @@
                 <w:rFonts w:ascii="Calibri" w:eastAsia="Calibri" w:hAnsi="Calibri" w:cs="Calibri"/>
                 <w:sz w:val="20"/>
               </w:rPr>
-              <w:t>{companyName}</w:t>
+              <w:t>{</w:t>
+            </w:r>
+            <w:proofErr w:type="spellStart"/>
+            <w:r>
+              <w:rPr>
+                <w:rFonts w:ascii="Calibri" w:eastAsia="Calibri" w:hAnsi="Calibri" w:cs="Calibri"/>
+                <w:sz w:val="20"/>
+              </w:rPr>
+              <w:t>companyName</w:t>
+            </w:r>
+            <w:proofErr w:type="spellEnd"/>
+            <w:r>
+              <w:rPr>
+                <w:rFonts w:ascii="Calibri" w:eastAsia="Calibri" w:hAnsi="Calibri" w:cs="Calibri"/>
+                <w:sz w:val="20"/>
+              </w:rPr>
+              <w:t>}</w:t>
             </w:r>
           </w:p>
           <w:p>
@@ -632,7 +679,23 @@
                 <w:rFonts w:ascii="Calibri" w:eastAsia="Calibri" w:hAnsi="Calibri" w:cs="Calibri"/>
                 <w:sz w:val="20"/>
               </w:rPr>
-              <w:t>Condition of Samples: {sampleCondition}</w:t>
+              <w:t>Condition of Samples: {</w:t>
+            </w:r>
+            <w:proofErr w:type="spellStart"/>
+            <w:r>
+              <w:rPr>
+                <w:rFonts w:ascii="Calibri" w:eastAsia="Calibri" w:hAnsi="Calibri" w:cs="Calibri"/>
+                <w:sz w:val="20"/>
+              </w:rPr>
+              <w:t>sampleCondition</w:t>
+            </w:r>
+            <w:proofErr w:type="spellEnd"/>
+            <w:r>
+              <w:rPr>
+                <w:rFonts w:ascii="Calibri" w:eastAsia="Calibri" w:hAnsi="Calibri" w:cs="Calibri"/>
+                <w:sz w:val="20"/>
+              </w:rPr>
+              <w:t>}</w:t>
             </w:r>
           </w:p>
           <w:p>
@@ -666,6 +729,7 @@
               </w:rPr>
               <w:t>{</w:t>
             </w:r>
+            <w:proofErr w:type="spellStart"/>
             <w:r>
               <w:rPr>
                 <w:rFonts w:ascii="Calibri" w:eastAsia="Calibri" w:hAnsi="Calibri" w:cs="Calibri"/>
@@ -674,6 +738,7 @@
               </w:rPr>
               <w:t>typeOfRequest</w:t>
             </w:r>
+            <w:proofErr w:type="spellEnd"/>
             <w:r>
               <w:rPr>
                 <w:rFonts w:ascii="Calibri" w:eastAsia="Calibri" w:hAnsi="Calibri" w:cs="Calibri"/>
@@ -722,6 +787,7 @@
               </w:rPr>
               <w:t>Slot Duration: {</w:t>
             </w:r>
+            <w:proofErr w:type="spellStart"/>
             <w:r>
               <w:rPr>
                 <w:rFonts w:ascii="Calibri" w:eastAsia="Calibri" w:hAnsi="Calibri" w:cs="Calibri"/>
@@ -730,6 +796,7 @@
               </w:rPr>
               <w:t>slotDuration</w:t>
             </w:r>
+            <w:proofErr w:type="spellEnd"/>
             <w:r>
               <w:rPr>
                 <w:rFonts w:ascii="Calibri" w:eastAsia="Calibri" w:hAnsi="Calibri" w:cs="Calibri"/>
@@ -1034,7 +1101,7 @@
         </w:trPr>
         <w:tc>
           <w:tcPr>
-            <w:tcW w:w="1135" w:type="dxa"/>
+            <w:tcW w:w="709" w:type="dxa"/>
           </w:tcPr>
           <w:p>
             <w:pPr>
@@ -1044,6 +1111,7 @@
               <w:rPr>
                 <w:rFonts w:ascii="Calibri" w:eastAsia="Calibri" w:hAnsi="Calibri" w:cs="Calibri"/>
                 <w:b/>
+                <w:spacing w:val="-2"/>
                 <w:sz w:val="20"/>
               </w:rPr>
             </w:pPr>
@@ -1064,6 +1132,18 @@
               </w:rPr>
               <w:t xml:space="preserve"> </w:t>
             </w:r>
+          </w:p>
+          <w:p>
+            <w:pPr>
+              <w:spacing w:before="6"/>
+              <w:ind w:left="46" w:right="31"/>
+              <w:jc w:val="center"/>
+              <w:rPr>
+                <w:rFonts w:ascii="Calibri" w:eastAsia="Calibri" w:hAnsi="Calibri" w:cs="Calibri"/>
+                <w:b/>
+                <w:sz w:val="20"/>
+              </w:rPr>
+            </w:pPr>
             <w:r>
               <w:rPr>
                 <w:rFonts w:ascii="Calibri" w:eastAsia="Calibri" w:hAnsi="Calibri" w:cs="Calibri"/>
@@ -1076,7 +1156,7 @@
         </w:tc>
         <w:tc>
           <w:tcPr>
-            <w:tcW w:w="3685" w:type="dxa"/>
+            <w:tcW w:w="3402" w:type="dxa"/>
             <w:tcBorders>
               <w:top w:val="single" w:sz="8" w:space="0" w:color="000000"/>
             </w:tcBorders>
@@ -1101,45 +1181,21 @@
                 <w:b/>
                 <w:sz w:val="20"/>
               </w:rPr>
-              <w:t>EUT</w:t>
-            </w:r>
-            <w:r>
-              <w:rPr>
-                <w:rFonts w:ascii="Calibri" w:eastAsia="Calibri" w:hAnsi="Calibri" w:cs="Calibri"/>
-                <w:b/>
-                <w:sz w:val="20"/>
-              </w:rPr>
-              <w:t xml:space="preserve"> </w:t>
-            </w:r>
-            <w:r>
-              <w:rPr>
-                <w:rFonts w:ascii="Calibri" w:eastAsia="Calibri" w:hAnsi="Calibri" w:cs="Calibri"/>
-                <w:b/>
-                <w:sz w:val="20"/>
-              </w:rPr>
-              <w:t>Detai</w:t>
-            </w:r>
-            <w:r>
-              <w:rPr>
-                <w:rFonts w:ascii="Calibri" w:eastAsia="Calibri" w:hAnsi="Calibri" w:cs="Calibri"/>
-                <w:b/>
-                <w:sz w:val="20"/>
-              </w:rPr>
-              <w:t>l</w:t>
-            </w:r>
-            <w:r>
-              <w:rPr>
-                <w:rFonts w:ascii="Calibri" w:eastAsia="Calibri" w:hAnsi="Calibri" w:cs="Calibri"/>
-                <w:b/>
-                <w:sz w:val="20"/>
-              </w:rPr>
-              <w:t>s</w:t>
+              <w:t xml:space="preserve">EUT </w:t>
+            </w:r>
+            <w:r>
+              <w:rPr>
+                <w:rFonts w:ascii="Calibri" w:eastAsia="Calibri" w:hAnsi="Calibri" w:cs="Calibri"/>
+                <w:b/>
+                <w:sz w:val="20"/>
+              </w:rPr>
+              <w:t>Details</w:t>
             </w:r>
           </w:p>
         </w:tc>
         <w:tc>
           <w:tcPr>
-            <w:tcW w:w="809" w:type="dxa"/>
+            <w:tcW w:w="851" w:type="dxa"/>
             <w:tcBorders>
               <w:top w:val="single" w:sz="8" w:space="0" w:color="000000"/>
             </w:tcBorders>
@@ -1167,7 +1223,7 @@
         </w:tc>
         <w:tc>
           <w:tcPr>
-            <w:tcW w:w="1752" w:type="dxa"/>
+            <w:tcW w:w="1417" w:type="dxa"/>
             <w:tcBorders>
               <w:top w:val="single" w:sz="8" w:space="0" w:color="000000"/>
             </w:tcBorders>
@@ -1195,7 +1251,52 @@
         </w:tc>
         <w:tc>
           <w:tcPr>
-            <w:tcW w:w="1560" w:type="dxa"/>
+            <w:tcW w:w="1276" w:type="dxa"/>
+            <w:tcBorders>
+              <w:top w:val="single" w:sz="8" w:space="0" w:color="000000"/>
+            </w:tcBorders>
+          </w:tcPr>
+          <w:p>
+            <w:pPr>
+              <w:spacing w:before="6"/>
+              <w:ind w:left="-14"/>
+              <w:jc w:val="center"/>
+              <w:rPr>
+                <w:rFonts w:ascii="Calibri" w:eastAsia="Calibri" w:hAnsi="Calibri" w:cs="Calibri"/>
+                <w:b/>
+                <w:sz w:val="20"/>
+              </w:rPr>
+            </w:pPr>
+            <w:r>
+              <w:rPr>
+                <w:rFonts w:ascii="Calibri" w:eastAsia="Calibri" w:hAnsi="Calibri" w:cs="Calibri"/>
+                <w:b/>
+                <w:sz w:val="20"/>
+              </w:rPr>
+              <w:t>Model</w:t>
+            </w:r>
+            <w:r>
+              <w:rPr>
+                <w:rFonts w:ascii="Calibri" w:eastAsia="Calibri" w:hAnsi="Calibri" w:cs="Calibri"/>
+                <w:b/>
+                <w:spacing w:val="-2"/>
+                <w:sz w:val="20"/>
+              </w:rPr>
+              <w:t xml:space="preserve"> </w:t>
+            </w:r>
+            <w:r>
+              <w:rPr>
+                <w:rFonts w:ascii="Calibri" w:eastAsia="Calibri" w:hAnsi="Calibri" w:cs="Calibri"/>
+                <w:b/>
+                <w:sz w:val="20"/>
+              </w:rPr>
+              <w:t>No</w:t>
+            </w:r>
+          </w:p>
+        </w:tc>
+        <w:tc>
+          <w:tcPr>
+            <w:tcW w:w="1559" w:type="dxa"/>
             <w:gridSpan w:val="2"/>
             <w:tcBorders>
               <w:top w:val="single" w:sz="8" w:space="0" w:color="000000"/>
@@ -1203,28 +1304,25 @@
           </w:tcPr>
           <w:p>
             <w:pPr>
-              <w:spacing w:before="6"/>
-              <w:ind w:left="-14"/>
               <w:jc w:val="center"/>
               <w:rPr>
-                <w:rFonts w:ascii="Calibri" w:eastAsia="Calibri" w:hAnsi="Calibri" w:cs="Calibri"/>
-                <w:b/>
-                <w:sz w:val="20"/>
-              </w:rPr>
-            </w:pPr>
-            <w:r>
-              <w:rPr>
-                <w:rFonts w:ascii="Calibri" w:eastAsia="Calibri" w:hAnsi="Calibri" w:cs="Calibri"/>
-                <w:b/>
-                <w:sz w:val="20"/>
-              </w:rPr>
-              <w:t>Model</w:t>
-            </w:r>
-            <w:r>
-              <w:rPr>
-                <w:rFonts w:ascii="Calibri" w:eastAsia="Calibri" w:hAnsi="Calibri" w:cs="Calibri"/>
-                <w:b/>
-                <w:spacing w:val="-2"/>
+                <w:rFonts w:eastAsia="Calibri" w:hAnsi="Calibri" w:cs="Calibri"/>
+                <w:sz w:val="20"/>
+              </w:rPr>
+            </w:pPr>
+            <w:r>
+              <w:rPr>
+                <w:rFonts w:ascii="Calibri" w:eastAsia="Calibri" w:hAnsi="Calibri" w:cs="Calibri"/>
+                <w:b/>
+                <w:sz w:val="20"/>
+              </w:rPr>
+              <w:t>Serial</w:t>
+            </w:r>
+            <w:r>
+              <w:rPr>
+                <w:rFonts w:ascii="Calibri" w:eastAsia="Calibri" w:hAnsi="Calibri" w:cs="Calibri"/>
+                <w:b/>
+                <w:spacing w:val="-3"/>
                 <w:sz w:val="20"/>
               </w:rPr>
               <w:t xml:space="preserve"> </w:t>
@@ -1241,7 +1339,7 @@
         </w:tc>
         <w:tc>
           <w:tcPr>
-            <w:tcW w:w="1791" w:type="dxa"/>
+            <w:tcW w:w="1518" w:type="dxa"/>
             <w:tcBorders>
               <w:top w:val="single" w:sz="8" w:space="0" w:color="000000"/>
             </w:tcBorders>
@@ -1251,33 +1349,19 @@
               <w:jc w:val="center"/>
               <w:rPr>
                 <w:rFonts w:eastAsia="Calibri" w:hAnsi="Calibri" w:cs="Calibri"/>
-                <w:sz w:val="20"/>
-              </w:rPr>
-            </w:pPr>
-            <w:r>
-              <w:rPr>
-                <w:rFonts w:ascii="Calibri" w:eastAsia="Calibri" w:hAnsi="Calibri" w:cs="Calibri"/>
-                <w:b/>
-                <w:sz w:val="20"/>
-              </w:rPr>
-              <w:t>Serial</w:t>
-            </w:r>
-            <w:r>
-              <w:rPr>
-                <w:rFonts w:ascii="Calibri" w:eastAsia="Calibri" w:hAnsi="Calibri" w:cs="Calibri"/>
-                <w:b/>
-                <w:spacing w:val="-3"/>
-                <w:sz w:val="20"/>
-              </w:rPr>
-              <w:t xml:space="preserve"> </w:t>
-            </w:r>
-            <w:r>
-              <w:rPr>
-                <w:rFonts w:ascii="Calibri" w:eastAsia="Calibri" w:hAnsi="Calibri" w:cs="Calibri"/>
-                <w:b/>
-                <w:sz w:val="20"/>
-              </w:rPr>
-              <w:t>No</w:t>
+                <w:b/>
+                <w:bCs/>
+                <w:sz w:val="20"/>
+              </w:rPr>
+            </w:pPr>
+            <w:r>
+              <w:rPr>
+                <w:rFonts w:eastAsia="Calibri" w:hAnsi="Calibri" w:cs="Calibri"/>
+                <w:b/>
+                <w:bCs/>
+                <w:sz w:val="20"/>
+              </w:rPr>
+              <w:t>Unit Power Rating</w:t>
             </w:r>
           </w:p>
         </w:tc>
@@ -1288,7 +1372,7 @@
         </w:trPr>
         <w:tc>
           <w:tcPr>
-            <w:tcW w:w="1135" w:type="dxa"/>
+            <w:tcW w:w="709" w:type="dxa"/>
           </w:tcPr>
           <w:p>
             <w:pPr>
@@ -1314,6 +1398,7 @@
               </w:rPr>
               <w:t>{#</w:t>
             </w:r>
+            <w:proofErr w:type="spellStart"/>
             <w:r>
               <w:rPr>
                 <w:rFonts w:cstheme="minorHAnsi"/>
@@ -1325,6 +1410,7 @@
               </w:rPr>
               <w:t>parsedEUT</w:t>
             </w:r>
+            <w:proofErr w:type="spellEnd"/>
             <w:r>
               <w:rPr>
                 <w:rFonts w:cstheme="minorHAnsi"/>
@@ -1333,13 +1419,35 @@
                 <w:szCs w:val="18"/>
                 <w:shd w:val="clear" w:color="auto" w:fill="FFFFFF"/>
               </w:rPr>
-              <w:t>} {slNoCounter}</w:t>
+              <w:t>} {</w:t>
+            </w:r>
+            <w:proofErr w:type="spellStart"/>
+            <w:r>
+              <w:rPr>
+                <w:rFonts w:cstheme="minorHAnsi"/>
+                <w:color w:val="000000"/>
+                <w:sz w:val="18"/>
+                <w:szCs w:val="18"/>
+                <w:shd w:val="clear" w:color="auto" w:fill="FFFFFF"/>
+              </w:rPr>
+              <w:t>slNoCounter</w:t>
+            </w:r>
+            <w:proofErr w:type="spellEnd"/>
+            <w:r>
+              <w:rPr>
+                <w:rFonts w:cstheme="minorHAnsi"/>
+                <w:color w:val="000000"/>
+                <w:sz w:val="18"/>
+                <w:szCs w:val="18"/>
+                <w:shd w:val="clear" w:color="auto" w:fill="FFFFFF"/>
+              </w:rPr>
+              <w:t>}</w:t>
             </w:r>
           </w:p>
         </w:tc>
         <w:tc>
           <w:tcPr>
-            <w:tcW w:w="3685" w:type="dxa"/>
+            <w:tcW w:w="3402" w:type="dxa"/>
             <w:tcBorders>
               <w:top w:val="single" w:sz="8" w:space="0" w:color="000000"/>
             </w:tcBorders>
@@ -1363,6 +1471,7 @@
               </w:rPr>
               <w:t>{</w:t>
             </w:r>
+            <w:proofErr w:type="spellStart"/>
             <w:r>
               <w:rPr>
                 <w:rFonts w:ascii="Calibri" w:eastAsia="Calibri" w:hAnsi="Calibri" w:cs="Calibri"/>
@@ -1371,6 +1480,7 @@
               </w:rPr>
               <w:t>eutName</w:t>
             </w:r>
+            <w:proofErr w:type="spellEnd"/>
             <w:r>
               <w:rPr>
                 <w:rFonts w:ascii="Calibri" w:eastAsia="Calibri" w:hAnsi="Calibri" w:cs="Calibri"/>
@@ -1383,7 +1493,7 @@
         </w:tc>
         <w:tc>
           <w:tcPr>
-            <w:tcW w:w="809" w:type="dxa"/>
+            <w:tcW w:w="851" w:type="dxa"/>
             <w:tcBorders>
               <w:top w:val="single" w:sz="8" w:space="0" w:color="000000"/>
             </w:tcBorders>
@@ -1406,6 +1516,7 @@
               </w:rPr>
               <w:t>{</w:t>
             </w:r>
+            <w:proofErr w:type="spellStart"/>
             <w:r>
               <w:rPr>
                 <w:rFonts w:ascii="Calibri" w:eastAsia="Calibri" w:hAnsi="Calibri" w:cs="Calibri"/>
@@ -1414,6 +1525,7 @@
               </w:rPr>
               <w:t>eutQuantity</w:t>
             </w:r>
+            <w:proofErr w:type="spellEnd"/>
             <w:r>
               <w:rPr>
                 <w:rFonts w:ascii="Calibri" w:eastAsia="Calibri" w:hAnsi="Calibri" w:cs="Calibri"/>
@@ -1426,7 +1538,7 @@
         </w:tc>
         <w:tc>
           <w:tcPr>
-            <w:tcW w:w="1752" w:type="dxa"/>
+            <w:tcW w:w="1417" w:type="dxa"/>
             <w:tcBorders>
               <w:top w:val="single" w:sz="8" w:space="0" w:color="000000"/>
             </w:tcBorders>
@@ -1450,6 +1562,7 @@
               </w:rPr>
               <w:t>{</w:t>
             </w:r>
+            <w:proofErr w:type="spellStart"/>
             <w:r>
               <w:rPr>
                 <w:rFonts w:ascii="Calibri" w:eastAsia="Calibri" w:hAnsi="Calibri" w:cs="Calibri"/>
@@ -1458,6 +1571,7 @@
               </w:rPr>
               <w:t>eutPartNumber</w:t>
             </w:r>
+            <w:proofErr w:type="spellEnd"/>
             <w:r>
               <w:rPr>
                 <w:rFonts w:ascii="Calibri" w:eastAsia="Calibri" w:hAnsi="Calibri" w:cs="Calibri"/>
@@ -1470,7 +1584,53 @@
         </w:tc>
         <w:tc>
           <w:tcPr>
-            <w:tcW w:w="1560" w:type="dxa"/>
+            <w:tcW w:w="1276" w:type="dxa"/>
+            <w:tcBorders>
+              <w:top w:val="single" w:sz="8" w:space="0" w:color="000000"/>
+            </w:tcBorders>
+          </w:tcPr>
+          <w:p>
+            <w:pPr>
+              <w:spacing w:before="6"/>
+              <w:ind w:left="-14"/>
+              <w:jc w:val="center"/>
+              <w:rPr>
+                <w:rFonts w:ascii="Calibri" w:eastAsia="Calibri" w:hAnsi="Calibri" w:cs="Calibri"/>
+                <w:bCs/>
+                <w:sz w:val="20"/>
+              </w:rPr>
+            </w:pPr>
+            <w:r>
+              <w:rPr>
+                <w:rFonts w:ascii="Calibri" w:eastAsia="Calibri" w:hAnsi="Calibri" w:cs="Calibri"/>
+                <w:bCs/>
+                <w:sz w:val="20"/>
+              </w:rPr>
+              <w:t>{</w:t>
+            </w:r>
+            <w:proofErr w:type="spellStart"/>
+            <w:r>
+              <w:rPr>
+                <w:rFonts w:ascii="Calibri" w:eastAsia="Calibri" w:hAnsi="Calibri" w:cs="Calibri"/>
+                <w:bCs/>
+                <w:sz w:val="20"/>
+              </w:rPr>
+              <w:t>eutModelNumber</w:t>
+            </w:r>
+            <w:proofErr w:type="spellEnd"/>
+            <w:r>
+              <w:rPr>
+                <w:rFonts w:ascii="Calibri" w:eastAsia="Calibri" w:hAnsi="Calibri" w:cs="Calibri"/>
+                <w:bCs/>
+                <w:sz w:val="20"/>
+              </w:rPr>
+              <w:t>}</w:t>
+            </w:r>
+          </w:p>
+        </w:tc>
+        <w:tc>
+          <w:tcPr>
+            <w:tcW w:w="1559" w:type="dxa"/>
             <w:gridSpan w:val="2"/>
             <w:tcBorders>
               <w:top w:val="single" w:sz="8" w:space="0" w:color="000000"/>
@@ -1479,7 +1639,7 @@
           <w:p>
             <w:pPr>
               <w:spacing w:before="6"/>
-              <w:ind w:left="-14"/>
+              <w:ind w:left="-15"/>
               <w:jc w:val="center"/>
               <w:rPr>
                 <w:rFonts w:ascii="Calibri" w:eastAsia="Calibri" w:hAnsi="Calibri" w:cs="Calibri"/>
@@ -1495,19 +1655,29 @@
               </w:rPr>
               <w:t>{</w:t>
             </w:r>
+            <w:proofErr w:type="spellStart"/>
             <w:r>
               <w:rPr>
                 <w:rFonts w:ascii="Calibri" w:eastAsia="Calibri" w:hAnsi="Calibri" w:cs="Calibri"/>
                 <w:bCs/>
                 <w:sz w:val="20"/>
               </w:rPr>
-              <w:t>eutModelNumber}</w:t>
+              <w:t>eutSerialNumber</w:t>
+            </w:r>
+            <w:proofErr w:type="spellEnd"/>
+            <w:r>
+              <w:rPr>
+                <w:rFonts w:ascii="Calibri" w:eastAsia="Calibri" w:hAnsi="Calibri" w:cs="Calibri"/>
+                <w:bCs/>
+                <w:sz w:val="20"/>
+              </w:rPr>
+              <w:t>}</w:t>
             </w:r>
           </w:p>
         </w:tc>
         <w:tc>
           <w:tcPr>
-            <w:tcW w:w="1791" w:type="dxa"/>
+            <w:tcW w:w="1518" w:type="dxa"/>
             <w:tcBorders>
               <w:top w:val="single" w:sz="8" w:space="0" w:color="000000"/>
             </w:tcBorders>
@@ -1521,6 +1691,7 @@
                 <w:rFonts w:ascii="Calibri" w:eastAsia="Calibri" w:hAnsi="Calibri" w:cs="Calibri"/>
                 <w:bCs/>
                 <w:sz w:val="20"/>
+                <w:lang w:val="en-IN"/>
               </w:rPr>
             </w:pPr>
             <w:r>
@@ -1531,13 +1702,41 @@
               </w:rPr>
               <w:t>{</w:t>
             </w:r>
+            <w:proofErr w:type="spellStart"/>
             <w:r>
               <w:rPr>
                 <w:rFonts w:ascii="Calibri" w:eastAsia="Calibri" w:hAnsi="Calibri" w:cs="Calibri"/>
                 <w:bCs/>
                 <w:sz w:val="20"/>
               </w:rPr>
-              <w:t>eutSerialNumber}{/parsedEUT}</w:t>
+              <w:t>eutUnitPowerRating</w:t>
+            </w:r>
+            <w:proofErr w:type="spellEnd"/>
+            <w:r>
+              <w:rPr>
+                <w:rFonts w:ascii="Calibri" w:eastAsia="Calibri" w:hAnsi="Calibri" w:cs="Calibri"/>
+                <w:bCs/>
+                <w:sz w:val="20"/>
+              </w:rPr>
+              <w:t>}{/</w:t>
+            </w:r>
+            <w:proofErr w:type="spellStart"/>
+            <w:r>
+              <w:rPr>
+                <w:rFonts w:ascii="Calibri" w:eastAsia="Calibri" w:hAnsi="Calibri" w:cs="Calibri"/>
+                <w:bCs/>
+                <w:sz w:val="20"/>
+              </w:rPr>
+              <w:t>parsedEUT</w:t>
+            </w:r>
+            <w:proofErr w:type="spellEnd"/>
+            <w:r>
+              <w:rPr>
+                <w:rFonts w:ascii="Calibri" w:eastAsia="Calibri" w:hAnsi="Calibri" w:cs="Calibri"/>
+                <w:bCs/>
+                <w:sz w:val="20"/>
+              </w:rPr>
+              <w:t>}</w:t>
             </w:r>
           </w:p>
         </w:tc>
@@ -1549,7 +1748,7 @@
         <w:tc>
           <w:tcPr>
             <w:tcW w:w="10732" w:type="dxa"/>
-            <w:gridSpan w:val="7"/>
+            <w:gridSpan w:val="8"/>
           </w:tcPr>
           <w:p>
             <w:pPr>
@@ -1586,15 +1785,15 @@
               <w:tblLook w:val="04A0" w:firstRow="1" w:lastRow="0" w:firstColumn="1" w:lastColumn="0" w:noHBand="0" w:noVBand="1"/>
             </w:tblPr>
             <w:tblGrid>
-              <w:gridCol w:w="988"/>
-              <w:gridCol w:w="4252"/>
-              <w:gridCol w:w="3674"/>
+              <w:gridCol w:w="846"/>
+              <w:gridCol w:w="3827"/>
+              <w:gridCol w:w="4241"/>
               <w:gridCol w:w="1783"/>
             </w:tblGrid>
             <w:tr>
               <w:tc>
                 <w:tcPr>
-                  <w:tcW w:w="988" w:type="dxa"/>
+                  <w:tcW w:w="846" w:type="dxa"/>
                 </w:tcPr>
                 <w:p>
                   <w:pPr>
@@ -1638,7 +1837,7 @@
               </w:tc>
               <w:tc>
                 <w:tcPr>
-                  <w:tcW w:w="4252" w:type="dxa"/>
+                  <w:tcW w:w="3827" w:type="dxa"/>
                 </w:tcPr>
                 <w:p>
                   <w:pPr>
@@ -1665,7 +1864,7 @@
               </w:tc>
               <w:tc>
                 <w:tcPr>
-                  <w:tcW w:w="3674" w:type="dxa"/>
+                  <w:tcW w:w="4241" w:type="dxa"/>
                 </w:tcPr>
                 <w:p>
                   <w:pPr>
@@ -1724,7 +1923,7 @@
               </w:trPr>
               <w:tc>
                 <w:tcPr>
-                  <w:tcW w:w="988" w:type="dxa"/>
+                  <w:tcW w:w="846" w:type="dxa"/>
                 </w:tcPr>
                 <w:p>
                   <w:pPr>
@@ -1751,6 +1950,8 @@
                     </w:rPr>
                     <w:t>{#</w:t>
                   </w:r>
+                  <w:proofErr w:type="spellStart"/>
+                  <w:proofErr w:type="gramStart"/>
                   <w:r>
                     <w:rPr>
                       <w:rFonts w:asciiTheme="minorHAnsi" w:eastAsia="Calibri" w:hAnsiTheme="minorHAnsi" w:cstheme="minorHAnsi"/>
@@ -1761,6 +1962,7 @@
                     </w:rPr>
                     <w:t>parsedTests</w:t>
                   </w:r>
+                  <w:proofErr w:type="spellEnd"/>
                   <w:r>
                     <w:rPr>
                       <w:rFonts w:asciiTheme="minorHAnsi" w:hAnsiTheme="minorHAnsi" w:cstheme="minorHAnsi"/>
@@ -1781,6 +1983,8 @@
                     </w:rPr>
                     <w:t>{</w:t>
                   </w:r>
+                  <w:proofErr w:type="spellStart"/>
+                  <w:proofErr w:type="gramEnd"/>
                   <w:r>
                     <w:rPr>
                       <w:rFonts w:asciiTheme="minorHAnsi" w:hAnsiTheme="minorHAnsi" w:cstheme="minorHAnsi"/>
@@ -1791,6 +1995,7 @@
                     </w:rPr>
                     <w:t>slNoCounter</w:t>
                   </w:r>
+                  <w:proofErr w:type="spellEnd"/>
                   <w:r>
                     <w:rPr>
                       <w:rFonts w:asciiTheme="minorHAnsi" w:hAnsiTheme="minorHAnsi" w:cstheme="minorHAnsi"/>
@@ -1805,7 +2010,7 @@
               </w:tc>
               <w:tc>
                 <w:tcPr>
-                  <w:tcW w:w="4252" w:type="dxa"/>
+                  <w:tcW w:w="3827" w:type="dxa"/>
                 </w:tcPr>
                 <w:p>
                   <w:pPr>
@@ -1828,6 +2033,7 @@
                     </w:rPr>
                     <w:t>{</w:t>
                   </w:r>
+                  <w:proofErr w:type="spellStart"/>
                   <w:r>
                     <w:rPr>
                       <w:rFonts w:ascii="Calibri" w:eastAsia="Calibri" w:hAnsi="Calibri" w:cs="Calibri"/>
@@ -1836,6 +2042,7 @@
                     </w:rPr>
                     <w:t>testName</w:t>
                   </w:r>
+                  <w:proofErr w:type="spellEnd"/>
                   <w:r>
                     <w:rPr>
                       <w:rFonts w:ascii="Calibri" w:eastAsia="Calibri" w:hAnsi="Calibri" w:cs="Calibri"/>
@@ -1848,7 +2055,7 @@
               </w:tc>
               <w:tc>
                 <w:tcPr>
-                  <w:tcW w:w="3674" w:type="dxa"/>
+                  <w:tcW w:w="4241" w:type="dxa"/>
                 </w:tcPr>
                 <w:p>
                   <w:pPr>
@@ -1871,6 +2078,7 @@
                     </w:rPr>
                     <w:t>{</w:t>
                   </w:r>
+                  <w:proofErr w:type="spellStart"/>
                   <w:r>
                     <w:rPr>
                       <w:rFonts w:ascii="Calibri" w:eastAsia="Calibri" w:hAnsi="Calibri" w:cs="Calibri"/>
@@ -1879,6 +2087,7 @@
                     </w:rPr>
                     <w:t>testStandard</w:t>
                   </w:r>
+                  <w:proofErr w:type="spellEnd"/>
                   <w:r>
                     <w:rPr>
                       <w:rFonts w:ascii="Calibri" w:eastAsia="Calibri" w:hAnsi="Calibri" w:cs="Calibri"/>
@@ -1915,6 +2124,7 @@
                     </w:rPr>
                     <w:t>{</w:t>
                   </w:r>
+                  <w:proofErr w:type="spellStart"/>
                   <w:r>
                     <w:rPr>
                       <w:rFonts w:ascii="Calibri" w:eastAsia="Calibri" w:hAnsi="Calibri" w:cs="Calibri"/>
@@ -1923,6 +2133,7 @@
                     </w:rPr>
                     <w:t>testProfile</w:t>
                   </w:r>
+                  <w:proofErr w:type="spellEnd"/>
                   <w:r>
                     <w:rPr>
                       <w:rFonts w:ascii="Calibri" w:eastAsia="Calibri" w:hAnsi="Calibri" w:cs="Calibri"/>
@@ -1931,6 +2142,7 @@
                     </w:rPr>
                     <w:t>}{/</w:t>
                   </w:r>
+                  <w:proofErr w:type="spellStart"/>
                   <w:r>
                     <w:rPr>
                       <w:rFonts w:ascii="Calibri" w:eastAsia="Calibri" w:hAnsi="Calibri" w:cs="Calibri"/>
@@ -1940,6 +2152,7 @@
                     </w:rPr>
                     <w:t>parsedTests</w:t>
                   </w:r>
+                  <w:proofErr w:type="spellEnd"/>
                   <w:r>
                     <w:rPr>
                       <w:rFonts w:ascii="Calibri" w:eastAsia="Calibri" w:hAnsi="Calibri" w:cs="Calibri"/>
@@ -2008,24 +2221,18 @@
                 <w:sz w:val="20"/>
                 <w:u w:val="single"/>
               </w:rPr>
-              <w:t xml:space="preserve"> </w:t>
-            </w:r>
+              <w:t xml:space="preserve"> {</w:t>
+            </w:r>
+            <w:proofErr w:type="spellStart"/>
             <w:r>
               <w:rPr>
                 <w:rFonts w:ascii="Calibri" w:eastAsia="Calibri" w:hAnsi="Calibri" w:cs="Calibri"/>
                 <w:sz w:val="20"/>
                 <w:u w:val="single"/>
               </w:rPr>
-              <w:t>{</w:t>
-            </w:r>
-            <w:r>
-              <w:rPr>
-                <w:rFonts w:ascii="Calibri" w:eastAsia="Calibri" w:hAnsi="Calibri" w:cs="Calibri"/>
-                <w:sz w:val="20"/>
-                <w:u w:val="single"/>
-              </w:rPr>
               <w:t>customerName</w:t>
             </w:r>
+            <w:proofErr w:type="spellEnd"/>
             <w:r>
               <w:rPr>
                 <w:rFonts w:ascii="Calibri" w:eastAsia="Calibri" w:hAnsi="Calibri" w:cs="Calibri"/>
@@ -2092,15 +2299,9 @@
                 <w:rFonts w:ascii="Calibri" w:eastAsia="Calibri" w:hAnsi="Calibri" w:cs="Calibri"/>
                 <w:sz w:val="20"/>
               </w:rPr>
-              <w:t>Name:</w:t>
-            </w:r>
-            <w:r>
-              <w:rPr>
-                <w:rFonts w:ascii="Calibri" w:eastAsia="Calibri" w:hAnsi="Calibri" w:cs="Calibri"/>
-                <w:sz w:val="20"/>
-              </w:rPr>
-              <w:t xml:space="preserve"> {</w:t>
-            </w:r>
+              <w:t>Name: {</w:t>
+            </w:r>
+            <w:proofErr w:type="spellStart"/>
             <w:r>
               <w:rPr>
                 <w:rFonts w:ascii="Calibri" w:eastAsia="Calibri" w:hAnsi="Calibri" w:cs="Calibri"/>
@@ -2108,6 +2309,7 @@
               </w:rPr>
               <w:t>projectName</w:t>
             </w:r>
+            <w:proofErr w:type="spellEnd"/>
             <w:r>
               <w:rPr>
                 <w:rFonts w:ascii="Calibri" w:eastAsia="Calibri" w:hAnsi="Calibri" w:cs="Calibri"/>
@@ -2164,24 +2366,18 @@
                 <w:sz w:val="20"/>
                 <w:u w:val="single"/>
               </w:rPr>
-              <w:t xml:space="preserve"> </w:t>
-            </w:r>
+              <w:t xml:space="preserve"> {</w:t>
+            </w:r>
+            <w:proofErr w:type="spellStart"/>
             <w:r>
               <w:rPr>
                 <w:rFonts w:ascii="Calibri" w:eastAsia="Calibri" w:hAnsi="Calibri" w:cs="Calibri"/>
                 <w:sz w:val="20"/>
                 <w:u w:val="single"/>
               </w:rPr>
-              <w:t>{</w:t>
-            </w:r>
-            <w:r>
-              <w:rPr>
-                <w:rFonts w:ascii="Calibri" w:eastAsia="Calibri" w:hAnsi="Calibri" w:cs="Calibri"/>
-                <w:sz w:val="20"/>
-                <w:u w:val="single"/>
-              </w:rPr>
               <w:t>customerNumber</w:t>
             </w:r>
+            <w:proofErr w:type="spellEnd"/>
             <w:r>
               <w:rPr>
                 <w:rFonts w:ascii="Calibri" w:eastAsia="Calibri" w:hAnsi="Calibri" w:cs="Calibri"/>
@@ -2240,24 +2436,18 @@
                 <w:sz w:val="20"/>
                 <w:u w:val="single"/>
               </w:rPr>
-              <w:t xml:space="preserve"> </w:t>
-            </w:r>
+              <w:t xml:space="preserve"> {</w:t>
+            </w:r>
+            <w:proofErr w:type="spellStart"/>
             <w:r>
               <w:rPr>
                 <w:rFonts w:ascii="Calibri" w:eastAsia="Calibri" w:hAnsi="Calibri" w:cs="Calibri"/>
                 <w:sz w:val="20"/>
                 <w:u w:val="single"/>
               </w:rPr>
-              <w:t>{</w:t>
-            </w:r>
-            <w:r>
-              <w:rPr>
-                <w:rFonts w:ascii="Calibri" w:eastAsia="Calibri" w:hAnsi="Calibri" w:cs="Calibri"/>
-                <w:sz w:val="20"/>
-                <w:u w:val="single"/>
-              </w:rPr>
               <w:t>customerEmail</w:t>
             </w:r>
+            <w:proofErr w:type="spellEnd"/>
             <w:r>
               <w:rPr>
                 <w:rFonts w:ascii="Calibri" w:eastAsia="Calibri" w:hAnsi="Calibri" w:cs="Calibri"/>
@@ -2315,24 +2505,18 @@
                 <w:sz w:val="20"/>
                 <w:u w:val="single"/>
               </w:rPr>
-              <w:t xml:space="preserve"> </w:t>
-            </w:r>
+              <w:t xml:space="preserve"> {</w:t>
+            </w:r>
+            <w:proofErr w:type="spellStart"/>
             <w:r>
               <w:rPr>
                 <w:rFonts w:ascii="Calibri" w:eastAsia="Calibri" w:hAnsi="Calibri" w:cs="Calibri"/>
                 <w:sz w:val="20"/>
                 <w:u w:val="single"/>
               </w:rPr>
-              <w:t>{</w:t>
-            </w:r>
-            <w:r>
-              <w:rPr>
-                <w:rFonts w:ascii="Calibri" w:eastAsia="Calibri" w:hAnsi="Calibri" w:cs="Calibri"/>
-                <w:sz w:val="20"/>
-                <w:u w:val="single"/>
-              </w:rPr>
               <w:t>customerName</w:t>
             </w:r>
+            <w:proofErr w:type="spellEnd"/>
             <w:r>
               <w:rPr>
                 <w:rFonts w:ascii="Calibri" w:eastAsia="Calibri" w:hAnsi="Calibri" w:cs="Calibri"/>
@@ -2522,7 +2706,10 @@
               <w:spacing w:before="116"/>
               <w:rPr>
                 <w:rFonts w:ascii="Calibri" w:eastAsia="Calibri" w:hAnsi="Calibri" w:cs="Calibri"/>
-                <w:b/>
+                <w:bCs/>
+                <w:sz w:val="20"/>
+                <w:szCs w:val="22"/>
+                <w:lang w:val="en-IN"/>
               </w:rPr>
             </w:pPr>
             <w:r>
@@ -2541,7 +2728,26 @@
                 <w:sz w:val="20"/>
                 <w:szCs w:val="22"/>
               </w:rPr>
-              <w:t>{observations}</w:t>
+              <w:t>{</w:t>
+            </w:r>
+            <w:r>
+              <w:rPr>
+                <w:rFonts w:ascii="Calibri" w:eastAsia="Calibri" w:hAnsi="Calibri" w:cs="Calibri"/>
+                <w:bCs/>
+                <w:sz w:val="20"/>
+                <w:szCs w:val="22"/>
+                <w:lang w:val="en-IN"/>
+              </w:rPr>
+              <w:t>observations</w:t>
+            </w:r>
+            <w:r>
+              <w:rPr>
+                <w:rFonts w:ascii="Calibri" w:eastAsia="Calibri" w:hAnsi="Calibri" w:cs="Calibri"/>
+                <w:bCs/>
+                <w:sz w:val="20"/>
+                <w:szCs w:val="22"/>
+              </w:rPr>
+              <w:t>}</w:t>
             </w:r>
           </w:p>
         </w:tc>
@@ -2615,7 +2821,23 @@
                 <w:rFonts w:ascii="Calibri" w:eastAsia="Calibri" w:hAnsi="Calibri" w:cs="Calibri"/>
                 <w:sz w:val="20"/>
               </w:rPr>
-              <w:t xml:space="preserve"> {jcStatus}</w:t>
+              <w:t xml:space="preserve"> {</w:t>
+            </w:r>
+            <w:proofErr w:type="spellStart"/>
+            <w:r>
+              <w:rPr>
+                <w:rFonts w:ascii="Calibri" w:eastAsia="Calibri" w:hAnsi="Calibri" w:cs="Calibri"/>
+                <w:sz w:val="20"/>
+              </w:rPr>
+              <w:t>jcStatus</w:t>
+            </w:r>
+            <w:proofErr w:type="spellEnd"/>
+            <w:r>
+              <w:rPr>
+                <w:rFonts w:ascii="Calibri" w:eastAsia="Calibri" w:hAnsi="Calibri" w:cs="Calibri"/>
+                <w:sz w:val="20"/>
+              </w:rPr>
+              <w:t>}</w:t>
             </w:r>
           </w:p>
         </w:tc>
@@ -2684,7 +2906,23 @@
                 <w:rFonts w:ascii="Calibri" w:eastAsia="Calibri" w:hAnsi="Calibri" w:cs="Calibri"/>
                 <w:sz w:val="20"/>
               </w:rPr>
-              <w:t>{jcClosedDate}</w:t>
+              <w:t>{</w:t>
+            </w:r>
+            <w:proofErr w:type="spellStart"/>
+            <w:r>
+              <w:rPr>
+                <w:rFonts w:ascii="Calibri" w:eastAsia="Calibri" w:hAnsi="Calibri" w:cs="Calibri"/>
+                <w:sz w:val="20"/>
+              </w:rPr>
+              <w:t>jcClosedDate</w:t>
+            </w:r>
+            <w:proofErr w:type="spellEnd"/>
+            <w:r>
+              <w:rPr>
+                <w:rFonts w:ascii="Calibri" w:eastAsia="Calibri" w:hAnsi="Calibri" w:cs="Calibri"/>
+                <w:sz w:val="20"/>
+              </w:rPr>
+              <w:t>}</w:t>
             </w:r>
           </w:p>
         </w:tc>
@@ -2721,7 +2959,23 @@
                 <w:rFonts w:ascii="Calibri" w:eastAsia="Calibri" w:hAnsi="Calibri" w:cs="Calibri"/>
                 <w:sz w:val="20"/>
               </w:rPr>
-              <w:t>{jcIncharge}</w:t>
+              <w:t>{</w:t>
+            </w:r>
+            <w:proofErr w:type="spellStart"/>
+            <w:r>
+              <w:rPr>
+                <w:rFonts w:ascii="Calibri" w:eastAsia="Calibri" w:hAnsi="Calibri" w:cs="Calibri"/>
+                <w:sz w:val="20"/>
+              </w:rPr>
+              <w:t>jcIncharge</w:t>
+            </w:r>
+            <w:proofErr w:type="spellEnd"/>
+            <w:r>
+              <w:rPr>
+                <w:rFonts w:ascii="Calibri" w:eastAsia="Calibri" w:hAnsi="Calibri" w:cs="Calibri"/>
+                <w:sz w:val="20"/>
+              </w:rPr>
+              <w:t>}</w:t>
             </w:r>
           </w:p>
           <w:p>
@@ -2863,6 +3117,7 @@
               </w:rPr>
               <w:t xml:space="preserve">Signature of Lab </w:t>
             </w:r>
+            <w:proofErr w:type="spellStart"/>
             <w:r>
               <w:rPr>
                 <w:rFonts w:ascii="Calibri" w:eastAsia="Calibri" w:hAnsi="Calibri" w:cs="Calibri"/>
@@ -2870,6 +3125,7 @@
               </w:rPr>
               <w:t>Incharge</w:t>
             </w:r>
+            <w:proofErr w:type="spellEnd"/>
           </w:p>
           <w:p>
             <w:pPr>
@@ -3114,6 +3370,7 @@
         </w:rPr>
         <w:t xml:space="preserve"> </w:t>
       </w:r>
+      <w:proofErr w:type="spellStart"/>
       <w:r>
         <w:rPr>
           <w:rFonts w:ascii="Calibri" w:eastAsia="Calibri" w:hAnsi="Calibri" w:cs="Calibri"/>
@@ -3124,6 +3381,7 @@
         </w:rPr>
         <w:t>Devasandra</w:t>
       </w:r>
+      <w:proofErr w:type="spellEnd"/>
       <w:r>
         <w:rPr>
           <w:rFonts w:ascii="Calibri" w:eastAsia="Calibri" w:hAnsi="Calibri" w:cs="Calibri"/>
@@ -4127,7 +4385,25 @@
                 <w:szCs w:val="18"/>
                 <w:lang w:val="en-IN"/>
               </w:rPr>
-              <w:t>{#parsedTestDetails}{slNoCounter}</w:t>
+              <w:t>{#</w:t>
+            </w:r>
+            <w:proofErr w:type="gramStart"/>
+            <w:r>
+              <w:rPr>
+                <w:sz w:val="18"/>
+                <w:szCs w:val="18"/>
+                <w:lang w:val="en-IN"/>
+              </w:rPr>
+              <w:t>parsedTestDetails}{</w:t>
+            </w:r>
+            <w:proofErr w:type="gramEnd"/>
+            <w:r>
+              <w:rPr>
+                <w:sz w:val="18"/>
+                <w:szCs w:val="18"/>
+                <w:lang w:val="en-IN"/>
+              </w:rPr>
+              <w:t>slNoCounter}</w:t>
             </w:r>
           </w:p>
         </w:tc>
@@ -4152,7 +4428,25 @@
                 <w:szCs w:val="20"/>
                 <w:lang w:val="en-IN"/>
               </w:rPr>
-              <w:t>{testName}</w:t>
+              <w:t>{</w:t>
+            </w:r>
+            <w:proofErr w:type="spellStart"/>
+            <w:r>
+              <w:rPr>
+                <w:sz w:val="20"/>
+                <w:szCs w:val="20"/>
+                <w:lang w:val="en-IN"/>
+              </w:rPr>
+              <w:t>testName</w:t>
+            </w:r>
+            <w:proofErr w:type="spellEnd"/>
+            <w:r>
+              <w:rPr>
+                <w:sz w:val="20"/>
+                <w:szCs w:val="20"/>
+                <w:lang w:val="en-IN"/>
+              </w:rPr>
+              <w:t>}</w:t>
             </w:r>
           </w:p>
           <w:p>
@@ -4190,7 +4484,25 @@
                 <w:szCs w:val="20"/>
                 <w:lang w:val="en-IN"/>
               </w:rPr>
-              <w:t>{eutName}</w:t>
+              <w:t>{</w:t>
+            </w:r>
+            <w:proofErr w:type="spellStart"/>
+            <w:r>
+              <w:rPr>
+                <w:sz w:val="20"/>
+                <w:szCs w:val="20"/>
+                <w:lang w:val="en-IN"/>
+              </w:rPr>
+              <w:t>eutName</w:t>
+            </w:r>
+            <w:proofErr w:type="spellEnd"/>
+            <w:r>
+              <w:rPr>
+                <w:sz w:val="20"/>
+                <w:szCs w:val="20"/>
+                <w:lang w:val="en-IN"/>
+              </w:rPr>
+              <w:t>}</w:t>
             </w:r>
           </w:p>
           <w:p>
@@ -4230,7 +4542,25 @@
                 <w:szCs w:val="20"/>
                 <w:lang w:val="en-IN"/>
               </w:rPr>
-              <w:t>{eutSerialNumber}</w:t>
+              <w:t>{</w:t>
+            </w:r>
+            <w:proofErr w:type="spellStart"/>
+            <w:r>
+              <w:rPr>
+                <w:sz w:val="20"/>
+                <w:szCs w:val="20"/>
+                <w:lang w:val="en-IN"/>
+              </w:rPr>
+              <w:t>eutSerialNumber</w:t>
+            </w:r>
+            <w:proofErr w:type="spellEnd"/>
+            <w:r>
+              <w:rPr>
+                <w:sz w:val="20"/>
+                <w:szCs w:val="20"/>
+                <w:lang w:val="en-IN"/>
+              </w:rPr>
+              <w:t>}</w:t>
             </w:r>
           </w:p>
         </w:tc>
@@ -4257,7 +4587,25 @@
                 <w:szCs w:val="20"/>
                 <w:lang w:val="en-IN"/>
               </w:rPr>
-              <w:t>{slotDetails}</w:t>
+              <w:t>{</w:t>
+            </w:r>
+            <w:proofErr w:type="spellStart"/>
+            <w:r>
+              <w:rPr>
+                <w:sz w:val="20"/>
+                <w:szCs w:val="20"/>
+                <w:lang w:val="en-IN"/>
+              </w:rPr>
+              <w:t>slotDetails</w:t>
+            </w:r>
+            <w:proofErr w:type="spellEnd"/>
+            <w:r>
+              <w:rPr>
+                <w:sz w:val="20"/>
+                <w:szCs w:val="20"/>
+                <w:lang w:val="en-IN"/>
+              </w:rPr>
+              <w:t>}</w:t>
             </w:r>
           </w:p>
         </w:tc>
@@ -4286,7 +4634,25 @@
                 <w:bCs w:val="0"/>
                 <w:lang w:val="en-IN"/>
               </w:rPr>
-              <w:t>{#startDate}{time}</w:t>
+              <w:t>{#</w:t>
+            </w:r>
+            <w:proofErr w:type="gramStart"/>
+            <w:r>
+              <w:rPr>
+                <w:b w:val="0"/>
+                <w:bCs w:val="0"/>
+                <w:lang w:val="en-IN"/>
+              </w:rPr>
+              <w:t>startDate}{</w:t>
+            </w:r>
+            <w:proofErr w:type="gramEnd"/>
+            <w:r>
+              <w:rPr>
+                <w:b w:val="0"/>
+                <w:bCs w:val="0"/>
+                <w:lang w:val="en-IN"/>
+              </w:rPr>
+              <w:t>time}</w:t>
             </w:r>
             <w:r>
               <w:br/>
@@ -4309,7 +4675,25 @@
                 <w:bCs w:val="0"/>
                 <w:lang w:val="en-IN"/>
               </w:rPr>
-              <w:t>{date}{/startDate}</w:t>
+              <w:t>{date}{/</w:t>
+            </w:r>
+            <w:proofErr w:type="spellStart"/>
+            <w:r>
+              <w:rPr>
+                <w:b w:val="0"/>
+                <w:bCs w:val="0"/>
+                <w:lang w:val="en-IN"/>
+              </w:rPr>
+              <w:t>startDate</w:t>
+            </w:r>
+            <w:proofErr w:type="spellEnd"/>
+            <w:r>
+              <w:rPr>
+                <w:b w:val="0"/>
+                <w:bCs w:val="0"/>
+                <w:lang w:val="en-IN"/>
+              </w:rPr>
+              <w:t>}</w:t>
             </w:r>
           </w:p>
           <w:p>
@@ -4366,16 +4750,26 @@
                 <w:szCs w:val="20"/>
                 <w:lang w:val="en-IN"/>
               </w:rPr>
-              <w:t>{startTem</w:t>
-            </w:r>
+              <w:t>{</w:t>
+            </w:r>
+            <w:proofErr w:type="spellStart"/>
             <w:r>
               <w:rPr>
                 <w:sz w:val="20"/>
                 <w:szCs w:val="20"/>
                 <w:lang w:val="en-IN"/>
               </w:rPr>
+              <w:t>startTem</w:t>
+            </w:r>
+            <w:r>
+              <w:rPr>
+                <w:sz w:val="20"/>
+                <w:szCs w:val="20"/>
+                <w:lang w:val="en-IN"/>
+              </w:rPr>
               <w:t>p</w:t>
             </w:r>
+            <w:proofErr w:type="spellEnd"/>
             <w:r>
               <w:rPr>
                 <w:sz w:val="20"/>
@@ -4390,8 +4784,13 @@
               <w:pStyle w:val="BodyText"/>
               <w:jc w:val="center"/>
             </w:pPr>
-            <w:r>
-              <w:t>RH(%)</w:t>
+            <w:proofErr w:type="gramStart"/>
+            <w:r>
+              <w:t>RH(</w:t>
+            </w:r>
+            <w:proofErr w:type="gramEnd"/>
+            <w:r>
+              <w:t>%)</w:t>
             </w:r>
             <w:r>
               <w:t>:</w:t>
@@ -4412,7 +4811,25 @@
                 <w:bCs w:val="0"/>
                 <w:lang w:val="en-IN"/>
               </w:rPr>
-              <w:t>{startRh}</w:t>
+              <w:t>{</w:t>
+            </w:r>
+            <w:proofErr w:type="spellStart"/>
+            <w:r>
+              <w:rPr>
+                <w:b w:val="0"/>
+                <w:bCs w:val="0"/>
+                <w:lang w:val="en-IN"/>
+              </w:rPr>
+              <w:t>startRh</w:t>
+            </w:r>
+            <w:proofErr w:type="spellEnd"/>
+            <w:r>
+              <w:rPr>
+                <w:b w:val="0"/>
+                <w:bCs w:val="0"/>
+                <w:lang w:val="en-IN"/>
+              </w:rPr>
+              <w:t>}</w:t>
             </w:r>
           </w:p>
           <w:p>
@@ -4471,7 +4888,25 @@
                 <w:szCs w:val="20"/>
                 <w:lang w:val="en-IN"/>
               </w:rPr>
-              <w:t>{testStartedBy}</w:t>
+              <w:t>{</w:t>
+            </w:r>
+            <w:proofErr w:type="spellStart"/>
+            <w:r>
+              <w:rPr>
+                <w:sz w:val="20"/>
+                <w:szCs w:val="20"/>
+                <w:lang w:val="en-IN"/>
+              </w:rPr>
+              <w:t>testStartedBy</w:t>
+            </w:r>
+            <w:proofErr w:type="spellEnd"/>
+            <w:r>
+              <w:rPr>
+                <w:sz w:val="20"/>
+                <w:szCs w:val="20"/>
+                <w:lang w:val="en-IN"/>
+              </w:rPr>
+              <w:t>}</w:t>
             </w:r>
           </w:p>
         </w:tc>
@@ -4500,7 +4935,25 @@
                 <w:bCs w:val="0"/>
                 <w:lang w:val="en-IN"/>
               </w:rPr>
-              <w:t>{#endDate}{time}</w:t>
+              <w:t>{#</w:t>
+            </w:r>
+            <w:proofErr w:type="gramStart"/>
+            <w:r>
+              <w:rPr>
+                <w:b w:val="0"/>
+                <w:bCs w:val="0"/>
+                <w:lang w:val="en-IN"/>
+              </w:rPr>
+              <w:t>endDate}{</w:t>
+            </w:r>
+            <w:proofErr w:type="gramEnd"/>
+            <w:r>
+              <w:rPr>
+                <w:b w:val="0"/>
+                <w:bCs w:val="0"/>
+                <w:lang w:val="en-IN"/>
+              </w:rPr>
+              <w:t>time}</w:t>
             </w:r>
             <w:r>
               <w:br/>
@@ -4523,7 +4976,25 @@
                 <w:bCs w:val="0"/>
                 <w:lang w:val="en-IN"/>
               </w:rPr>
-              <w:t>{date}{/endDate}</w:t>
+              <w:t>{date}{/</w:t>
+            </w:r>
+            <w:proofErr w:type="spellStart"/>
+            <w:r>
+              <w:rPr>
+                <w:b w:val="0"/>
+                <w:bCs w:val="0"/>
+                <w:lang w:val="en-IN"/>
+              </w:rPr>
+              <w:t>endDate</w:t>
+            </w:r>
+            <w:proofErr w:type="spellEnd"/>
+            <w:r>
+              <w:rPr>
+                <w:b w:val="0"/>
+                <w:bCs w:val="0"/>
+                <w:lang w:val="en-IN"/>
+              </w:rPr>
+              <w:t>}</w:t>
             </w:r>
           </w:p>
           <w:p>
@@ -4562,7 +5033,25 @@
                 <w:szCs w:val="20"/>
                 <w:lang w:val="en-IN"/>
               </w:rPr>
-              <w:t>{endTemp}</w:t>
+              <w:t>{</w:t>
+            </w:r>
+            <w:proofErr w:type="spellStart"/>
+            <w:r>
+              <w:rPr>
+                <w:sz w:val="20"/>
+                <w:szCs w:val="20"/>
+                <w:lang w:val="en-IN"/>
+              </w:rPr>
+              <w:t>endTemp</w:t>
+            </w:r>
+            <w:proofErr w:type="spellEnd"/>
+            <w:r>
+              <w:rPr>
+                <w:sz w:val="20"/>
+                <w:szCs w:val="20"/>
+                <w:lang w:val="en-IN"/>
+              </w:rPr>
+              <w:t>}</w:t>
             </w:r>
           </w:p>
           <w:p>
@@ -4570,8 +5059,13 @@
               <w:pStyle w:val="BodyText"/>
               <w:jc w:val="center"/>
             </w:pPr>
-            <w:r>
-              <w:t>RH(%)</w:t>
+            <w:proofErr w:type="gramStart"/>
+            <w:r>
+              <w:t>RH(</w:t>
+            </w:r>
+            <w:proofErr w:type="gramEnd"/>
+            <w:r>
+              <w:t>%)</w:t>
             </w:r>
             <w:r>
               <w:t>:</w:t>
@@ -4593,7 +5087,25 @@
                 <w:bCs w:val="0"/>
                 <w:lang w:val="en-IN"/>
               </w:rPr>
-              <w:t>{endRh}</w:t>
+              <w:t>{</w:t>
+            </w:r>
+            <w:proofErr w:type="spellStart"/>
+            <w:r>
+              <w:rPr>
+                <w:b w:val="0"/>
+                <w:bCs w:val="0"/>
+                <w:lang w:val="en-IN"/>
+              </w:rPr>
+              <w:t>endRh</w:t>
+            </w:r>
+            <w:proofErr w:type="spellEnd"/>
+            <w:r>
+              <w:rPr>
+                <w:b w:val="0"/>
+                <w:bCs w:val="0"/>
+                <w:lang w:val="en-IN"/>
+              </w:rPr>
+              <w:t>}</w:t>
             </w:r>
           </w:p>
         </w:tc>
@@ -4641,7 +5153,25 @@
                 <w:szCs w:val="20"/>
                 <w:lang w:val="en-IN"/>
               </w:rPr>
-              <w:t>{testEndedBy}</w:t>
+              <w:t>{</w:t>
+            </w:r>
+            <w:proofErr w:type="spellStart"/>
+            <w:r>
+              <w:rPr>
+                <w:sz w:val="20"/>
+                <w:szCs w:val="20"/>
+                <w:lang w:val="en-IN"/>
+              </w:rPr>
+              <w:t>testEndedBy</w:t>
+            </w:r>
+            <w:proofErr w:type="spellEnd"/>
+            <w:r>
+              <w:rPr>
+                <w:sz w:val="20"/>
+                <w:szCs w:val="20"/>
+                <w:lang w:val="en-IN"/>
+              </w:rPr>
+              <w:t>}</w:t>
             </w:r>
           </w:p>
         </w:tc>
@@ -4666,7 +5196,25 @@
                 <w:szCs w:val="20"/>
                 <w:lang w:val="en-IN"/>
               </w:rPr>
-              <w:t>{actualTestDuration}</w:t>
+              <w:t>{</w:t>
+            </w:r>
+            <w:proofErr w:type="spellStart"/>
+            <w:r>
+              <w:rPr>
+                <w:sz w:val="20"/>
+                <w:szCs w:val="20"/>
+                <w:lang w:val="en-IN"/>
+              </w:rPr>
+              <w:t>actualTestDuration</w:t>
+            </w:r>
+            <w:proofErr w:type="spellEnd"/>
+            <w:r>
+              <w:rPr>
+                <w:sz w:val="20"/>
+                <w:szCs w:val="20"/>
+                <w:lang w:val="en-IN"/>
+              </w:rPr>
+              <w:t>}</w:t>
             </w:r>
           </w:p>
         </w:tc>
@@ -4691,7 +5239,25 @@
                 <w:szCs w:val="20"/>
                 <w:lang w:val="en-IN"/>
               </w:rPr>
-              <w:t>{observationForm}</w:t>
+              <w:t>{</w:t>
+            </w:r>
+            <w:proofErr w:type="spellStart"/>
+            <w:r>
+              <w:rPr>
+                <w:sz w:val="20"/>
+                <w:szCs w:val="20"/>
+                <w:lang w:val="en-IN"/>
+              </w:rPr>
+              <w:t>observationForm</w:t>
+            </w:r>
+            <w:proofErr w:type="spellEnd"/>
+            <w:r>
+              <w:rPr>
+                <w:sz w:val="20"/>
+                <w:szCs w:val="20"/>
+                <w:lang w:val="en-IN"/>
+              </w:rPr>
+              <w:t>}</w:t>
             </w:r>
           </w:p>
           <w:p>
@@ -4736,7 +5302,25 @@
                 <w:szCs w:val="20"/>
                 <w:lang w:val="en-IN"/>
               </w:rPr>
-              <w:t>{reportNumber}</w:t>
+              <w:t>{</w:t>
+            </w:r>
+            <w:proofErr w:type="spellStart"/>
+            <w:r>
+              <w:rPr>
+                <w:sz w:val="20"/>
+                <w:szCs w:val="20"/>
+                <w:lang w:val="en-IN"/>
+              </w:rPr>
+              <w:t>reportNumber</w:t>
+            </w:r>
+            <w:proofErr w:type="spellEnd"/>
+            <w:r>
+              <w:rPr>
+                <w:sz w:val="20"/>
+                <w:szCs w:val="20"/>
+                <w:lang w:val="en-IN"/>
+              </w:rPr>
+              <w:t>}</w:t>
             </w:r>
           </w:p>
         </w:tc>
@@ -4761,7 +5345,25 @@
                 <w:szCs w:val="20"/>
                 <w:lang w:val="en-IN"/>
               </w:rPr>
-              <w:t>{reportPreparedBy}</w:t>
+              <w:t>{</w:t>
+            </w:r>
+            <w:proofErr w:type="spellStart"/>
+            <w:r>
+              <w:rPr>
+                <w:sz w:val="20"/>
+                <w:szCs w:val="20"/>
+                <w:lang w:val="en-IN"/>
+              </w:rPr>
+              <w:t>reportPreparedBy</w:t>
+            </w:r>
+            <w:proofErr w:type="spellEnd"/>
+            <w:r>
+              <w:rPr>
+                <w:sz w:val="20"/>
+                <w:szCs w:val="20"/>
+                <w:lang w:val="en-IN"/>
+              </w:rPr>
+              <w:t>}</w:t>
             </w:r>
           </w:p>
         </w:tc>
@@ -4786,7 +5388,25 @@
                 <w:szCs w:val="20"/>
                 <w:lang w:val="en-IN"/>
               </w:rPr>
-              <w:t>{reportStatus}</w:t>
+              <w:t>{</w:t>
+            </w:r>
+            <w:proofErr w:type="spellStart"/>
+            <w:r>
+              <w:rPr>
+                <w:sz w:val="20"/>
+                <w:szCs w:val="20"/>
+                <w:lang w:val="en-IN"/>
+              </w:rPr>
+              <w:t>reportStatus</w:t>
+            </w:r>
+            <w:proofErr w:type="spellEnd"/>
+            <w:r>
+              <w:rPr>
+                <w:sz w:val="20"/>
+                <w:szCs w:val="20"/>
+                <w:lang w:val="en-IN"/>
+              </w:rPr>
+              <w:t>}</w:t>
             </w:r>
           </w:p>
           <w:p>
@@ -4807,7 +5427,25 @@
                 <w:szCs w:val="20"/>
                 <w:lang w:val="en-IN"/>
               </w:rPr>
-              <w:t>{/parsedTestDetails}</w:t>
+              <w:t>{/</w:t>
+            </w:r>
+            <w:proofErr w:type="spellStart"/>
+            <w:r>
+              <w:rPr>
+                <w:sz w:val="20"/>
+                <w:szCs w:val="20"/>
+                <w:lang w:val="en-IN"/>
+              </w:rPr>
+              <w:t>parsedTestDetails</w:t>
+            </w:r>
+            <w:proofErr w:type="spellEnd"/>
+            <w:r>
+              <w:rPr>
+                <w:sz w:val="20"/>
+                <w:szCs w:val="20"/>
+                <w:lang w:val="en-IN"/>
+              </w:rPr>
+              <w:t>}</w:t>
             </w:r>
           </w:p>
         </w:tc>
@@ -5187,6 +5825,7 @@
         </w:rPr>
         <w:t xml:space="preserve"> </w:t>
       </w:r>
+      <w:proofErr w:type="spellStart"/>
       <w:r>
         <w:rPr>
           <w:rFonts w:ascii="Calibri" w:eastAsia="Calibri" w:hAnsi="Calibri" w:cs="Calibri"/>
@@ -5197,6 +5836,7 @@
         </w:rPr>
         <w:t>Devasandra</w:t>
       </w:r>
+      <w:proofErr w:type="spellEnd"/>
       <w:r>
         <w:rPr>
           <w:rFonts w:ascii="Calibri" w:eastAsia="Calibri" w:hAnsi="Calibri" w:cs="Calibri"/>
@@ -5920,7 +6560,6 @@
   <w:style w:type="character" w:default="1" w:styleId="DefaultParagraphFont">
     <w:name w:val="Default Paragraph Font"/>
     <w:uiPriority w:val="1"/>
-    <w:semiHidden/>
     <w:unhideWhenUsed/>
   </w:style>
   <w:style w:type="table" w:default="1" w:styleId="TableNormal">

</xml_diff>

<commit_message>
1. Added emiJcConformity.jsx component for EMI jobcard. 2. Same has been added in JC preview also. 3. Same has been added in EMI jobcard also.
</commit_message>
<xml_diff>
--- a/frontend/src/templates/TS2_JC_TEMPLATE.docx
+++ b/frontend/src/templates/TS2_JC_TEMPLATE.docx
@@ -2,145 +2,6 @@
 <file path=word/document.xml><?xml version="1.0" encoding="utf-8"?>
 <w:document xmlns:wpc="http://schemas.microsoft.com/office/word/2010/wordprocessingCanvas" xmlns:cx="http://schemas.microsoft.com/office/drawing/2014/chartex" xmlns:cx1="http://schemas.microsoft.com/office/drawing/2015/9/8/chartex" xmlns:cx2="http://schemas.microsoft.com/office/drawing/2015/10/21/chartex" xmlns:cx3="http://schemas.microsoft.com/office/drawing/2016/5/9/chartex" xmlns:cx4="http://schemas.microsoft.com/office/drawing/2016/5/10/chartex" xmlns:cx5="http://schemas.microsoft.com/office/drawing/2016/5/11/chartex" xmlns:cx6="http://schemas.microsoft.com/office/drawing/2016/5/12/chartex" xmlns:cx7="http://schemas.microsoft.com/office/drawing/2016/5/13/chartex" xmlns:cx8="http://schemas.microsoft.com/office/drawing/2016/5/14/chartex" xmlns:mc="http://schemas.openxmlformats.org/markup-compatibility/2006" xmlns:aink="http://schemas.microsoft.com/office/drawing/2016/ink" xmlns:am3d="http://schemas.microsoft.com/office/drawing/2017/model3d" xmlns:o="urn:schemas-microsoft-com:office:office" xmlns:oel="http://schemas.microsoft.com/office/2019/extlst" xmlns:r="http://schemas.openxmlformats.org/officeDocument/2006/relationships" xmlns:m="http://schemas.openxmlformats.org/officeDocument/2006/math" xmlns:v="urn:schemas-microsoft-com:vml" xmlns:wp14="http://schemas.microsoft.com/office/word/2010/wordprocessingDrawing" xmlns:wp="http://schemas.openxmlformats.org/drawingml/2006/wordprocessingDrawing" xmlns:w10="urn:schemas-microsoft-com:office:word" xmlns:w="http://schemas.openxmlformats.org/wordprocessingml/2006/main" xmlns:w14="http://schemas.microsoft.com/office/word/2010/wordml" xmlns:w15="http://schemas.microsoft.com/office/word/2012/wordml" xmlns:w16cex="http://schemas.microsoft.com/office/word/2018/wordml/cex" xmlns:w16cid="http://schemas.microsoft.com/office/word/2016/wordml/cid" xmlns:w16="http://schemas.microsoft.com/office/word/2018/wordml" xmlns:w16du="http://schemas.microsoft.com/office/word/2023/wordml/word16du" xmlns:w16sdtdh="http://schemas.microsoft.com/office/word/2020/wordml/sdtdatahash" xmlns:w16sdtfl="http://schemas.microsoft.com/office/word/2024/wordml/sdtformatlock" xmlns:w16se="http://schemas.microsoft.com/office/word/2015/wordml/symex" xmlns:wpg="http://schemas.microsoft.com/office/word/2010/wordprocessingGroup" xmlns:wpi="http://schemas.microsoft.com/office/word/2010/wordprocessingInk" xmlns:wne="http://schemas.microsoft.com/office/word/2006/wordml" xmlns:wps="http://schemas.microsoft.com/office/word/2010/wordprocessingShape" mc:Ignorable="w14 w15 w16se w16cid w16 w16cex w16sdtdh w16sdtfl w16du wp14">
   <w:body>
-    <w:p>
-      <w:pPr>
-        <w:widowControl w:val="0"/>
-        <w:autoSpaceDE w:val="0"/>
-        <w:autoSpaceDN w:val="0"/>
-        <w:spacing w:before="245"/>
-        <w:ind w:right="38"/>
-        <w:jc w:val="right"/>
-        <w:rPr>
-          <w:rFonts w:ascii="Calibri" w:eastAsia="Calibri" w:hAnsi="Calibri" w:cs="Calibri"/>
-          <w:b/>
-          <w:bCs/>
-          <w:sz w:val="36"/>
-          <w:szCs w:val="36"/>
-        </w:rPr>
-      </w:pPr>
-      <w:r>
-        <w:rPr>
-          <w:noProof/>
-        </w:rPr>
-        <w:drawing>
-          <wp:anchor distT="0" distB="0" distL="0" distR="0" simplePos="0" relativeHeight="251652608" behindDoc="0" locked="0" layoutInCell="1" allowOverlap="1" wp14:anchorId="029FC57A" wp14:editId="466797CF">
-            <wp:simplePos x="0" y="0"/>
-            <wp:positionH relativeFrom="page">
-              <wp:posOffset>573405</wp:posOffset>
-            </wp:positionH>
-            <wp:positionV relativeFrom="paragraph">
-              <wp:posOffset>46846</wp:posOffset>
-            </wp:positionV>
-            <wp:extent cx="1209916" cy="472440"/>
-            <wp:effectExtent l="0" t="0" r="0" b="0"/>
-            <wp:wrapNone/>
-            <wp:docPr id="1" name="image1.jpeg" descr="H:\Documents and Settings\pskumar\My Documents\My Pictures\logoscreensh.jpg"/>
-            <wp:cNvGraphicFramePr>
-              <a:graphicFrameLocks xmlns:a="http://schemas.openxmlformats.org/drawingml/2006/main" noChangeAspect="1"/>
-            </wp:cNvGraphicFramePr>
-            <a:graphic xmlns:a="http://schemas.openxmlformats.org/drawingml/2006/main">
-              <a:graphicData uri="http://schemas.openxmlformats.org/drawingml/2006/picture">
-                <pic:pic xmlns:pic="http://schemas.openxmlformats.org/drawingml/2006/picture">
-                  <pic:nvPicPr>
-                    <pic:cNvPr id="1" name="image1.jpeg"/>
-                    <pic:cNvPicPr/>
-                  </pic:nvPicPr>
-                  <pic:blipFill>
-                    <a:blip r:embed="rId5" cstate="print"/>
-                    <a:stretch>
-                      <a:fillRect/>
-                    </a:stretch>
-                  </pic:blipFill>
-                  <pic:spPr>
-                    <a:xfrm>
-                      <a:off x="0" y="0"/>
-                      <a:ext cx="1209916" cy="472440"/>
-                    </a:xfrm>
-                    <a:prstGeom prst="rect">
-                      <a:avLst/>
-                    </a:prstGeom>
-                  </pic:spPr>
-                </pic:pic>
-              </a:graphicData>
-            </a:graphic>
-          </wp:anchor>
-        </w:drawing>
-      </w:r>
-      <w:r>
-        <w:rPr>
-          <w:rFonts w:ascii="Calibri" w:eastAsia="Calibri" w:hAnsi="Calibri" w:cs="Calibri"/>
-          <w:b/>
-          <w:bCs/>
-          <w:sz w:val="36"/>
-          <w:szCs w:val="36"/>
-        </w:rPr>
-        <w:t>JOB-CARD</w:t>
-      </w:r>
-    </w:p>
-    <w:p>
-      <w:pPr>
-        <w:widowControl w:val="0"/>
-        <w:autoSpaceDE w:val="0"/>
-        <w:autoSpaceDN w:val="0"/>
-        <w:spacing w:before="47" w:line="273" w:lineRule="auto"/>
-        <w:ind w:left="1496" w:right="374" w:hanging="504"/>
-        <w:rPr>
-          <w:rFonts w:ascii="Calibri" w:eastAsia="Calibri" w:hAnsi="Calibri" w:cs="Calibri"/>
-          <w:sz w:val="20"/>
-          <w:szCs w:val="22"/>
-        </w:rPr>
-      </w:pPr>
-      <w:r>
-        <w:rPr>
-          <w:rFonts w:ascii="Calibri" w:eastAsia="Calibri" w:hAnsi="Calibri" w:cs="Calibri"/>
-          <w:sz w:val="22"/>
-          <w:szCs w:val="22"/>
-        </w:rPr>
-        <w:br w:type="column"/>
-      </w:r>
-      <w:r>
-        <w:rPr>
-          <w:rFonts w:ascii="Calibri" w:eastAsia="Calibri" w:hAnsi="Calibri" w:cs="Calibri"/>
-          <w:sz w:val="20"/>
-          <w:szCs w:val="22"/>
-        </w:rPr>
-        <w:t>Doc. No. BEA/EMC/TR/JC/</w:t>
-      </w:r>
-      <w:r>
-        <w:rPr>
-          <w:rFonts w:ascii="Calibri" w:eastAsia="Calibri" w:hAnsi="Calibri" w:cs="Calibri"/>
-          <w:spacing w:val="-43"/>
-          <w:sz w:val="20"/>
-          <w:szCs w:val="22"/>
-        </w:rPr>
-        <w:t xml:space="preserve"> </w:t>
-      </w:r>
-      <w:r>
-        <w:rPr>
-          <w:rFonts w:ascii="Calibri" w:eastAsia="Calibri" w:hAnsi="Calibri" w:cs="Calibri"/>
-          <w:sz w:val="20"/>
-          <w:szCs w:val="22"/>
-        </w:rPr>
-        <w:t>ISO/IEC</w:t>
-      </w:r>
-      <w:r>
-        <w:rPr>
-          <w:rFonts w:ascii="Calibri" w:eastAsia="Calibri" w:hAnsi="Calibri" w:cs="Calibri"/>
-          <w:spacing w:val="-7"/>
-          <w:sz w:val="20"/>
-          <w:szCs w:val="22"/>
-        </w:rPr>
-        <w:t xml:space="preserve"> </w:t>
-      </w:r>
-      <w:r>
-        <w:rPr>
-          <w:rFonts w:ascii="Calibri" w:eastAsia="Calibri" w:hAnsi="Calibri" w:cs="Calibri"/>
-          <w:sz w:val="20"/>
-          <w:szCs w:val="22"/>
-        </w:rPr>
-        <w:t>17025:2017</w:t>
-      </w:r>
-    </w:p>
     <w:p>
       <w:pPr>
         <w:widowControl w:val="0"/>
@@ -156,9 +17,11 @@
           <w:szCs w:val="20"/>
         </w:rPr>
         <w:sectPr>
+          <w:headerReference w:type="default" r:id="rId7"/>
+          <w:footerReference w:type="default" r:id="rId8"/>
           <w:type w:val="continuous"/>
           <w:pgSz w:w="11910" w:h="16840"/>
-          <w:pgMar w:top="320" w:right="180" w:bottom="280" w:left="760" w:header="708" w:footer="708" w:gutter="0"/>
+          <w:pgMar w:top="583" w:right="180" w:bottom="280" w:left="760" w:header="142" w:footer="708" w:gutter="0"/>
           <w:cols w:num="2" w:space="708" w:equalWidth="0">
             <w:col w:w="6373" w:space="1089"/>
             <w:col w:w="3508" w:space="0"/>
@@ -194,7 +57,7 @@
       </w:tblGrid>
       <w:tr>
         <w:trPr>
-          <w:trHeight w:val="515"/>
+          <w:trHeight w:val="414"/>
         </w:trPr>
         <w:tc>
           <w:tcPr>
@@ -2573,8 +2436,8 @@
             <v:stroke joinstyle="miter"/>
             <v:path gradientshapeok="t" o:connecttype="rect"/>
           </v:shapetype>
-          <v:shape id="_x0000_s1037" type="#_x0000_t202" style="position:absolute;margin-left:49.4pt;margin-top:891pt;width:537.15pt;height:20.05pt;z-index:251654656;mso-position-horizontal-relative:page;mso-position-vertical-relative:page" filled="f" stroked="f">
-            <v:textbox style="mso-next-textbox:#_x0000_s1037" inset="0,0,0,0">
+          <v:shape id="_x0000_s2061" type="#_x0000_t202" style="position:absolute;margin-left:49.4pt;margin-top:891pt;width:537.15pt;height:20.05pt;z-index:251654656;mso-position-horizontal-relative:page;mso-position-vertical-relative:page" filled="f" stroked="f">
+            <v:textbox style="mso-next-textbox:#_x0000_s2061" inset="0,0,0,0">
               <w:txbxContent>
                 <w:p>
                   <w:pPr>
@@ -2587,6 +2450,997 @@
           </v:shape>
         </w:pict>
       </w:r>
+    </w:p>
+    <w:p>
+      <w:pPr>
+        <w:widowControl w:val="0"/>
+        <w:autoSpaceDE w:val="0"/>
+        <w:autoSpaceDN w:val="0"/>
+        <w:rPr>
+          <w:rFonts w:ascii="Calibri" w:eastAsia="Calibri" w:hAnsi="Calibri" w:cs="Calibri"/>
+          <w:b/>
+          <w:sz w:val="20"/>
+          <w:szCs w:val="22"/>
+        </w:rPr>
+      </w:pPr>
+    </w:p>
+    <w:p>
+      <w:pPr>
+        <w:widowControl w:val="0"/>
+        <w:autoSpaceDE w:val="0"/>
+        <w:autoSpaceDN w:val="0"/>
+        <w:rPr>
+          <w:rFonts w:ascii="Calibri" w:eastAsia="Calibri" w:hAnsi="Calibri" w:cs="Calibri"/>
+          <w:b/>
+          <w:sz w:val="20"/>
+          <w:szCs w:val="22"/>
+        </w:rPr>
+      </w:pPr>
+    </w:p>
+    <w:p>
+      <w:pPr>
+        <w:widowControl w:val="0"/>
+        <w:autoSpaceDE w:val="0"/>
+        <w:autoSpaceDN w:val="0"/>
+        <w:rPr>
+          <w:rFonts w:ascii="Calibri" w:eastAsia="Calibri" w:hAnsi="Calibri" w:cs="Calibri"/>
+          <w:b/>
+          <w:sz w:val="20"/>
+          <w:szCs w:val="22"/>
+        </w:rPr>
+      </w:pPr>
+    </w:p>
+    <w:p>
+      <w:pPr>
+        <w:widowControl w:val="0"/>
+        <w:autoSpaceDE w:val="0"/>
+        <w:autoSpaceDN w:val="0"/>
+        <w:rPr>
+          <w:rFonts w:ascii="Calibri" w:eastAsia="Calibri" w:hAnsi="Calibri" w:cs="Calibri"/>
+          <w:b/>
+          <w:sz w:val="20"/>
+          <w:szCs w:val="22"/>
+        </w:rPr>
+      </w:pPr>
+    </w:p>
+    <w:p>
+      <w:pPr>
+        <w:widowControl w:val="0"/>
+        <w:autoSpaceDE w:val="0"/>
+        <w:autoSpaceDN w:val="0"/>
+        <w:rPr>
+          <w:rFonts w:ascii="Calibri" w:eastAsia="Calibri" w:hAnsi="Calibri" w:cs="Calibri"/>
+          <w:b/>
+          <w:sz w:val="20"/>
+          <w:szCs w:val="22"/>
+        </w:rPr>
+      </w:pPr>
+    </w:p>
+    <w:p>
+      <w:pPr>
+        <w:widowControl w:val="0"/>
+        <w:autoSpaceDE w:val="0"/>
+        <w:autoSpaceDN w:val="0"/>
+        <w:rPr>
+          <w:rFonts w:ascii="Calibri" w:eastAsia="Calibri" w:hAnsi="Calibri" w:cs="Calibri"/>
+          <w:b/>
+          <w:sz w:val="20"/>
+          <w:szCs w:val="22"/>
+        </w:rPr>
+      </w:pPr>
+    </w:p>
+    <w:p>
+      <w:pPr>
+        <w:widowControl w:val="0"/>
+        <w:autoSpaceDE w:val="0"/>
+        <w:autoSpaceDN w:val="0"/>
+        <w:rPr>
+          <w:rFonts w:ascii="Calibri" w:eastAsia="Calibri" w:hAnsi="Calibri" w:cs="Calibri"/>
+          <w:b/>
+          <w:sz w:val="20"/>
+          <w:szCs w:val="22"/>
+        </w:rPr>
+      </w:pPr>
+    </w:p>
+    <w:p>
+      <w:pPr>
+        <w:widowControl w:val="0"/>
+        <w:autoSpaceDE w:val="0"/>
+        <w:autoSpaceDN w:val="0"/>
+        <w:rPr>
+          <w:rFonts w:ascii="Calibri" w:eastAsia="Calibri" w:hAnsi="Calibri" w:cs="Calibri"/>
+          <w:b/>
+          <w:sz w:val="20"/>
+          <w:szCs w:val="22"/>
+        </w:rPr>
+      </w:pPr>
+    </w:p>
+    <w:p>
+      <w:pPr>
+        <w:widowControl w:val="0"/>
+        <w:autoSpaceDE w:val="0"/>
+        <w:autoSpaceDN w:val="0"/>
+        <w:rPr>
+          <w:rFonts w:ascii="Calibri" w:eastAsia="Calibri" w:hAnsi="Calibri" w:cs="Calibri"/>
+          <w:b/>
+          <w:sz w:val="20"/>
+          <w:szCs w:val="22"/>
+        </w:rPr>
+      </w:pPr>
+    </w:p>
+    <w:p>
+      <w:pPr>
+        <w:widowControl w:val="0"/>
+        <w:autoSpaceDE w:val="0"/>
+        <w:autoSpaceDN w:val="0"/>
+        <w:rPr>
+          <w:rFonts w:ascii="Calibri" w:eastAsia="Calibri" w:hAnsi="Calibri" w:cs="Calibri"/>
+          <w:b/>
+          <w:sz w:val="20"/>
+          <w:szCs w:val="22"/>
+        </w:rPr>
+      </w:pPr>
+    </w:p>
+    <w:p>
+      <w:pPr>
+        <w:widowControl w:val="0"/>
+        <w:autoSpaceDE w:val="0"/>
+        <w:autoSpaceDN w:val="0"/>
+        <w:rPr>
+          <w:rFonts w:ascii="Calibri" w:eastAsia="Calibri" w:hAnsi="Calibri" w:cs="Calibri"/>
+          <w:b/>
+          <w:sz w:val="20"/>
+          <w:szCs w:val="22"/>
+        </w:rPr>
+      </w:pPr>
+    </w:p>
+    <w:p>
+      <w:pPr>
+        <w:widowControl w:val="0"/>
+        <w:autoSpaceDE w:val="0"/>
+        <w:autoSpaceDN w:val="0"/>
+        <w:rPr>
+          <w:rFonts w:ascii="Calibri" w:eastAsia="Calibri" w:hAnsi="Calibri" w:cs="Calibri"/>
+          <w:b/>
+          <w:sz w:val="20"/>
+          <w:szCs w:val="22"/>
+        </w:rPr>
+      </w:pPr>
+    </w:p>
+    <w:p>
+      <w:pPr>
+        <w:widowControl w:val="0"/>
+        <w:autoSpaceDE w:val="0"/>
+        <w:autoSpaceDN w:val="0"/>
+        <w:rPr>
+          <w:rFonts w:ascii="Calibri" w:eastAsia="Calibri" w:hAnsi="Calibri" w:cs="Calibri"/>
+          <w:b/>
+          <w:sz w:val="20"/>
+          <w:szCs w:val="22"/>
+        </w:rPr>
+      </w:pPr>
+    </w:p>
+    <w:p>
+      <w:pPr>
+        <w:widowControl w:val="0"/>
+        <w:autoSpaceDE w:val="0"/>
+        <w:autoSpaceDN w:val="0"/>
+        <w:rPr>
+          <w:rFonts w:ascii="Calibri" w:eastAsia="Calibri" w:hAnsi="Calibri" w:cs="Calibri"/>
+          <w:b/>
+          <w:sz w:val="20"/>
+          <w:szCs w:val="22"/>
+        </w:rPr>
+      </w:pPr>
+    </w:p>
+    <w:p>
+      <w:pPr>
+        <w:widowControl w:val="0"/>
+        <w:autoSpaceDE w:val="0"/>
+        <w:autoSpaceDN w:val="0"/>
+        <w:rPr>
+          <w:rFonts w:ascii="Calibri" w:eastAsia="Calibri" w:hAnsi="Calibri" w:cs="Calibri"/>
+          <w:b/>
+          <w:sz w:val="20"/>
+          <w:szCs w:val="22"/>
+        </w:rPr>
+      </w:pPr>
+    </w:p>
+    <w:p>
+      <w:pPr>
+        <w:widowControl w:val="0"/>
+        <w:autoSpaceDE w:val="0"/>
+        <w:autoSpaceDN w:val="0"/>
+        <w:rPr>
+          <w:rFonts w:ascii="Calibri" w:eastAsia="Calibri" w:hAnsi="Calibri" w:cs="Calibri"/>
+          <w:b/>
+          <w:sz w:val="20"/>
+          <w:szCs w:val="22"/>
+        </w:rPr>
+      </w:pPr>
+    </w:p>
+    <w:tbl>
+      <w:tblPr>
+        <w:tblStyle w:val="TableGrid"/>
+        <w:tblW w:w="0" w:type="auto"/>
+        <w:tblLook w:val="04A0" w:firstRow="1" w:lastRow="0" w:firstColumn="1" w:lastColumn="0" w:noHBand="0" w:noVBand="1"/>
+      </w:tblPr>
+      <w:tblGrid>
+        <w:gridCol w:w="3584"/>
+        <w:gridCol w:w="7168"/>
+      </w:tblGrid>
+      <w:tr>
+        <w:trPr>
+          <w:trHeight w:val="314"/>
+        </w:trPr>
+        <w:tc>
+          <w:tcPr>
+            <w:tcW w:w="3584" w:type="dxa"/>
+          </w:tcPr>
+          <w:p>
+            <w:pPr>
+              <w:widowControl w:val="0"/>
+              <w:autoSpaceDE w:val="0"/>
+              <w:autoSpaceDN w:val="0"/>
+              <w:spacing w:line="360" w:lineRule="auto"/>
+              <w:rPr>
+                <w:rFonts w:ascii="Calibri" w:eastAsia="Calibri" w:hAnsi="Calibri" w:cs="Calibri"/>
+                <w:b/>
+                <w:sz w:val="20"/>
+                <w:szCs w:val="22"/>
+              </w:rPr>
+            </w:pPr>
+            <w:r>
+              <w:rPr>
+                <w:rFonts w:ascii="Calibri" w:eastAsia="Calibri" w:hAnsi="Calibri" w:cs="Calibri"/>
+                <w:b/>
+                <w:sz w:val="20"/>
+                <w:szCs w:val="22"/>
+              </w:rPr>
+              <w:t>Statement of Conformity:</w:t>
+            </w:r>
+          </w:p>
+        </w:tc>
+        <w:tc>
+          <w:tcPr>
+            <w:tcW w:w="7168" w:type="dxa"/>
+          </w:tcPr>
+          <w:p>
+            <w:pPr>
+              <w:widowControl w:val="0"/>
+              <w:autoSpaceDE w:val="0"/>
+              <w:autoSpaceDN w:val="0"/>
+              <w:spacing w:line="360" w:lineRule="auto"/>
+              <w:rPr>
+                <w:rFonts w:ascii="Calibri" w:eastAsia="Calibri" w:hAnsi="Calibri" w:cs="Calibri"/>
+                <w:bCs/>
+                <w:sz w:val="20"/>
+                <w:szCs w:val="22"/>
+              </w:rPr>
+            </w:pPr>
+            <w:r>
+              <w:rPr>
+                <w:rFonts w:ascii="Calibri" w:eastAsia="Calibri" w:hAnsi="Calibri" w:cs="Calibri"/>
+                <w:bCs/>
+                <w:sz w:val="20"/>
+                <w:szCs w:val="22"/>
+              </w:rPr>
+              <w:t>{</w:t>
+            </w:r>
+            <w:proofErr w:type="spellStart"/>
+            <w:r>
+              <w:rPr>
+                <w:rFonts w:ascii="Calibri" w:eastAsia="Calibri" w:hAnsi="Calibri" w:cs="Calibri"/>
+                <w:bCs/>
+                <w:sz w:val="20"/>
+                <w:szCs w:val="22"/>
+              </w:rPr>
+              <w:t>conformityStatement</w:t>
+            </w:r>
+            <w:proofErr w:type="spellEnd"/>
+            <w:r>
+              <w:rPr>
+                <w:rFonts w:ascii="Calibri" w:eastAsia="Calibri" w:hAnsi="Calibri" w:cs="Calibri"/>
+                <w:bCs/>
+                <w:sz w:val="20"/>
+                <w:szCs w:val="22"/>
+              </w:rPr>
+              <w:t>}</w:t>
+            </w:r>
+          </w:p>
+        </w:tc>
+      </w:tr>
+      <w:tr>
+        <w:trPr>
+          <w:trHeight w:val="314"/>
+        </w:trPr>
+        <w:tc>
+          <w:tcPr>
+            <w:tcW w:w="3584" w:type="dxa"/>
+          </w:tcPr>
+          <w:p>
+            <w:pPr>
+              <w:widowControl w:val="0"/>
+              <w:autoSpaceDE w:val="0"/>
+              <w:autoSpaceDN w:val="0"/>
+              <w:spacing w:line="360" w:lineRule="auto"/>
+              <w:rPr>
+                <w:rFonts w:ascii="Calibri" w:eastAsia="Calibri" w:hAnsi="Calibri" w:cs="Calibri"/>
+                <w:b/>
+                <w:sz w:val="20"/>
+                <w:szCs w:val="22"/>
+              </w:rPr>
+            </w:pPr>
+            <w:r>
+              <w:rPr>
+                <w:rFonts w:ascii="Calibri" w:eastAsia="Calibri" w:hAnsi="Calibri" w:cs="Calibri"/>
+                <w:b/>
+                <w:sz w:val="20"/>
+                <w:szCs w:val="22"/>
+              </w:rPr>
+              <w:t>If Yes Decision Rule</w:t>
+            </w:r>
+          </w:p>
+        </w:tc>
+        <w:tc>
+          <w:tcPr>
+            <w:tcW w:w="7168" w:type="dxa"/>
+          </w:tcPr>
+          <w:p>
+            <w:pPr>
+              <w:widowControl w:val="0"/>
+              <w:autoSpaceDE w:val="0"/>
+              <w:autoSpaceDN w:val="0"/>
+              <w:spacing w:line="360" w:lineRule="auto"/>
+              <w:rPr>
+                <w:rFonts w:ascii="Calibri" w:eastAsia="Calibri" w:hAnsi="Calibri" w:cs="Calibri"/>
+                <w:bCs/>
+                <w:sz w:val="20"/>
+                <w:szCs w:val="22"/>
+                <w:lang w:val="en-IN"/>
+              </w:rPr>
+            </w:pPr>
+            <w:r>
+              <w:rPr>
+                <w:rFonts w:ascii="Calibri" w:eastAsia="Calibri" w:hAnsi="Calibri" w:cs="Calibri"/>
+                <w:bCs/>
+                <w:sz w:val="20"/>
+                <w:szCs w:val="22"/>
+              </w:rPr>
+              <w:t>{</w:t>
+            </w:r>
+            <w:proofErr w:type="spellStart"/>
+            <w:r>
+              <w:rPr>
+                <w:rFonts w:ascii="Calibri" w:eastAsia="Calibri" w:hAnsi="Calibri" w:cs="Calibri"/>
+                <w:bCs/>
+                <w:sz w:val="20"/>
+                <w:szCs w:val="22"/>
+                <w:lang w:val="en-IN"/>
+              </w:rPr>
+              <w:t>conformityDecisionRule</w:t>
+            </w:r>
+            <w:proofErr w:type="spellEnd"/>
+            <w:r>
+              <w:rPr>
+                <w:rFonts w:ascii="Calibri" w:eastAsia="Calibri" w:hAnsi="Calibri" w:cs="Calibri"/>
+                <w:bCs/>
+                <w:sz w:val="20"/>
+                <w:szCs w:val="22"/>
+                <w:lang w:val="en-IN"/>
+              </w:rPr>
+              <w:t>}</w:t>
+            </w:r>
+          </w:p>
+        </w:tc>
+      </w:tr>
+      <w:tr>
+        <w:trPr>
+          <w:trHeight w:val="314"/>
+        </w:trPr>
+        <w:tc>
+          <w:tcPr>
+            <w:tcW w:w="10752" w:type="dxa"/>
+            <w:gridSpan w:val="2"/>
+          </w:tcPr>
+          <w:p>
+            <w:pPr>
+              <w:widowControl w:val="0"/>
+              <w:autoSpaceDE w:val="0"/>
+              <w:autoSpaceDN w:val="0"/>
+              <w:spacing w:line="360" w:lineRule="auto"/>
+              <w:rPr>
+                <w:rFonts w:ascii="Calibri" w:eastAsia="Calibri" w:hAnsi="Calibri" w:cs="Calibri"/>
+                <w:b/>
+                <w:sz w:val="20"/>
+                <w:szCs w:val="22"/>
+              </w:rPr>
+            </w:pPr>
+            <w:r>
+              <w:rPr>
+                <w:rFonts w:ascii="Calibri" w:eastAsia="Calibri" w:hAnsi="Calibri" w:cs="Calibri"/>
+                <w:b/>
+                <w:sz w:val="20"/>
+                <w:szCs w:val="22"/>
+              </w:rPr>
+              <w:t>Note:</w:t>
+            </w:r>
+          </w:p>
+          <w:p>
+            <w:pPr>
+              <w:widowControl w:val="0"/>
+              <w:autoSpaceDE w:val="0"/>
+              <w:autoSpaceDN w:val="0"/>
+              <w:spacing w:line="360" w:lineRule="auto"/>
+              <w:jc w:val="both"/>
+              <w:rPr>
+                <w:rFonts w:ascii="Calibri" w:eastAsia="Calibri" w:hAnsi="Calibri" w:cs="Calibri"/>
+                <w:b/>
+                <w:sz w:val="20"/>
+                <w:szCs w:val="22"/>
+              </w:rPr>
+            </w:pPr>
+            <w:r>
+              <w:rPr>
+                <w:rFonts w:ascii="Calibri" w:eastAsia="Calibri" w:hAnsi="Calibri" w:cs="Calibri"/>
+                <w:b/>
+                <w:sz w:val="20"/>
+                <w:szCs w:val="22"/>
+              </w:rPr>
+              <w:t>1. If Applicable, simple acceptance rule without considering Measurement Uncertainty (MU):</w:t>
+            </w:r>
+          </w:p>
+          <w:p>
+            <w:pPr>
+              <w:widowControl w:val="0"/>
+              <w:autoSpaceDE w:val="0"/>
+              <w:autoSpaceDN w:val="0"/>
+              <w:spacing w:line="360" w:lineRule="auto"/>
+              <w:jc w:val="both"/>
+              <w:rPr>
+                <w:rFonts w:ascii="Calibri" w:eastAsia="Calibri" w:hAnsi="Calibri" w:cs="Calibri"/>
+                <w:b/>
+                <w:sz w:val="20"/>
+                <w:szCs w:val="22"/>
+              </w:rPr>
+            </w:pPr>
+            <w:r>
+              <w:rPr>
+                <w:rFonts w:ascii="Calibri" w:eastAsia="Calibri" w:hAnsi="Calibri" w:cs="Calibri"/>
+                <w:b/>
+                <w:sz w:val="20"/>
+                <w:szCs w:val="22"/>
+              </w:rPr>
+              <w:t>a) Pass when measured value &lt; limit specified by the standard.</w:t>
+            </w:r>
+          </w:p>
+          <w:p>
+            <w:pPr>
+              <w:widowControl w:val="0"/>
+              <w:autoSpaceDE w:val="0"/>
+              <w:autoSpaceDN w:val="0"/>
+              <w:spacing w:line="360" w:lineRule="auto"/>
+              <w:jc w:val="both"/>
+              <w:rPr>
+                <w:rFonts w:ascii="Calibri" w:eastAsia="Calibri" w:hAnsi="Calibri" w:cs="Calibri"/>
+                <w:b/>
+                <w:sz w:val="20"/>
+                <w:szCs w:val="22"/>
+              </w:rPr>
+            </w:pPr>
+            <w:r>
+              <w:rPr>
+                <w:rFonts w:ascii="Calibri" w:eastAsia="Calibri" w:hAnsi="Calibri" w:cs="Calibri"/>
+                <w:b/>
+                <w:sz w:val="20"/>
+                <w:szCs w:val="22"/>
+              </w:rPr>
+              <w:t>b) Fail when measured value &gt; limit specified by the standard.</w:t>
+            </w:r>
+          </w:p>
+          <w:p>
+            <w:pPr>
+              <w:widowControl w:val="0"/>
+              <w:autoSpaceDE w:val="0"/>
+              <w:autoSpaceDN w:val="0"/>
+              <w:spacing w:line="360" w:lineRule="auto"/>
+              <w:jc w:val="both"/>
+              <w:rPr>
+                <w:rFonts w:ascii="Calibri" w:eastAsia="Calibri" w:hAnsi="Calibri" w:cs="Calibri"/>
+                <w:b/>
+                <w:sz w:val="20"/>
+                <w:szCs w:val="22"/>
+              </w:rPr>
+            </w:pPr>
+            <w:r>
+              <w:rPr>
+                <w:rFonts w:ascii="Calibri" w:eastAsia="Calibri" w:hAnsi="Calibri" w:cs="Calibri"/>
+                <w:b/>
+                <w:sz w:val="20"/>
+                <w:szCs w:val="22"/>
+              </w:rPr>
+              <w:t>2. Acceptance rule considering Measurement Uncertainty (MU):</w:t>
+            </w:r>
+          </w:p>
+          <w:p>
+            <w:pPr>
+              <w:widowControl w:val="0"/>
+              <w:autoSpaceDE w:val="0"/>
+              <w:autoSpaceDN w:val="0"/>
+              <w:spacing w:line="360" w:lineRule="auto"/>
+              <w:jc w:val="both"/>
+              <w:rPr>
+                <w:rFonts w:ascii="Calibri" w:eastAsia="Calibri" w:hAnsi="Calibri" w:cs="Calibri"/>
+                <w:b/>
+                <w:sz w:val="20"/>
+                <w:szCs w:val="22"/>
+              </w:rPr>
+            </w:pPr>
+            <w:r>
+              <w:rPr>
+                <w:rFonts w:ascii="Calibri" w:eastAsia="Calibri" w:hAnsi="Calibri" w:cs="Calibri"/>
+                <w:b/>
+                <w:sz w:val="20"/>
+                <w:szCs w:val="22"/>
+              </w:rPr>
+              <w:t>a) Pass when measured value + MU &lt; limit specified by the standard.</w:t>
+            </w:r>
+          </w:p>
+          <w:p>
+            <w:pPr>
+              <w:widowControl w:val="0"/>
+              <w:autoSpaceDE w:val="0"/>
+              <w:autoSpaceDN w:val="0"/>
+              <w:spacing w:line="360" w:lineRule="auto"/>
+              <w:jc w:val="both"/>
+              <w:rPr>
+                <w:rFonts w:ascii="Calibri" w:eastAsia="Calibri" w:hAnsi="Calibri" w:cs="Calibri"/>
+                <w:b/>
+                <w:sz w:val="20"/>
+                <w:szCs w:val="22"/>
+              </w:rPr>
+            </w:pPr>
+            <w:r>
+              <w:rPr>
+                <w:rFonts w:ascii="Calibri" w:eastAsia="Calibri" w:hAnsi="Calibri" w:cs="Calibri"/>
+                <w:b/>
+                <w:sz w:val="20"/>
+                <w:szCs w:val="22"/>
+              </w:rPr>
+              <w:t>b) Fail when measured value - MU &gt; limit specified by the standard.</w:t>
+            </w:r>
+          </w:p>
+          <w:p>
+            <w:pPr>
+              <w:widowControl w:val="0"/>
+              <w:autoSpaceDE w:val="0"/>
+              <w:autoSpaceDN w:val="0"/>
+              <w:spacing w:line="360" w:lineRule="auto"/>
+              <w:rPr>
+                <w:rFonts w:ascii="Calibri" w:eastAsia="Calibri" w:hAnsi="Calibri" w:cs="Calibri"/>
+                <w:b/>
+                <w:sz w:val="20"/>
+                <w:szCs w:val="22"/>
+              </w:rPr>
+            </w:pPr>
+            <w:r>
+              <w:rPr>
+                <w:rFonts w:ascii="Calibri" w:eastAsia="Calibri" w:hAnsi="Calibri" w:cs="Calibri"/>
+                <w:b/>
+                <w:sz w:val="20"/>
+                <w:szCs w:val="22"/>
+              </w:rPr>
+              <w:t>3. If No, Statement of Conformity will not be provided.</w:t>
+            </w:r>
+          </w:p>
+        </w:tc>
+      </w:tr>
+      <w:tr>
+        <w:trPr>
+          <w:trHeight w:val="314"/>
+        </w:trPr>
+        <w:tc>
+          <w:tcPr>
+            <w:tcW w:w="3584" w:type="dxa"/>
+          </w:tcPr>
+          <w:p>
+            <w:pPr>
+              <w:widowControl w:val="0"/>
+              <w:autoSpaceDE w:val="0"/>
+              <w:autoSpaceDN w:val="0"/>
+              <w:spacing w:line="360" w:lineRule="auto"/>
+              <w:rPr>
+                <w:rFonts w:ascii="Calibri" w:eastAsia="Calibri" w:hAnsi="Calibri" w:cs="Calibri"/>
+                <w:b/>
+                <w:sz w:val="20"/>
+                <w:szCs w:val="22"/>
+              </w:rPr>
+            </w:pPr>
+            <w:r>
+              <w:rPr>
+                <w:rFonts w:ascii="Calibri" w:eastAsia="Calibri" w:hAnsi="Calibri" w:cs="Calibri"/>
+                <w:b/>
+                <w:sz w:val="20"/>
+                <w:szCs w:val="22"/>
+              </w:rPr>
+              <w:t>Test Result</w:t>
+            </w:r>
+          </w:p>
+        </w:tc>
+        <w:tc>
+          <w:tcPr>
+            <w:tcW w:w="7168" w:type="dxa"/>
+          </w:tcPr>
+          <w:p>
+            <w:pPr>
+              <w:widowControl w:val="0"/>
+              <w:autoSpaceDE w:val="0"/>
+              <w:autoSpaceDN w:val="0"/>
+              <w:spacing w:line="360" w:lineRule="auto"/>
+              <w:rPr>
+                <w:rFonts w:ascii="Calibri" w:eastAsia="Calibri" w:hAnsi="Calibri" w:cs="Calibri"/>
+                <w:bCs/>
+                <w:sz w:val="20"/>
+                <w:szCs w:val="22"/>
+                <w:lang w:val="en-IN"/>
+              </w:rPr>
+            </w:pPr>
+            <w:r>
+              <w:rPr>
+                <w:rFonts w:ascii="Calibri" w:eastAsia="Calibri" w:hAnsi="Calibri" w:cs="Calibri"/>
+                <w:bCs/>
+                <w:sz w:val="20"/>
+                <w:szCs w:val="22"/>
+              </w:rPr>
+              <w:t>{</w:t>
+            </w:r>
+            <w:proofErr w:type="spellStart"/>
+            <w:r>
+              <w:rPr>
+                <w:rFonts w:ascii="Calibri" w:eastAsia="Calibri" w:hAnsi="Calibri" w:cs="Calibri"/>
+                <w:bCs/>
+                <w:sz w:val="20"/>
+                <w:szCs w:val="22"/>
+                <w:lang w:val="en-IN"/>
+              </w:rPr>
+              <w:t>conformityTestResultOptions</w:t>
+            </w:r>
+            <w:proofErr w:type="spellEnd"/>
+            <w:r>
+              <w:rPr>
+                <w:rFonts w:ascii="Calibri" w:eastAsia="Calibri" w:hAnsi="Calibri" w:cs="Calibri"/>
+                <w:bCs/>
+                <w:sz w:val="20"/>
+                <w:szCs w:val="22"/>
+                <w:lang w:val="en-IN"/>
+              </w:rPr>
+              <w:t>}</w:t>
+            </w:r>
+          </w:p>
+        </w:tc>
+      </w:tr>
+      <w:tr>
+        <w:trPr>
+          <w:trHeight w:val="314"/>
+        </w:trPr>
+        <w:tc>
+          <w:tcPr>
+            <w:tcW w:w="3584" w:type="dxa"/>
+          </w:tcPr>
+          <w:p>
+            <w:pPr>
+              <w:widowControl w:val="0"/>
+              <w:autoSpaceDE w:val="0"/>
+              <w:autoSpaceDN w:val="0"/>
+              <w:spacing w:line="360" w:lineRule="auto"/>
+              <w:rPr>
+                <w:rFonts w:ascii="Calibri" w:eastAsia="Calibri" w:hAnsi="Calibri" w:cs="Calibri"/>
+                <w:b/>
+                <w:sz w:val="20"/>
+                <w:szCs w:val="22"/>
+              </w:rPr>
+            </w:pPr>
+            <w:r>
+              <w:rPr>
+                <w:rFonts w:ascii="Calibri" w:eastAsia="Calibri" w:hAnsi="Calibri" w:cs="Calibri"/>
+                <w:b/>
+                <w:sz w:val="20"/>
+                <w:szCs w:val="22"/>
+              </w:rPr>
+              <w:t>Customer Witness</w:t>
+            </w:r>
+          </w:p>
+        </w:tc>
+        <w:tc>
+          <w:tcPr>
+            <w:tcW w:w="7168" w:type="dxa"/>
+          </w:tcPr>
+          <w:p>
+            <w:pPr>
+              <w:widowControl w:val="0"/>
+              <w:autoSpaceDE w:val="0"/>
+              <w:autoSpaceDN w:val="0"/>
+              <w:spacing w:line="360" w:lineRule="auto"/>
+              <w:rPr>
+                <w:rFonts w:ascii="Calibri" w:eastAsia="Calibri" w:hAnsi="Calibri" w:cs="Calibri"/>
+                <w:bCs/>
+                <w:sz w:val="20"/>
+                <w:szCs w:val="22"/>
+              </w:rPr>
+            </w:pPr>
+            <w:r>
+              <w:rPr>
+                <w:rFonts w:ascii="Calibri" w:eastAsia="Calibri" w:hAnsi="Calibri" w:cs="Calibri"/>
+                <w:bCs/>
+                <w:sz w:val="20"/>
+                <w:szCs w:val="22"/>
+              </w:rPr>
+              <w:t>{</w:t>
+            </w:r>
+            <w:proofErr w:type="spellStart"/>
+            <w:r>
+              <w:rPr>
+                <w:rFonts w:ascii="Calibri" w:eastAsia="Calibri" w:hAnsi="Calibri" w:cs="Calibri"/>
+                <w:bCs/>
+                <w:sz w:val="20"/>
+                <w:szCs w:val="22"/>
+                <w:lang w:val="en-IN"/>
+              </w:rPr>
+              <w:t>customerWitness</w:t>
+            </w:r>
+            <w:proofErr w:type="spellEnd"/>
+            <w:r>
+              <w:rPr>
+                <w:rFonts w:ascii="Calibri" w:eastAsia="Calibri" w:hAnsi="Calibri" w:cs="Calibri"/>
+                <w:bCs/>
+                <w:sz w:val="20"/>
+                <w:szCs w:val="22"/>
+                <w:lang w:val="en-IN"/>
+              </w:rPr>
+              <w:t>}</w:t>
+            </w:r>
+          </w:p>
+          <w:p>
+            <w:pPr>
+              <w:widowControl w:val="0"/>
+              <w:autoSpaceDE w:val="0"/>
+              <w:autoSpaceDN w:val="0"/>
+              <w:spacing w:line="360" w:lineRule="auto"/>
+              <w:rPr>
+                <w:rFonts w:ascii="Calibri" w:eastAsia="Calibri" w:hAnsi="Calibri" w:cs="Calibri"/>
+                <w:bCs/>
+                <w:sz w:val="20"/>
+                <w:szCs w:val="22"/>
+                <w:lang w:val="en-IN"/>
+              </w:rPr>
+            </w:pPr>
+            <w:r>
+              <w:rPr>
+                <w:rFonts w:ascii="Calibri" w:eastAsia="Calibri" w:hAnsi="Calibri" w:cs="Calibri"/>
+                <w:bCs/>
+                <w:sz w:val="20"/>
+                <w:szCs w:val="22"/>
+              </w:rPr>
+              <w:t>{</w:t>
+            </w:r>
+            <w:r>
+              <w:rPr>
+                <w:rFonts w:ascii="Calibri" w:eastAsia="Calibri" w:hAnsi="Calibri" w:cs="Calibri"/>
+                <w:bCs/>
+                <w:sz w:val="20"/>
+                <w:szCs w:val="22"/>
+                <w:lang w:val="en-IN"/>
+              </w:rPr>
+              <w:t>customerWitness1}</w:t>
+            </w:r>
+          </w:p>
+          <w:p>
+            <w:pPr>
+              <w:widowControl w:val="0"/>
+              <w:autoSpaceDE w:val="0"/>
+              <w:autoSpaceDN w:val="0"/>
+              <w:spacing w:line="360" w:lineRule="auto"/>
+              <w:rPr>
+                <w:rFonts w:ascii="Calibri" w:eastAsia="Calibri" w:hAnsi="Calibri" w:cs="Calibri"/>
+                <w:bCs/>
+                <w:sz w:val="20"/>
+                <w:szCs w:val="22"/>
+                <w:lang w:val="en-IN"/>
+              </w:rPr>
+            </w:pPr>
+            <w:r>
+              <w:rPr>
+                <w:rFonts w:ascii="Calibri" w:eastAsia="Calibri" w:hAnsi="Calibri" w:cs="Calibri"/>
+                <w:bCs/>
+                <w:sz w:val="20"/>
+                <w:szCs w:val="22"/>
+              </w:rPr>
+              <w:t>{</w:t>
+            </w:r>
+            <w:r>
+              <w:rPr>
+                <w:rFonts w:ascii="Calibri" w:eastAsia="Calibri" w:hAnsi="Calibri" w:cs="Calibri"/>
+                <w:bCs/>
+                <w:sz w:val="20"/>
+                <w:szCs w:val="22"/>
+                <w:lang w:val="en-IN"/>
+              </w:rPr>
+              <w:t>customerWitness2}</w:t>
+            </w:r>
+          </w:p>
+          <w:p>
+            <w:pPr>
+              <w:widowControl w:val="0"/>
+              <w:autoSpaceDE w:val="0"/>
+              <w:autoSpaceDN w:val="0"/>
+              <w:spacing w:line="360" w:lineRule="auto"/>
+              <w:rPr>
+                <w:rFonts w:ascii="Calibri" w:eastAsia="Calibri" w:hAnsi="Calibri" w:cs="Calibri"/>
+                <w:bCs/>
+                <w:sz w:val="20"/>
+                <w:szCs w:val="22"/>
+                <w:lang w:val="en-IN"/>
+              </w:rPr>
+            </w:pPr>
+            <w:r>
+              <w:rPr>
+                <w:rFonts w:ascii="Calibri" w:eastAsia="Calibri" w:hAnsi="Calibri" w:cs="Calibri"/>
+                <w:bCs/>
+                <w:sz w:val="20"/>
+                <w:szCs w:val="22"/>
+              </w:rPr>
+              <w:t>{</w:t>
+            </w:r>
+            <w:r>
+              <w:rPr>
+                <w:rFonts w:ascii="Calibri" w:eastAsia="Calibri" w:hAnsi="Calibri" w:cs="Calibri"/>
+                <w:bCs/>
+                <w:sz w:val="20"/>
+                <w:szCs w:val="22"/>
+                <w:lang w:val="en-IN"/>
+              </w:rPr>
+              <w:t>customerWitness3}</w:t>
+            </w:r>
+          </w:p>
+          <w:p>
+            <w:pPr>
+              <w:widowControl w:val="0"/>
+              <w:autoSpaceDE w:val="0"/>
+              <w:autoSpaceDN w:val="0"/>
+              <w:spacing w:line="360" w:lineRule="auto"/>
+              <w:rPr>
+                <w:rFonts w:ascii="Calibri" w:eastAsia="Calibri" w:hAnsi="Calibri" w:cs="Calibri"/>
+                <w:bCs/>
+                <w:sz w:val="20"/>
+                <w:szCs w:val="22"/>
+              </w:rPr>
+            </w:pPr>
+            <w:r>
+              <w:rPr>
+                <w:rFonts w:ascii="Calibri" w:eastAsia="Calibri" w:hAnsi="Calibri" w:cs="Calibri"/>
+                <w:bCs/>
+                <w:sz w:val="20"/>
+                <w:szCs w:val="22"/>
+              </w:rPr>
+              <w:t>{</w:t>
+            </w:r>
+            <w:r>
+              <w:rPr>
+                <w:rFonts w:ascii="Calibri" w:eastAsia="Calibri" w:hAnsi="Calibri" w:cs="Calibri"/>
+                <w:bCs/>
+                <w:sz w:val="20"/>
+                <w:szCs w:val="22"/>
+              </w:rPr>
+              <w:t>customerWitness</w:t>
+            </w:r>
+            <w:r>
+              <w:rPr>
+                <w:rFonts w:ascii="Calibri" w:eastAsia="Calibri" w:hAnsi="Calibri" w:cs="Calibri"/>
+                <w:bCs/>
+                <w:sz w:val="20"/>
+                <w:szCs w:val="22"/>
+              </w:rPr>
+              <w:t>4}</w:t>
+            </w:r>
+          </w:p>
+          <w:p>
+            <w:pPr>
+              <w:widowControl w:val="0"/>
+              <w:autoSpaceDE w:val="0"/>
+              <w:autoSpaceDN w:val="0"/>
+              <w:spacing w:line="360" w:lineRule="auto"/>
+              <w:rPr>
+                <w:rFonts w:ascii="Calibri" w:eastAsia="Calibri" w:hAnsi="Calibri" w:cs="Calibri"/>
+                <w:bCs/>
+                <w:sz w:val="20"/>
+                <w:szCs w:val="22"/>
+              </w:rPr>
+            </w:pPr>
+            <w:r>
+              <w:rPr>
+                <w:rFonts w:ascii="Calibri" w:eastAsia="Calibri" w:hAnsi="Calibri" w:cs="Calibri"/>
+                <w:bCs/>
+                <w:sz w:val="20"/>
+                <w:szCs w:val="22"/>
+              </w:rPr>
+              <w:t>{</w:t>
+            </w:r>
+            <w:r>
+              <w:rPr>
+                <w:rFonts w:ascii="Calibri" w:eastAsia="Calibri" w:hAnsi="Calibri" w:cs="Calibri"/>
+                <w:bCs/>
+                <w:sz w:val="20"/>
+                <w:szCs w:val="22"/>
+              </w:rPr>
+              <w:t>customerWitness</w:t>
+            </w:r>
+            <w:r>
+              <w:rPr>
+                <w:rFonts w:ascii="Calibri" w:eastAsia="Calibri" w:hAnsi="Calibri" w:cs="Calibri"/>
+                <w:bCs/>
+                <w:sz w:val="20"/>
+                <w:szCs w:val="22"/>
+              </w:rPr>
+              <w:t>5}</w:t>
+            </w:r>
+          </w:p>
+          <w:p>
+            <w:pPr>
+              <w:widowControl w:val="0"/>
+              <w:autoSpaceDE w:val="0"/>
+              <w:autoSpaceDN w:val="0"/>
+              <w:spacing w:line="360" w:lineRule="auto"/>
+              <w:rPr>
+                <w:rFonts w:ascii="Calibri" w:eastAsia="Calibri" w:hAnsi="Calibri" w:cs="Calibri"/>
+                <w:b/>
+                <w:sz w:val="20"/>
+                <w:szCs w:val="22"/>
+                <w:lang w:val="en-IN"/>
+              </w:rPr>
+            </w:pPr>
+            <w:r>
+              <w:rPr>
+                <w:rFonts w:ascii="Calibri" w:eastAsia="Calibri" w:hAnsi="Calibri" w:cs="Calibri"/>
+                <w:bCs/>
+                <w:sz w:val="20"/>
+                <w:szCs w:val="22"/>
+              </w:rPr>
+              <w:t>{</w:t>
+            </w:r>
+            <w:r>
+              <w:rPr>
+                <w:rFonts w:ascii="Calibri" w:eastAsia="Calibri" w:hAnsi="Calibri" w:cs="Calibri"/>
+                <w:bCs/>
+                <w:sz w:val="20"/>
+                <w:szCs w:val="22"/>
+              </w:rPr>
+              <w:t>customerWitness</w:t>
+            </w:r>
+            <w:r>
+              <w:rPr>
+                <w:rFonts w:ascii="Calibri" w:eastAsia="Calibri" w:hAnsi="Calibri" w:cs="Calibri"/>
+                <w:bCs/>
+                <w:sz w:val="20"/>
+                <w:szCs w:val="22"/>
+              </w:rPr>
+              <w:t>6}</w:t>
+            </w:r>
+          </w:p>
+        </w:tc>
+      </w:tr>
+    </w:tbl>
+    <w:p>
+      <w:pPr>
+        <w:widowControl w:val="0"/>
+        <w:autoSpaceDE w:val="0"/>
+        <w:autoSpaceDN w:val="0"/>
+        <w:rPr>
+          <w:rFonts w:ascii="Calibri" w:eastAsia="Calibri" w:hAnsi="Calibri" w:cs="Calibri"/>
+          <w:b/>
+          <w:sz w:val="20"/>
+          <w:szCs w:val="22"/>
+        </w:rPr>
+      </w:pPr>
     </w:p>
     <w:p>
       <w:pPr>
@@ -3247,389 +4101,7 @@
         <w:widowControl w:val="0"/>
         <w:autoSpaceDE w:val="0"/>
         <w:autoSpaceDN w:val="0"/>
-        <w:spacing w:before="5"/>
-        <w:rPr>
-          <w:rFonts w:ascii="Calibri" w:eastAsia="Calibri" w:hAnsi="Calibri" w:cs="Calibri"/>
-          <w:b/>
-          <w:sz w:val="20"/>
-          <w:szCs w:val="22"/>
-        </w:rPr>
-      </w:pPr>
-    </w:p>
-    <w:p>
-      <w:pPr>
-        <w:widowControl w:val="0"/>
-        <w:autoSpaceDE w:val="0"/>
-        <w:autoSpaceDN w:val="0"/>
-        <w:spacing w:before="5"/>
-        <w:rPr>
-          <w:rFonts w:ascii="Calibri" w:eastAsia="Calibri" w:hAnsi="Calibri" w:cs="Calibri"/>
-          <w:b/>
-          <w:sz w:val="20"/>
-          <w:szCs w:val="22"/>
-        </w:rPr>
-      </w:pPr>
-    </w:p>
-    <w:p>
-      <w:pPr>
-        <w:widowControl w:val="0"/>
-        <w:autoSpaceDE w:val="0"/>
-        <w:autoSpaceDN w:val="0"/>
-        <w:spacing w:before="61"/>
-        <w:ind w:left="658" w:right="365"/>
-        <w:jc w:val="center"/>
-        <w:rPr>
-          <w:rFonts w:ascii="Calibri" w:eastAsia="Calibri" w:hAnsi="Calibri" w:cs="Calibri"/>
-          <w:b/>
-          <w:bCs/>
-          <w:sz w:val="20"/>
-          <w:szCs w:val="20"/>
-        </w:rPr>
-      </w:pPr>
-      <w:r>
-        <w:rPr>
-          <w:rFonts w:ascii="Calibri" w:eastAsia="Calibri" w:hAnsi="Calibri" w:cs="Calibri"/>
-          <w:b/>
-          <w:bCs/>
-          <w:sz w:val="20"/>
-          <w:szCs w:val="20"/>
-        </w:rPr>
-        <w:t>BE</w:t>
-      </w:r>
-      <w:r>
-        <w:rPr>
-          <w:rFonts w:ascii="Calibri" w:eastAsia="Calibri" w:hAnsi="Calibri" w:cs="Calibri"/>
-          <w:b/>
-          <w:bCs/>
-          <w:spacing w:val="-3"/>
-          <w:sz w:val="20"/>
-          <w:szCs w:val="20"/>
-        </w:rPr>
-        <w:t xml:space="preserve"> </w:t>
-      </w:r>
-      <w:r>
-        <w:rPr>
-          <w:rFonts w:ascii="Calibri" w:eastAsia="Calibri" w:hAnsi="Calibri" w:cs="Calibri"/>
-          <w:b/>
-          <w:bCs/>
-          <w:sz w:val="20"/>
-          <w:szCs w:val="20"/>
-        </w:rPr>
-        <w:t>Analytic</w:t>
-      </w:r>
-      <w:r>
-        <w:rPr>
-          <w:rFonts w:ascii="Calibri" w:eastAsia="Calibri" w:hAnsi="Calibri" w:cs="Calibri"/>
-          <w:b/>
-          <w:bCs/>
-          <w:spacing w:val="-4"/>
-          <w:sz w:val="20"/>
-          <w:szCs w:val="20"/>
-        </w:rPr>
-        <w:t xml:space="preserve"> </w:t>
-      </w:r>
-      <w:r>
-        <w:rPr>
-          <w:rFonts w:ascii="Calibri" w:eastAsia="Calibri" w:hAnsi="Calibri" w:cs="Calibri"/>
-          <w:b/>
-          <w:bCs/>
-          <w:sz w:val="20"/>
-          <w:szCs w:val="20"/>
-        </w:rPr>
-        <w:t>Solutions,</w:t>
-      </w:r>
-      <w:r>
-        <w:rPr>
-          <w:rFonts w:ascii="Calibri" w:eastAsia="Calibri" w:hAnsi="Calibri" w:cs="Calibri"/>
-          <w:b/>
-          <w:bCs/>
-          <w:spacing w:val="-5"/>
-          <w:sz w:val="20"/>
-          <w:szCs w:val="20"/>
-        </w:rPr>
-        <w:t xml:space="preserve"> </w:t>
-      </w:r>
-      <w:r>
-        <w:rPr>
-          <w:rFonts w:ascii="Calibri" w:eastAsia="Calibri" w:hAnsi="Calibri" w:cs="Calibri"/>
-          <w:b/>
-          <w:bCs/>
-          <w:sz w:val="20"/>
-          <w:szCs w:val="20"/>
-        </w:rPr>
-        <w:t>#B110,</w:t>
-      </w:r>
-      <w:r>
-        <w:rPr>
-          <w:rFonts w:ascii="Calibri" w:eastAsia="Calibri" w:hAnsi="Calibri" w:cs="Calibri"/>
-          <w:b/>
-          <w:bCs/>
-          <w:spacing w:val="-5"/>
-          <w:sz w:val="20"/>
-          <w:szCs w:val="20"/>
-        </w:rPr>
-        <w:t xml:space="preserve"> </w:t>
-      </w:r>
-      <w:proofErr w:type="spellStart"/>
-      <w:r>
-        <w:rPr>
-          <w:rFonts w:ascii="Calibri" w:eastAsia="Calibri" w:hAnsi="Calibri" w:cs="Calibri"/>
-          <w:b/>
-          <w:bCs/>
-          <w:sz w:val="20"/>
-          <w:szCs w:val="20"/>
-        </w:rPr>
-        <w:t>Devasandra</w:t>
-      </w:r>
-      <w:proofErr w:type="spellEnd"/>
-      <w:r>
-        <w:rPr>
-          <w:rFonts w:ascii="Calibri" w:eastAsia="Calibri" w:hAnsi="Calibri" w:cs="Calibri"/>
-          <w:b/>
-          <w:bCs/>
-          <w:spacing w:val="-4"/>
-          <w:sz w:val="20"/>
-          <w:szCs w:val="20"/>
-        </w:rPr>
-        <w:t xml:space="preserve"> </w:t>
-      </w:r>
-      <w:r>
-        <w:rPr>
-          <w:rFonts w:ascii="Calibri" w:eastAsia="Calibri" w:hAnsi="Calibri" w:cs="Calibri"/>
-          <w:b/>
-          <w:bCs/>
-          <w:sz w:val="20"/>
-          <w:szCs w:val="20"/>
-        </w:rPr>
-        <w:t>Industrial</w:t>
-      </w:r>
-      <w:r>
-        <w:rPr>
-          <w:rFonts w:ascii="Calibri" w:eastAsia="Calibri" w:hAnsi="Calibri" w:cs="Calibri"/>
-          <w:b/>
-          <w:bCs/>
-          <w:spacing w:val="-2"/>
-          <w:sz w:val="20"/>
-          <w:szCs w:val="20"/>
-        </w:rPr>
-        <w:t xml:space="preserve"> </w:t>
-      </w:r>
-      <w:r>
-        <w:rPr>
-          <w:rFonts w:ascii="Calibri" w:eastAsia="Calibri" w:hAnsi="Calibri" w:cs="Calibri"/>
-          <w:b/>
-          <w:bCs/>
-          <w:sz w:val="20"/>
-          <w:szCs w:val="20"/>
-        </w:rPr>
-        <w:t>Estate,</w:t>
-      </w:r>
-      <w:r>
-        <w:rPr>
-          <w:rFonts w:ascii="Calibri" w:eastAsia="Calibri" w:hAnsi="Calibri" w:cs="Calibri"/>
-          <w:b/>
-          <w:bCs/>
-          <w:spacing w:val="-5"/>
-          <w:sz w:val="20"/>
-          <w:szCs w:val="20"/>
-        </w:rPr>
-        <w:t xml:space="preserve"> </w:t>
-      </w:r>
-      <w:r>
-        <w:rPr>
-          <w:rFonts w:ascii="Calibri" w:eastAsia="Calibri" w:hAnsi="Calibri" w:cs="Calibri"/>
-          <w:b/>
-          <w:bCs/>
-          <w:sz w:val="20"/>
-          <w:szCs w:val="20"/>
-        </w:rPr>
-        <w:t>Whitefield</w:t>
-      </w:r>
-      <w:r>
-        <w:rPr>
-          <w:rFonts w:ascii="Calibri" w:eastAsia="Calibri" w:hAnsi="Calibri" w:cs="Calibri"/>
-          <w:b/>
-          <w:bCs/>
-          <w:spacing w:val="-3"/>
-          <w:sz w:val="20"/>
-          <w:szCs w:val="20"/>
-        </w:rPr>
-        <w:t xml:space="preserve"> </w:t>
-      </w:r>
-      <w:r>
-        <w:rPr>
-          <w:rFonts w:ascii="Calibri" w:eastAsia="Calibri" w:hAnsi="Calibri" w:cs="Calibri"/>
-          <w:b/>
-          <w:bCs/>
-          <w:sz w:val="20"/>
-          <w:szCs w:val="20"/>
-        </w:rPr>
-        <w:t>Road,</w:t>
-      </w:r>
-      <w:r>
-        <w:rPr>
-          <w:rFonts w:ascii="Calibri" w:eastAsia="Calibri" w:hAnsi="Calibri" w:cs="Calibri"/>
-          <w:b/>
-          <w:bCs/>
-          <w:spacing w:val="-5"/>
-          <w:sz w:val="20"/>
-          <w:szCs w:val="20"/>
-        </w:rPr>
-        <w:t xml:space="preserve"> </w:t>
-      </w:r>
-      <w:r>
-        <w:rPr>
-          <w:rFonts w:ascii="Calibri" w:eastAsia="Calibri" w:hAnsi="Calibri" w:cs="Calibri"/>
-          <w:b/>
-          <w:bCs/>
-          <w:sz w:val="20"/>
-          <w:szCs w:val="20"/>
-        </w:rPr>
-        <w:t>Mahadevapura,</w:t>
-      </w:r>
-      <w:r>
-        <w:rPr>
-          <w:rFonts w:ascii="Calibri" w:eastAsia="Calibri" w:hAnsi="Calibri" w:cs="Calibri"/>
-          <w:b/>
-          <w:bCs/>
-          <w:spacing w:val="-5"/>
-          <w:sz w:val="20"/>
-          <w:szCs w:val="20"/>
-        </w:rPr>
-        <w:t xml:space="preserve"> </w:t>
-      </w:r>
-      <w:r>
-        <w:rPr>
-          <w:rFonts w:ascii="Calibri" w:eastAsia="Calibri" w:hAnsi="Calibri" w:cs="Calibri"/>
-          <w:b/>
-          <w:bCs/>
-          <w:sz w:val="20"/>
-          <w:szCs w:val="20"/>
-        </w:rPr>
-        <w:t>Bangalore</w:t>
-      </w:r>
-      <w:r>
-        <w:rPr>
-          <w:rFonts w:ascii="Calibri" w:eastAsia="Calibri" w:hAnsi="Calibri" w:cs="Calibri"/>
-          <w:b/>
-          <w:bCs/>
-          <w:spacing w:val="3"/>
-          <w:sz w:val="20"/>
-          <w:szCs w:val="20"/>
-        </w:rPr>
-        <w:t xml:space="preserve"> </w:t>
-      </w:r>
-      <w:r>
-        <w:rPr>
-          <w:rFonts w:ascii="Calibri" w:eastAsia="Calibri" w:hAnsi="Calibri" w:cs="Calibri"/>
-          <w:b/>
-          <w:bCs/>
-          <w:sz w:val="20"/>
-          <w:szCs w:val="20"/>
-        </w:rPr>
-        <w:t>– 560048, India.</w:t>
-      </w:r>
-    </w:p>
-    <w:p>
-      <w:pPr>
-        <w:widowControl w:val="0"/>
-        <w:autoSpaceDE w:val="0"/>
-        <w:autoSpaceDN w:val="0"/>
-        <w:ind w:left="657" w:right="365"/>
-        <w:jc w:val="center"/>
-        <w:rPr>
-          <w:rFonts w:ascii="Calibri" w:eastAsia="Calibri" w:hAnsi="Calibri" w:cs="Calibri"/>
-          <w:b/>
-          <w:bCs/>
-          <w:sz w:val="20"/>
-          <w:szCs w:val="20"/>
-        </w:rPr>
-      </w:pPr>
-      <w:r>
-        <w:rPr>
-          <w:rFonts w:ascii="Calibri" w:eastAsia="Calibri" w:hAnsi="Calibri" w:cs="Calibri"/>
-          <w:b/>
-          <w:bCs/>
-          <w:sz w:val="20"/>
-          <w:szCs w:val="20"/>
-        </w:rPr>
-        <w:t>Ph:</w:t>
-      </w:r>
-      <w:r>
-        <w:rPr>
-          <w:rFonts w:ascii="Calibri" w:eastAsia="Calibri" w:hAnsi="Calibri" w:cs="Calibri"/>
-          <w:b/>
-          <w:bCs/>
-          <w:spacing w:val="-7"/>
-          <w:sz w:val="20"/>
-          <w:szCs w:val="20"/>
-        </w:rPr>
-        <w:t xml:space="preserve"> </w:t>
-      </w:r>
-      <w:r>
-        <w:rPr>
-          <w:rFonts w:ascii="Calibri" w:eastAsia="Calibri" w:hAnsi="Calibri" w:cs="Calibri"/>
-          <w:b/>
-          <w:bCs/>
-          <w:sz w:val="20"/>
-          <w:szCs w:val="20"/>
-        </w:rPr>
-        <w:t>91-80-95000449,</w:t>
-      </w:r>
-      <w:r>
-        <w:rPr>
-          <w:rFonts w:ascii="Calibri" w:eastAsia="Calibri" w:hAnsi="Calibri" w:cs="Calibri"/>
-          <w:b/>
-          <w:bCs/>
-          <w:spacing w:val="-3"/>
-          <w:sz w:val="20"/>
-          <w:szCs w:val="20"/>
-        </w:rPr>
-        <w:t xml:space="preserve"> </w:t>
-      </w:r>
-      <w:hyperlink r:id="rId6">
-        <w:r>
-          <w:rPr>
-            <w:rFonts w:ascii="Calibri" w:eastAsia="Calibri" w:hAnsi="Calibri" w:cs="Calibri"/>
-            <w:b/>
-            <w:bCs/>
-            <w:sz w:val="20"/>
-            <w:szCs w:val="20"/>
-          </w:rPr>
-          <w:t>sales@beanalytic.com,</w:t>
-        </w:r>
-        <w:r>
-          <w:rPr>
-            <w:rFonts w:ascii="Calibri" w:eastAsia="Calibri" w:hAnsi="Calibri" w:cs="Calibri"/>
-            <w:b/>
-            <w:bCs/>
-            <w:spacing w:val="-3"/>
-            <w:sz w:val="20"/>
-            <w:szCs w:val="20"/>
-          </w:rPr>
-          <w:t xml:space="preserve"> </w:t>
-        </w:r>
-      </w:hyperlink>
-      <w:hyperlink r:id="rId7">
-        <w:r>
-          <w:rPr>
-            <w:rFonts w:ascii="Calibri" w:eastAsia="Calibri" w:hAnsi="Calibri" w:cs="Calibri"/>
-            <w:b/>
-            <w:bCs/>
-            <w:sz w:val="20"/>
-            <w:szCs w:val="20"/>
-          </w:rPr>
-          <w:t>www.beanalytic.com</w:t>
-        </w:r>
-      </w:hyperlink>
-    </w:p>
-    <w:p>
-      <w:pPr>
-        <w:widowControl w:val="0"/>
-        <w:autoSpaceDE w:val="0"/>
-        <w:autoSpaceDN w:val="0"/>
-        <w:ind w:left="657" w:right="365"/>
-        <w:jc w:val="center"/>
+        <w:ind w:right="365"/>
         <w:rPr>
           <w:rFonts w:ascii="Calibri" w:eastAsia="Calibri" w:hAnsi="Calibri" w:cs="Calibri"/>
           <w:b/>
@@ -3719,55 +4191,6 @@
           <w:szCs w:val="22"/>
         </w:rPr>
       </w:pPr>
-      <w:r>
-        <w:rPr>
-          <w:noProof/>
-        </w:rPr>
-        <w:lastRenderedPageBreak/>
-        <w:drawing>
-          <wp:anchor distT="0" distB="0" distL="0" distR="0" simplePos="0" relativeHeight="251653632" behindDoc="0" locked="0" layoutInCell="1" allowOverlap="1" wp14:anchorId="51E17AD4" wp14:editId="07C52C03">
-            <wp:simplePos x="0" y="0"/>
-            <wp:positionH relativeFrom="page">
-              <wp:posOffset>403225</wp:posOffset>
-            </wp:positionH>
-            <wp:positionV relativeFrom="paragraph">
-              <wp:posOffset>5080</wp:posOffset>
-            </wp:positionV>
-            <wp:extent cx="1464437" cy="570865"/>
-            <wp:effectExtent l="0" t="0" r="0" b="0"/>
-            <wp:wrapNone/>
-            <wp:docPr id="3" name="image2.jpeg"/>
-            <wp:cNvGraphicFramePr>
-              <a:graphicFrameLocks xmlns:a="http://schemas.openxmlformats.org/drawingml/2006/main" noChangeAspect="1"/>
-            </wp:cNvGraphicFramePr>
-            <a:graphic xmlns:a="http://schemas.openxmlformats.org/drawingml/2006/main">
-              <a:graphicData uri="http://schemas.openxmlformats.org/drawingml/2006/picture">
-                <pic:pic xmlns:pic="http://schemas.openxmlformats.org/drawingml/2006/picture">
-                  <pic:nvPicPr>
-                    <pic:cNvPr id="3" name="image2.jpeg"/>
-                    <pic:cNvPicPr/>
-                  </pic:nvPicPr>
-                  <pic:blipFill>
-                    <a:blip r:embed="rId8" cstate="print"/>
-                    <a:stretch>
-                      <a:fillRect/>
-                    </a:stretch>
-                  </pic:blipFill>
-                  <pic:spPr>
-                    <a:xfrm>
-                      <a:off x="0" y="0"/>
-                      <a:ext cx="1464437" cy="570865"/>
-                    </a:xfrm>
-                    <a:prstGeom prst="rect">
-                      <a:avLst/>
-                    </a:prstGeom>
-                  </pic:spPr>
-                </pic:pic>
-              </a:graphicData>
-            </a:graphic>
-          </wp:anchor>
-        </w:drawing>
-      </w:r>
     </w:p>
     <w:p>
       <w:pPr>
@@ -3778,7 +4201,6 @@
         <w:autoSpaceDE w:val="0"/>
         <w:autoSpaceDN w:val="0"/>
         <w:ind w:left="995" w:firstLine="4765"/>
-        <w:jc w:val="center"/>
         <w:rPr>
           <w:rFonts w:ascii="Calibri" w:eastAsia="Calibri" w:hAnsi="Calibri" w:cs="Calibri"/>
           <w:sz w:val="22"/>
@@ -3846,255 +4268,6 @@
         </w:rPr>
         <w:t xml:space="preserve"> </w:t>
       </w:r>
-      <w:r>
-        <w:rPr>
-          <w:rFonts w:ascii="Calibri" w:eastAsia="Calibri" w:hAnsi="Calibri" w:cs="Calibri"/>
-          <w:sz w:val="22"/>
-          <w:szCs w:val="22"/>
-        </w:rPr>
-        <w:t>Doc.</w:t>
-      </w:r>
-      <w:r>
-        <w:rPr>
-          <w:rFonts w:ascii="Calibri" w:eastAsia="Calibri" w:hAnsi="Calibri" w:cs="Calibri"/>
-          <w:spacing w:val="-3"/>
-          <w:sz w:val="22"/>
-          <w:szCs w:val="22"/>
-        </w:rPr>
-        <w:t xml:space="preserve"> </w:t>
-      </w:r>
-      <w:r>
-        <w:rPr>
-          <w:rFonts w:ascii="Calibri" w:eastAsia="Calibri" w:hAnsi="Calibri" w:cs="Calibri"/>
-          <w:sz w:val="22"/>
-          <w:szCs w:val="22"/>
-        </w:rPr>
-        <w:t>No.</w:t>
-      </w:r>
-      <w:r>
-        <w:rPr>
-          <w:rFonts w:ascii="Calibri" w:eastAsia="Calibri" w:hAnsi="Calibri" w:cs="Calibri"/>
-          <w:spacing w:val="-3"/>
-          <w:sz w:val="22"/>
-          <w:szCs w:val="22"/>
-        </w:rPr>
-        <w:t xml:space="preserve"> </w:t>
-      </w:r>
-      <w:r>
-        <w:rPr>
-          <w:rFonts w:ascii="Calibri" w:eastAsia="Calibri" w:hAnsi="Calibri" w:cs="Calibri"/>
-          <w:sz w:val="22"/>
-          <w:szCs w:val="22"/>
-        </w:rPr>
-        <w:t>BEA</w:t>
-      </w:r>
-      <w:r>
-        <w:rPr>
-          <w:rFonts w:ascii="Calibri" w:eastAsia="Calibri" w:hAnsi="Calibri" w:cs="Calibri"/>
-          <w:sz w:val="22"/>
-          <w:szCs w:val="22"/>
-        </w:rPr>
-        <w:t>/EMC</w:t>
-      </w:r>
-      <w:r>
-        <w:rPr>
-          <w:rFonts w:ascii="Calibri" w:eastAsia="Calibri" w:hAnsi="Calibri" w:cs="Calibri"/>
-          <w:sz w:val="22"/>
-          <w:szCs w:val="22"/>
-        </w:rPr>
-        <w:t>/TR/JC/</w:t>
-      </w:r>
-    </w:p>
-    <w:p>
-      <w:pPr>
-        <w:widowControl w:val="0"/>
-        <w:autoSpaceDE w:val="0"/>
-        <w:autoSpaceDN w:val="0"/>
-        <w:spacing w:line="245" w:lineRule="exact"/>
-        <w:ind w:right="284"/>
-        <w:jc w:val="center"/>
-        <w:rPr>
-          <w:rFonts w:ascii="Calibri" w:eastAsia="Calibri" w:hAnsi="Calibri" w:cs="Calibri"/>
-          <w:sz w:val="22"/>
-          <w:szCs w:val="22"/>
-        </w:rPr>
-      </w:pPr>
-      <w:r>
-        <w:rPr>
-          <w:rFonts w:ascii="Calibri" w:eastAsia="Calibri" w:hAnsi="Calibri" w:cs="Calibri"/>
-          <w:spacing w:val="-1"/>
-          <w:sz w:val="22"/>
-          <w:szCs w:val="22"/>
-        </w:rPr>
-        <w:t xml:space="preserve">                                                                                        </w:t>
-      </w:r>
-      <w:r>
-        <w:rPr>
-          <w:rFonts w:ascii="Calibri" w:eastAsia="Calibri" w:hAnsi="Calibri" w:cs="Calibri"/>
-          <w:spacing w:val="-1"/>
-          <w:sz w:val="22"/>
-          <w:szCs w:val="22"/>
-        </w:rPr>
-        <w:tab/>
-      </w:r>
-      <w:r>
-        <w:rPr>
-          <w:rFonts w:ascii="Calibri" w:eastAsia="Calibri" w:hAnsi="Calibri" w:cs="Calibri"/>
-          <w:spacing w:val="-1"/>
-          <w:sz w:val="22"/>
-          <w:szCs w:val="22"/>
-        </w:rPr>
-        <w:tab/>
-      </w:r>
-      <w:r>
-        <w:rPr>
-          <w:rFonts w:ascii="Calibri" w:eastAsia="Calibri" w:hAnsi="Calibri" w:cs="Calibri"/>
-          <w:spacing w:val="-1"/>
-          <w:sz w:val="22"/>
-          <w:szCs w:val="22"/>
-        </w:rPr>
-        <w:tab/>
-      </w:r>
-      <w:r>
-        <w:rPr>
-          <w:rFonts w:ascii="Calibri" w:eastAsia="Calibri" w:hAnsi="Calibri" w:cs="Calibri"/>
-          <w:spacing w:val="-1"/>
-          <w:sz w:val="22"/>
-          <w:szCs w:val="22"/>
-        </w:rPr>
-        <w:tab/>
-      </w:r>
-      <w:r>
-        <w:rPr>
-          <w:rFonts w:ascii="Calibri" w:eastAsia="Calibri" w:hAnsi="Calibri" w:cs="Calibri"/>
-          <w:spacing w:val="-1"/>
-          <w:sz w:val="22"/>
-          <w:szCs w:val="22"/>
-        </w:rPr>
-        <w:tab/>
-      </w:r>
-      <w:r>
-        <w:rPr>
-          <w:rFonts w:ascii="Calibri" w:eastAsia="Calibri" w:hAnsi="Calibri" w:cs="Calibri"/>
-          <w:spacing w:val="-1"/>
-          <w:sz w:val="22"/>
-          <w:szCs w:val="22"/>
-        </w:rPr>
-        <w:tab/>
-      </w:r>
-      <w:r>
-        <w:rPr>
-          <w:rFonts w:ascii="Calibri" w:eastAsia="Calibri" w:hAnsi="Calibri" w:cs="Calibri"/>
-          <w:spacing w:val="-1"/>
-          <w:sz w:val="22"/>
-          <w:szCs w:val="22"/>
-        </w:rPr>
-        <w:tab/>
-      </w:r>
-      <w:r>
-        <w:rPr>
-          <w:rFonts w:ascii="Calibri" w:eastAsia="Calibri" w:hAnsi="Calibri" w:cs="Calibri"/>
-          <w:spacing w:val="-1"/>
-          <w:sz w:val="22"/>
-          <w:szCs w:val="22"/>
-        </w:rPr>
-        <w:tab/>
-      </w:r>
-      <w:r>
-        <w:rPr>
-          <w:rFonts w:ascii="Calibri" w:eastAsia="Calibri" w:hAnsi="Calibri" w:cs="Calibri"/>
-          <w:spacing w:val="-1"/>
-          <w:sz w:val="22"/>
-          <w:szCs w:val="22"/>
-        </w:rPr>
-        <w:tab/>
-      </w:r>
-      <w:r>
-        <w:rPr>
-          <w:rFonts w:ascii="Calibri" w:eastAsia="Calibri" w:hAnsi="Calibri" w:cs="Calibri"/>
-          <w:spacing w:val="-1"/>
-          <w:sz w:val="22"/>
-          <w:szCs w:val="22"/>
-        </w:rPr>
-        <w:tab/>
-      </w:r>
-      <w:r>
-        <w:rPr>
-          <w:rFonts w:ascii="Calibri" w:eastAsia="Calibri" w:hAnsi="Calibri" w:cs="Calibri"/>
-          <w:spacing w:val="-1"/>
-          <w:sz w:val="22"/>
-          <w:szCs w:val="22"/>
-        </w:rPr>
-        <w:tab/>
-      </w:r>
-      <w:r>
-        <w:rPr>
-          <w:rFonts w:ascii="Calibri" w:eastAsia="Calibri" w:hAnsi="Calibri" w:cs="Calibri"/>
-          <w:spacing w:val="-1"/>
-          <w:sz w:val="22"/>
-          <w:szCs w:val="22"/>
-        </w:rPr>
-        <w:tab/>
-      </w:r>
-      <w:r>
-        <w:rPr>
-          <w:rFonts w:ascii="Calibri" w:eastAsia="Calibri" w:hAnsi="Calibri" w:cs="Calibri"/>
-          <w:spacing w:val="-1"/>
-          <w:sz w:val="22"/>
-          <w:szCs w:val="22"/>
-        </w:rPr>
-        <w:tab/>
-        <w:t xml:space="preserve">     ISO/IEC</w:t>
-      </w:r>
-      <w:r>
-        <w:rPr>
-          <w:rFonts w:ascii="Calibri" w:eastAsia="Calibri" w:hAnsi="Calibri" w:cs="Calibri"/>
-          <w:spacing w:val="-8"/>
-          <w:sz w:val="22"/>
-          <w:szCs w:val="22"/>
-        </w:rPr>
-        <w:t xml:space="preserve"> </w:t>
-      </w:r>
-      <w:r>
-        <w:rPr>
-          <w:rFonts w:ascii="Calibri" w:eastAsia="Calibri" w:hAnsi="Calibri" w:cs="Calibri"/>
-          <w:spacing w:val="-1"/>
-          <w:sz w:val="22"/>
-          <w:szCs w:val="22"/>
-        </w:rPr>
-        <w:t>17025:2017</w:t>
-      </w:r>
-    </w:p>
-    <w:p>
-      <w:pPr>
-        <w:widowControl w:val="0"/>
-        <w:autoSpaceDE w:val="0"/>
-        <w:autoSpaceDN w:val="0"/>
-        <w:spacing w:before="8" w:after="1"/>
-        <w:rPr>
-          <w:rFonts w:ascii="Calibri" w:eastAsia="Calibri" w:hAnsi="Calibri" w:cs="Calibri"/>
-          <w:bCs/>
-          <w:sz w:val="11"/>
-          <w:szCs w:val="20"/>
-        </w:rPr>
-      </w:pPr>
-    </w:p>
-    <w:p>
-      <w:pPr>
-        <w:widowControl w:val="0"/>
-        <w:autoSpaceDE w:val="0"/>
-        <w:autoSpaceDN w:val="0"/>
-        <w:spacing w:before="61"/>
-        <w:ind w:right="3044"/>
-        <w:rPr>
-          <w:rFonts w:ascii="Calibri" w:eastAsia="Calibri" w:hAnsi="Calibri" w:cs="Calibri"/>
-          <w:b/>
-          <w:bCs/>
-          <w:spacing w:val="-1"/>
-          <w:sz w:val="20"/>
-          <w:szCs w:val="20"/>
-        </w:rPr>
-      </w:pPr>
     </w:p>
     <w:p>
       <w:pPr>
@@ -5592,145 +5765,8 @@
         <w:widowControl w:val="0"/>
         <w:autoSpaceDE w:val="0"/>
         <w:autoSpaceDN w:val="0"/>
-        <w:spacing w:before="61"/>
+        <w:spacing w:before="1"/>
         <w:ind w:right="3044"/>
-        <w:rPr>
-          <w:rFonts w:ascii="Calibri" w:eastAsia="Calibri" w:hAnsi="Calibri" w:cs="Calibri"/>
-          <w:b/>
-          <w:bCs/>
-          <w:spacing w:val="-1"/>
-          <w:sz w:val="20"/>
-          <w:szCs w:val="20"/>
-        </w:rPr>
-      </w:pPr>
-    </w:p>
-    <w:p>
-      <w:pPr>
-        <w:widowControl w:val="0"/>
-        <w:autoSpaceDE w:val="0"/>
-        <w:autoSpaceDN w:val="0"/>
-        <w:spacing w:before="61"/>
-        <w:ind w:right="3044"/>
-        <w:rPr>
-          <w:rFonts w:ascii="Calibri" w:eastAsia="Calibri" w:hAnsi="Calibri" w:cs="Calibri"/>
-          <w:b/>
-          <w:bCs/>
-          <w:spacing w:val="-1"/>
-          <w:sz w:val="20"/>
-          <w:szCs w:val="20"/>
-        </w:rPr>
-      </w:pPr>
-    </w:p>
-    <w:p>
-      <w:pPr>
-        <w:widowControl w:val="0"/>
-        <w:autoSpaceDE w:val="0"/>
-        <w:autoSpaceDN w:val="0"/>
-        <w:spacing w:before="61"/>
-        <w:ind w:right="3044"/>
-        <w:rPr>
-          <w:rFonts w:ascii="Calibri" w:eastAsia="Calibri" w:hAnsi="Calibri" w:cs="Calibri"/>
-          <w:b/>
-          <w:bCs/>
-          <w:spacing w:val="-1"/>
-          <w:sz w:val="20"/>
-          <w:szCs w:val="20"/>
-        </w:rPr>
-      </w:pPr>
-    </w:p>
-    <w:p>
-      <w:pPr>
-        <w:widowControl w:val="0"/>
-        <w:autoSpaceDE w:val="0"/>
-        <w:autoSpaceDN w:val="0"/>
-        <w:spacing w:before="61"/>
-        <w:ind w:right="3044"/>
-        <w:rPr>
-          <w:rFonts w:ascii="Calibri" w:eastAsia="Calibri" w:hAnsi="Calibri" w:cs="Calibri"/>
-          <w:b/>
-          <w:bCs/>
-          <w:spacing w:val="-1"/>
-          <w:sz w:val="20"/>
-          <w:szCs w:val="20"/>
-        </w:rPr>
-      </w:pPr>
-    </w:p>
-    <w:p>
-      <w:pPr>
-        <w:widowControl w:val="0"/>
-        <w:autoSpaceDE w:val="0"/>
-        <w:autoSpaceDN w:val="0"/>
-        <w:spacing w:before="61"/>
-        <w:ind w:right="3044"/>
-        <w:rPr>
-          <w:rFonts w:ascii="Calibri" w:eastAsia="Calibri" w:hAnsi="Calibri" w:cs="Calibri"/>
-          <w:b/>
-          <w:bCs/>
-          <w:spacing w:val="-1"/>
-          <w:sz w:val="20"/>
-          <w:szCs w:val="20"/>
-        </w:rPr>
-      </w:pPr>
-    </w:p>
-    <w:p>
-      <w:pPr>
-        <w:widowControl w:val="0"/>
-        <w:autoSpaceDE w:val="0"/>
-        <w:autoSpaceDN w:val="0"/>
-        <w:spacing w:before="61"/>
-        <w:ind w:right="3044"/>
-        <w:rPr>
-          <w:rFonts w:ascii="Calibri" w:eastAsia="Calibri" w:hAnsi="Calibri" w:cs="Calibri"/>
-          <w:b/>
-          <w:bCs/>
-          <w:spacing w:val="-1"/>
-          <w:sz w:val="20"/>
-          <w:szCs w:val="20"/>
-        </w:rPr>
-      </w:pPr>
-    </w:p>
-    <w:p>
-      <w:pPr>
-        <w:widowControl w:val="0"/>
-        <w:autoSpaceDE w:val="0"/>
-        <w:autoSpaceDN w:val="0"/>
-        <w:spacing w:before="61"/>
-        <w:ind w:right="3044"/>
-        <w:rPr>
-          <w:rFonts w:ascii="Calibri" w:eastAsia="Calibri" w:hAnsi="Calibri" w:cs="Calibri"/>
-          <w:b/>
-          <w:bCs/>
-          <w:spacing w:val="-1"/>
-          <w:sz w:val="20"/>
-          <w:szCs w:val="20"/>
-        </w:rPr>
-      </w:pPr>
-    </w:p>
-    <w:p>
-      <w:pPr>
-        <w:widowControl w:val="0"/>
-        <w:autoSpaceDE w:val="0"/>
-        <w:autoSpaceDN w:val="0"/>
-        <w:spacing w:before="61"/>
-        <w:ind w:right="3044"/>
-        <w:rPr>
-          <w:rFonts w:ascii="Calibri" w:eastAsia="Calibri" w:hAnsi="Calibri" w:cs="Calibri"/>
-          <w:b/>
-          <w:bCs/>
-          <w:spacing w:val="-1"/>
-          <w:sz w:val="20"/>
-          <w:szCs w:val="20"/>
-        </w:rPr>
-      </w:pPr>
-    </w:p>
-    <w:p>
-      <w:pPr>
-        <w:widowControl w:val="0"/>
-        <w:autoSpaceDE w:val="0"/>
-        <w:autoSpaceDN w:val="0"/>
-        <w:spacing w:before="61"/>
-        <w:ind w:right="3044"/>
-        <w:jc w:val="center"/>
         <w:rPr>
           <w:rFonts w:ascii="Calibri" w:eastAsia="Calibri" w:hAnsi="Calibri" w:cs="Calibri"/>
           <w:b/>
@@ -5739,50 +5775,356 @@
           <w:szCs w:val="20"/>
         </w:rPr>
       </w:pPr>
+    </w:p>
+    <w:sectPr>
+      <w:headerReference w:type="default" r:id="rId9"/>
+      <w:pgSz w:w="15840" w:h="12240" w:orient="landscape"/>
+      <w:pgMar w:top="240" w:right="140" w:bottom="0" w:left="400" w:header="720" w:footer="720" w:gutter="0"/>
+      <w:cols w:space="720"/>
+    </w:sectPr>
+  </w:body>
+</w:document>
+</file>
+
+<file path=word/endnotes.xml><?xml version="1.0" encoding="utf-8"?>
+<w:endnotes xmlns:wpc="http://schemas.microsoft.com/office/word/2010/wordprocessingCanvas" xmlns:cx="http://schemas.microsoft.com/office/drawing/2014/chartex" xmlns:cx1="http://schemas.microsoft.com/office/drawing/2015/9/8/chartex" xmlns:cx2="http://schemas.microsoft.com/office/drawing/2015/10/21/chartex" xmlns:cx3="http://schemas.microsoft.com/office/drawing/2016/5/9/chartex" xmlns:cx4="http://schemas.microsoft.com/office/drawing/2016/5/10/chartex" xmlns:cx5="http://schemas.microsoft.com/office/drawing/2016/5/11/chartex" xmlns:cx6="http://schemas.microsoft.com/office/drawing/2016/5/12/chartex" xmlns:cx7="http://schemas.microsoft.com/office/drawing/2016/5/13/chartex" xmlns:cx8="http://schemas.microsoft.com/office/drawing/2016/5/14/chartex" xmlns:mc="http://schemas.openxmlformats.org/markup-compatibility/2006" xmlns:aink="http://schemas.microsoft.com/office/drawing/2016/ink" xmlns:am3d="http://schemas.microsoft.com/office/drawing/2017/model3d" xmlns:o="urn:schemas-microsoft-com:office:office" xmlns:oel="http://schemas.microsoft.com/office/2019/extlst" xmlns:r="http://schemas.openxmlformats.org/officeDocument/2006/relationships" xmlns:m="http://schemas.openxmlformats.org/officeDocument/2006/math" xmlns:v="urn:schemas-microsoft-com:vml" xmlns:wp14="http://schemas.microsoft.com/office/word/2010/wordprocessingDrawing" xmlns:wp="http://schemas.openxmlformats.org/drawingml/2006/wordprocessingDrawing" xmlns:w10="urn:schemas-microsoft-com:office:word" xmlns:w="http://schemas.openxmlformats.org/wordprocessingml/2006/main" xmlns:w14="http://schemas.microsoft.com/office/word/2010/wordml" xmlns:w15="http://schemas.microsoft.com/office/word/2012/wordml" xmlns:w16cex="http://schemas.microsoft.com/office/word/2018/wordml/cex" xmlns:w16cid="http://schemas.microsoft.com/office/word/2016/wordml/cid" xmlns:w16="http://schemas.microsoft.com/office/word/2018/wordml" xmlns:w16du="http://schemas.microsoft.com/office/word/2023/wordml/word16du" xmlns:w16sdtdh="http://schemas.microsoft.com/office/word/2020/wordml/sdtdatahash" xmlns:w16sdtfl="http://schemas.microsoft.com/office/word/2024/wordml/sdtformatlock" xmlns:w16se="http://schemas.microsoft.com/office/word/2015/wordml/symex" xmlns:wpg="http://schemas.microsoft.com/office/word/2010/wordprocessingGroup" xmlns:wpi="http://schemas.microsoft.com/office/word/2010/wordprocessingInk" xmlns:wne="http://schemas.microsoft.com/office/word/2006/wordml" xmlns:wps="http://schemas.microsoft.com/office/word/2010/wordprocessingShape" mc:Ignorable="w14 w15 w16se w16cid w16 w16cex w16sdtdh w16sdtfl w16du wp14">
+  <w:endnote w:type="separator" w:id="-1">
+    <w:p>
       <w:r>
-        <w:rPr>
-          <w:rFonts w:ascii="Calibri" w:eastAsia="Calibri" w:hAnsi="Calibri" w:cs="Calibri"/>
-          <w:b/>
-          <w:bCs/>
-          <w:spacing w:val="-1"/>
-          <w:sz w:val="20"/>
-          <w:szCs w:val="20"/>
-        </w:rPr>
-        <w:t xml:space="preserve">                                           BE</w:t>
+        <w:separator/>
       </w:r>
+    </w:p>
+  </w:endnote>
+  <w:endnote w:type="continuationSeparator" w:id="0">
+    <w:p>
       <w:r>
-        <w:rPr>
-          <w:rFonts w:ascii="Calibri" w:eastAsia="Calibri" w:hAnsi="Calibri" w:cs="Calibri"/>
-          <w:b/>
-          <w:bCs/>
-          <w:spacing w:val="-7"/>
-          <w:sz w:val="20"/>
-          <w:szCs w:val="20"/>
-        </w:rPr>
-        <w:t xml:space="preserve"> </w:t>
+        <w:continuationSeparator/>
       </w:r>
-      <w:r>
-        <w:rPr>
-          <w:rFonts w:ascii="Calibri" w:eastAsia="Calibri" w:hAnsi="Calibri" w:cs="Calibri"/>
-          <w:b/>
-          <w:bCs/>
-          <w:spacing w:val="-1"/>
-          <w:sz w:val="20"/>
-          <w:szCs w:val="20"/>
-        </w:rPr>
-        <w:t>Analytic</w:t>
-      </w:r>
-      <w:r>
-        <w:rPr>
-          <w:rFonts w:ascii="Calibri" w:eastAsia="Calibri" w:hAnsi="Calibri" w:cs="Calibri"/>
-          <w:b/>
-          <w:bCs/>
-          <w:spacing w:val="-6"/>
-          <w:sz w:val="20"/>
-          <w:szCs w:val="20"/>
-        </w:rPr>
-        <w:t xml:space="preserve"> </w:t>
-      </w:r>
+    </w:p>
+  </w:endnote>
+</w:endnotes>
+</file>
+
+<file path=word/footer1.xml><?xml version="1.0" encoding="utf-8"?>
+<w:ftr xmlns:wpc="http://schemas.microsoft.com/office/word/2010/wordprocessingCanvas" xmlns:cx="http://schemas.microsoft.com/office/drawing/2014/chartex" xmlns:cx1="http://schemas.microsoft.com/office/drawing/2015/9/8/chartex" xmlns:cx2="http://schemas.microsoft.com/office/drawing/2015/10/21/chartex" xmlns:cx3="http://schemas.microsoft.com/office/drawing/2016/5/9/chartex" xmlns:cx4="http://schemas.microsoft.com/office/drawing/2016/5/10/chartex" xmlns:cx5="http://schemas.microsoft.com/office/drawing/2016/5/11/chartex" xmlns:cx6="http://schemas.microsoft.com/office/drawing/2016/5/12/chartex" xmlns:cx7="http://schemas.microsoft.com/office/drawing/2016/5/13/chartex" xmlns:cx8="http://schemas.microsoft.com/office/drawing/2016/5/14/chartex" xmlns:mc="http://schemas.openxmlformats.org/markup-compatibility/2006" xmlns:aink="http://schemas.microsoft.com/office/drawing/2016/ink" xmlns:am3d="http://schemas.microsoft.com/office/drawing/2017/model3d" xmlns:o="urn:schemas-microsoft-com:office:office" xmlns:oel="http://schemas.microsoft.com/office/2019/extlst" xmlns:r="http://schemas.openxmlformats.org/officeDocument/2006/relationships" xmlns:m="http://schemas.openxmlformats.org/officeDocument/2006/math" xmlns:v="urn:schemas-microsoft-com:vml" xmlns:wp14="http://schemas.microsoft.com/office/word/2010/wordprocessingDrawing" xmlns:wp="http://schemas.openxmlformats.org/drawingml/2006/wordprocessingDrawing" xmlns:w10="urn:schemas-microsoft-com:office:word" xmlns:w="http://schemas.openxmlformats.org/wordprocessingml/2006/main" xmlns:w14="http://schemas.microsoft.com/office/word/2010/wordml" xmlns:w15="http://schemas.microsoft.com/office/word/2012/wordml" xmlns:w16cex="http://schemas.microsoft.com/office/word/2018/wordml/cex" xmlns:w16cid="http://schemas.microsoft.com/office/word/2016/wordml/cid" xmlns:w16="http://schemas.microsoft.com/office/word/2018/wordml" xmlns:w16du="http://schemas.microsoft.com/office/word/2023/wordml/word16du" xmlns:w16sdtdh="http://schemas.microsoft.com/office/word/2020/wordml/sdtdatahash" xmlns:w16sdtfl="http://schemas.microsoft.com/office/word/2024/wordml/sdtformatlock" xmlns:w16se="http://schemas.microsoft.com/office/word/2015/wordml/symex" xmlns:wpg="http://schemas.microsoft.com/office/word/2010/wordprocessingGroup" xmlns:wpi="http://schemas.microsoft.com/office/word/2010/wordprocessingInk" xmlns:wne="http://schemas.microsoft.com/office/word/2006/wordml" xmlns:wps="http://schemas.microsoft.com/office/word/2010/wordprocessingShape" mc:Ignorable="w14 w15 w16se w16cid w16 w16cex w16sdtdh w16sdtfl w16du wp14">
+  <w:p>
+    <w:pPr>
+      <w:widowControl w:val="0"/>
+      <w:autoSpaceDE w:val="0"/>
+      <w:autoSpaceDN w:val="0"/>
+      <w:spacing w:before="61"/>
+      <w:ind w:left="658" w:right="365"/>
+      <w:jc w:val="center"/>
+      <w:rPr>
+        <w:rFonts w:ascii="Calibri" w:eastAsia="Calibri" w:hAnsi="Calibri" w:cs="Calibri"/>
+        <w:b/>
+        <w:bCs/>
+        <w:sz w:val="20"/>
+        <w:szCs w:val="20"/>
+      </w:rPr>
+    </w:pPr>
+    <w:r>
+      <w:rPr>
+        <w:rFonts w:ascii="Calibri" w:eastAsia="Calibri" w:hAnsi="Calibri" w:cs="Calibri"/>
+        <w:b/>
+        <w:bCs/>
+        <w:sz w:val="20"/>
+        <w:szCs w:val="20"/>
+      </w:rPr>
+      <w:t>BE</w:t>
+    </w:r>
+    <w:r>
+      <w:rPr>
+        <w:rFonts w:ascii="Calibri" w:eastAsia="Calibri" w:hAnsi="Calibri" w:cs="Calibri"/>
+        <w:b/>
+        <w:bCs/>
+        <w:spacing w:val="-3"/>
+        <w:sz w:val="20"/>
+        <w:szCs w:val="20"/>
+      </w:rPr>
+      <w:t xml:space="preserve"> </w:t>
+    </w:r>
+    <w:r>
+      <w:rPr>
+        <w:rFonts w:ascii="Calibri" w:eastAsia="Calibri" w:hAnsi="Calibri" w:cs="Calibri"/>
+        <w:b/>
+        <w:bCs/>
+        <w:sz w:val="20"/>
+        <w:szCs w:val="20"/>
+      </w:rPr>
+      <w:t>Analytic</w:t>
+    </w:r>
+    <w:r>
+      <w:rPr>
+        <w:rFonts w:ascii="Calibri" w:eastAsia="Calibri" w:hAnsi="Calibri" w:cs="Calibri"/>
+        <w:b/>
+        <w:bCs/>
+        <w:spacing w:val="-4"/>
+        <w:sz w:val="20"/>
+        <w:szCs w:val="20"/>
+      </w:rPr>
+      <w:t xml:space="preserve"> </w:t>
+    </w:r>
+    <w:r>
+      <w:rPr>
+        <w:rFonts w:ascii="Calibri" w:eastAsia="Calibri" w:hAnsi="Calibri" w:cs="Calibri"/>
+        <w:b/>
+        <w:bCs/>
+        <w:sz w:val="20"/>
+        <w:szCs w:val="20"/>
+      </w:rPr>
+      <w:t>Solutions,</w:t>
+    </w:r>
+    <w:r>
+      <w:rPr>
+        <w:rFonts w:ascii="Calibri" w:eastAsia="Calibri" w:hAnsi="Calibri" w:cs="Calibri"/>
+        <w:b/>
+        <w:bCs/>
+        <w:spacing w:val="-5"/>
+        <w:sz w:val="20"/>
+        <w:szCs w:val="20"/>
+      </w:rPr>
+      <w:t xml:space="preserve"> </w:t>
+    </w:r>
+    <w:r>
+      <w:rPr>
+        <w:rFonts w:ascii="Calibri" w:eastAsia="Calibri" w:hAnsi="Calibri" w:cs="Calibri"/>
+        <w:b/>
+        <w:bCs/>
+        <w:sz w:val="20"/>
+        <w:szCs w:val="20"/>
+      </w:rPr>
+      <w:t>#B110,</w:t>
+    </w:r>
+    <w:r>
+      <w:rPr>
+        <w:rFonts w:ascii="Calibri" w:eastAsia="Calibri" w:hAnsi="Calibri" w:cs="Calibri"/>
+        <w:b/>
+        <w:bCs/>
+        <w:spacing w:val="-5"/>
+        <w:sz w:val="20"/>
+        <w:szCs w:val="20"/>
+      </w:rPr>
+      <w:t xml:space="preserve"> </w:t>
+    </w:r>
+    <w:proofErr w:type="spellStart"/>
+    <w:r>
+      <w:rPr>
+        <w:rFonts w:ascii="Calibri" w:eastAsia="Calibri" w:hAnsi="Calibri" w:cs="Calibri"/>
+        <w:b/>
+        <w:bCs/>
+        <w:sz w:val="20"/>
+        <w:szCs w:val="20"/>
+      </w:rPr>
+      <w:t>Devasandra</w:t>
+    </w:r>
+    <w:proofErr w:type="spellEnd"/>
+    <w:r>
+      <w:rPr>
+        <w:rFonts w:ascii="Calibri" w:eastAsia="Calibri" w:hAnsi="Calibri" w:cs="Calibri"/>
+        <w:b/>
+        <w:bCs/>
+        <w:spacing w:val="-4"/>
+        <w:sz w:val="20"/>
+        <w:szCs w:val="20"/>
+      </w:rPr>
+      <w:t xml:space="preserve"> </w:t>
+    </w:r>
+    <w:r>
+      <w:rPr>
+        <w:rFonts w:ascii="Calibri" w:eastAsia="Calibri" w:hAnsi="Calibri" w:cs="Calibri"/>
+        <w:b/>
+        <w:bCs/>
+        <w:sz w:val="20"/>
+        <w:szCs w:val="20"/>
+      </w:rPr>
+      <w:t>Industrial</w:t>
+    </w:r>
+    <w:r>
+      <w:rPr>
+        <w:rFonts w:ascii="Calibri" w:eastAsia="Calibri" w:hAnsi="Calibri" w:cs="Calibri"/>
+        <w:b/>
+        <w:bCs/>
+        <w:spacing w:val="-2"/>
+        <w:sz w:val="20"/>
+        <w:szCs w:val="20"/>
+      </w:rPr>
+      <w:t xml:space="preserve"> </w:t>
+    </w:r>
+    <w:r>
+      <w:rPr>
+        <w:rFonts w:ascii="Calibri" w:eastAsia="Calibri" w:hAnsi="Calibri" w:cs="Calibri"/>
+        <w:b/>
+        <w:bCs/>
+        <w:sz w:val="20"/>
+        <w:szCs w:val="20"/>
+      </w:rPr>
+      <w:t>Estate,</w:t>
+    </w:r>
+    <w:r>
+      <w:rPr>
+        <w:rFonts w:ascii="Calibri" w:eastAsia="Calibri" w:hAnsi="Calibri" w:cs="Calibri"/>
+        <w:b/>
+        <w:bCs/>
+        <w:spacing w:val="-5"/>
+        <w:sz w:val="20"/>
+        <w:szCs w:val="20"/>
+      </w:rPr>
+      <w:t xml:space="preserve"> </w:t>
+    </w:r>
+    <w:r>
+      <w:rPr>
+        <w:rFonts w:ascii="Calibri" w:eastAsia="Calibri" w:hAnsi="Calibri" w:cs="Calibri"/>
+        <w:b/>
+        <w:bCs/>
+        <w:sz w:val="20"/>
+        <w:szCs w:val="20"/>
+      </w:rPr>
+      <w:t>Whitefield</w:t>
+    </w:r>
+    <w:r>
+      <w:rPr>
+        <w:rFonts w:ascii="Calibri" w:eastAsia="Calibri" w:hAnsi="Calibri" w:cs="Calibri"/>
+        <w:b/>
+        <w:bCs/>
+        <w:spacing w:val="-3"/>
+        <w:sz w:val="20"/>
+        <w:szCs w:val="20"/>
+      </w:rPr>
+      <w:t xml:space="preserve"> </w:t>
+    </w:r>
+    <w:r>
+      <w:rPr>
+        <w:rFonts w:ascii="Calibri" w:eastAsia="Calibri" w:hAnsi="Calibri" w:cs="Calibri"/>
+        <w:b/>
+        <w:bCs/>
+        <w:sz w:val="20"/>
+        <w:szCs w:val="20"/>
+      </w:rPr>
+      <w:t>Road,</w:t>
+    </w:r>
+    <w:r>
+      <w:rPr>
+        <w:rFonts w:ascii="Calibri" w:eastAsia="Calibri" w:hAnsi="Calibri" w:cs="Calibri"/>
+        <w:b/>
+        <w:bCs/>
+        <w:spacing w:val="-5"/>
+        <w:sz w:val="20"/>
+        <w:szCs w:val="20"/>
+      </w:rPr>
+      <w:t xml:space="preserve"> </w:t>
+    </w:r>
+    <w:r>
+      <w:rPr>
+        <w:rFonts w:ascii="Calibri" w:eastAsia="Calibri" w:hAnsi="Calibri" w:cs="Calibri"/>
+        <w:b/>
+        <w:bCs/>
+        <w:sz w:val="20"/>
+        <w:szCs w:val="20"/>
+      </w:rPr>
+      <w:t>Mahadevapura,</w:t>
+    </w:r>
+    <w:r>
+      <w:rPr>
+        <w:rFonts w:ascii="Calibri" w:eastAsia="Calibri" w:hAnsi="Calibri" w:cs="Calibri"/>
+        <w:b/>
+        <w:bCs/>
+        <w:spacing w:val="-5"/>
+        <w:sz w:val="20"/>
+        <w:szCs w:val="20"/>
+      </w:rPr>
+      <w:t xml:space="preserve"> </w:t>
+    </w:r>
+    <w:r>
+      <w:rPr>
+        <w:rFonts w:ascii="Calibri" w:eastAsia="Calibri" w:hAnsi="Calibri" w:cs="Calibri"/>
+        <w:b/>
+        <w:bCs/>
+        <w:sz w:val="20"/>
+        <w:szCs w:val="20"/>
+      </w:rPr>
+      <w:t>Bangalore</w:t>
+    </w:r>
+    <w:r>
+      <w:rPr>
+        <w:rFonts w:ascii="Calibri" w:eastAsia="Calibri" w:hAnsi="Calibri" w:cs="Calibri"/>
+        <w:b/>
+        <w:bCs/>
+        <w:spacing w:val="3"/>
+        <w:sz w:val="20"/>
+        <w:szCs w:val="20"/>
+      </w:rPr>
+      <w:t xml:space="preserve"> </w:t>
+    </w:r>
+    <w:r>
+      <w:rPr>
+        <w:rFonts w:ascii="Calibri" w:eastAsia="Calibri" w:hAnsi="Calibri" w:cs="Calibri"/>
+        <w:b/>
+        <w:bCs/>
+        <w:sz w:val="20"/>
+        <w:szCs w:val="20"/>
+      </w:rPr>
+      <w:t>– 560048, India.</w:t>
+    </w:r>
+  </w:p>
+  <w:p>
+    <w:pPr>
+      <w:widowControl w:val="0"/>
+      <w:autoSpaceDE w:val="0"/>
+      <w:autoSpaceDN w:val="0"/>
+      <w:ind w:left="657" w:right="365"/>
+      <w:jc w:val="center"/>
+      <w:rPr>
+        <w:rFonts w:ascii="Calibri" w:eastAsia="Calibri" w:hAnsi="Calibri" w:cs="Calibri"/>
+        <w:b/>
+        <w:bCs/>
+        <w:sz w:val="20"/>
+        <w:szCs w:val="20"/>
+      </w:rPr>
+    </w:pPr>
+    <w:r>
+      <w:rPr>
+        <w:rFonts w:ascii="Calibri" w:eastAsia="Calibri" w:hAnsi="Calibri" w:cs="Calibri"/>
+        <w:b/>
+        <w:bCs/>
+        <w:sz w:val="20"/>
+        <w:szCs w:val="20"/>
+      </w:rPr>
+      <w:t>Ph:</w:t>
+    </w:r>
+    <w:r>
+      <w:rPr>
+        <w:rFonts w:ascii="Calibri" w:eastAsia="Calibri" w:hAnsi="Calibri" w:cs="Calibri"/>
+        <w:b/>
+        <w:bCs/>
+        <w:spacing w:val="-7"/>
+        <w:sz w:val="20"/>
+        <w:szCs w:val="20"/>
+      </w:rPr>
+      <w:t xml:space="preserve"> </w:t>
+    </w:r>
+    <w:r>
+      <w:rPr>
+        <w:rFonts w:ascii="Calibri" w:eastAsia="Calibri" w:hAnsi="Calibri" w:cs="Calibri"/>
+        <w:b/>
+        <w:bCs/>
+        <w:sz w:val="20"/>
+        <w:szCs w:val="20"/>
+      </w:rPr>
+      <w:t>91-80-95000449,</w:t>
+    </w:r>
+    <w:r>
+      <w:rPr>
+        <w:rFonts w:ascii="Calibri" w:eastAsia="Calibri" w:hAnsi="Calibri" w:cs="Calibri"/>
+        <w:b/>
+        <w:bCs/>
+        <w:spacing w:val="-3"/>
+        <w:sz w:val="20"/>
+        <w:szCs w:val="20"/>
+      </w:rPr>
+      <w:t xml:space="preserve"> </w:t>
+    </w:r>
+    <w:hyperlink r:id="rId1">
       <w:r>
         <w:rPr>
           <w:rFonts w:ascii="Calibri" w:eastAsia="Calibri" w:hAnsi="Calibri" w:cs="Calibri"/>
@@ -5791,219 +6133,7 @@
           <w:sz w:val="20"/>
           <w:szCs w:val="20"/>
         </w:rPr>
-        <w:t>Solutions,</w:t>
-      </w:r>
-      <w:r>
-        <w:rPr>
-          <w:rFonts w:ascii="Calibri" w:eastAsia="Calibri" w:hAnsi="Calibri" w:cs="Calibri"/>
-          <w:b/>
-          <w:bCs/>
-          <w:spacing w:val="-12"/>
-          <w:sz w:val="20"/>
-          <w:szCs w:val="20"/>
-        </w:rPr>
-        <w:t xml:space="preserve"> </w:t>
-      </w:r>
-      <w:r>
-        <w:rPr>
-          <w:rFonts w:ascii="Calibri" w:eastAsia="Calibri" w:hAnsi="Calibri" w:cs="Calibri"/>
-          <w:b/>
-          <w:bCs/>
-          <w:sz w:val="20"/>
-          <w:szCs w:val="20"/>
-        </w:rPr>
-        <w:t>#B110,</w:t>
-      </w:r>
-      <w:r>
-        <w:rPr>
-          <w:rFonts w:ascii="Calibri" w:eastAsia="Calibri" w:hAnsi="Calibri" w:cs="Calibri"/>
-          <w:b/>
-          <w:bCs/>
-          <w:spacing w:val="-7"/>
-          <w:sz w:val="20"/>
-          <w:szCs w:val="20"/>
-        </w:rPr>
-        <w:t xml:space="preserve"> </w:t>
-      </w:r>
-      <w:proofErr w:type="spellStart"/>
-      <w:r>
-        <w:rPr>
-          <w:rFonts w:ascii="Calibri" w:eastAsia="Calibri" w:hAnsi="Calibri" w:cs="Calibri"/>
-          <w:b/>
-          <w:bCs/>
-          <w:sz w:val="20"/>
-          <w:szCs w:val="20"/>
-        </w:rPr>
-        <w:t>Devasandra</w:t>
-      </w:r>
-      <w:proofErr w:type="spellEnd"/>
-      <w:r>
-        <w:rPr>
-          <w:rFonts w:ascii="Calibri" w:eastAsia="Calibri" w:hAnsi="Calibri" w:cs="Calibri"/>
-          <w:b/>
-          <w:bCs/>
-          <w:spacing w:val="-7"/>
-          <w:sz w:val="20"/>
-          <w:szCs w:val="20"/>
-        </w:rPr>
-        <w:t xml:space="preserve"> </w:t>
-      </w:r>
-      <w:r>
-        <w:rPr>
-          <w:rFonts w:ascii="Calibri" w:eastAsia="Calibri" w:hAnsi="Calibri" w:cs="Calibri"/>
-          <w:b/>
-          <w:bCs/>
-          <w:sz w:val="20"/>
-          <w:szCs w:val="20"/>
-        </w:rPr>
-        <w:t>Industrial</w:t>
-      </w:r>
-      <w:r>
-        <w:rPr>
-          <w:rFonts w:ascii="Calibri" w:eastAsia="Calibri" w:hAnsi="Calibri" w:cs="Calibri"/>
-          <w:b/>
-          <w:bCs/>
-          <w:spacing w:val="-4"/>
-          <w:sz w:val="20"/>
-          <w:szCs w:val="20"/>
-        </w:rPr>
-        <w:t xml:space="preserve"> </w:t>
-      </w:r>
-      <w:r>
-        <w:rPr>
-          <w:rFonts w:ascii="Calibri" w:eastAsia="Calibri" w:hAnsi="Calibri" w:cs="Calibri"/>
-          <w:b/>
-          <w:bCs/>
-          <w:sz w:val="20"/>
-          <w:szCs w:val="20"/>
-        </w:rPr>
-        <w:t>Estate,</w:t>
-      </w:r>
-      <w:r>
-        <w:rPr>
-          <w:rFonts w:ascii="Calibri" w:eastAsia="Calibri" w:hAnsi="Calibri" w:cs="Calibri"/>
-          <w:b/>
-          <w:bCs/>
-          <w:spacing w:val="-11"/>
-          <w:sz w:val="20"/>
-          <w:szCs w:val="20"/>
-        </w:rPr>
-        <w:t xml:space="preserve"> </w:t>
-      </w:r>
-      <w:r>
-        <w:rPr>
-          <w:rFonts w:ascii="Calibri" w:eastAsia="Calibri" w:hAnsi="Calibri" w:cs="Calibri"/>
-          <w:b/>
-          <w:bCs/>
-          <w:sz w:val="20"/>
-          <w:szCs w:val="20"/>
-        </w:rPr>
-        <w:t>Whitefield</w:t>
-      </w:r>
-      <w:r>
-        <w:rPr>
-          <w:rFonts w:ascii="Calibri" w:eastAsia="Calibri" w:hAnsi="Calibri" w:cs="Calibri"/>
-          <w:b/>
-          <w:bCs/>
-          <w:spacing w:val="-6"/>
-          <w:sz w:val="20"/>
-          <w:szCs w:val="20"/>
-        </w:rPr>
-        <w:t xml:space="preserve"> </w:t>
-      </w:r>
-      <w:r>
-        <w:rPr>
-          <w:rFonts w:ascii="Calibri" w:eastAsia="Calibri" w:hAnsi="Calibri" w:cs="Calibri"/>
-          <w:b/>
-          <w:bCs/>
-          <w:sz w:val="20"/>
-          <w:szCs w:val="20"/>
-        </w:rPr>
-        <w:t>Road,</w:t>
-      </w:r>
-      <w:r>
-        <w:rPr>
-          <w:rFonts w:ascii="Calibri" w:eastAsia="Calibri" w:hAnsi="Calibri" w:cs="Calibri"/>
-          <w:b/>
-          <w:bCs/>
-          <w:spacing w:val="-7"/>
-          <w:sz w:val="20"/>
-          <w:szCs w:val="20"/>
-        </w:rPr>
-        <w:t xml:space="preserve"> </w:t>
-      </w:r>
-      <w:r>
-        <w:rPr>
-          <w:rFonts w:ascii="Calibri" w:eastAsia="Calibri" w:hAnsi="Calibri" w:cs="Calibri"/>
-          <w:b/>
-          <w:bCs/>
-          <w:sz w:val="20"/>
-          <w:szCs w:val="20"/>
-        </w:rPr>
-        <w:t>Mahadevapura,</w:t>
-      </w:r>
-      <w:r>
-        <w:rPr>
-          <w:rFonts w:ascii="Calibri" w:eastAsia="Calibri" w:hAnsi="Calibri" w:cs="Calibri"/>
-          <w:b/>
-          <w:bCs/>
-          <w:spacing w:val="-12"/>
-          <w:sz w:val="20"/>
-          <w:szCs w:val="20"/>
-        </w:rPr>
-        <w:t xml:space="preserve"> </w:t>
-      </w:r>
-      <w:r>
-        <w:rPr>
-          <w:rFonts w:ascii="Calibri" w:eastAsia="Calibri" w:hAnsi="Calibri" w:cs="Calibri"/>
-          <w:b/>
-          <w:bCs/>
-          <w:sz w:val="20"/>
-          <w:szCs w:val="20"/>
-        </w:rPr>
-        <w:t>Bangalore</w:t>
-      </w:r>
-      <w:r>
-        <w:rPr>
-          <w:rFonts w:ascii="Calibri" w:eastAsia="Calibri" w:hAnsi="Calibri" w:cs="Calibri"/>
-          <w:b/>
-          <w:bCs/>
-          <w:spacing w:val="-2"/>
-          <w:sz w:val="20"/>
-          <w:szCs w:val="20"/>
-        </w:rPr>
-        <w:t xml:space="preserve"> </w:t>
-      </w:r>
-      <w:r>
-        <w:rPr>
-          <w:rFonts w:ascii="Calibri" w:eastAsia="Calibri" w:hAnsi="Calibri" w:cs="Calibri"/>
-          <w:b/>
-          <w:bCs/>
-          <w:sz w:val="20"/>
-          <w:szCs w:val="20"/>
-        </w:rPr>
-        <w:t>–</w:t>
-      </w:r>
-      <w:r>
-        <w:rPr>
-          <w:rFonts w:ascii="Calibri" w:eastAsia="Calibri" w:hAnsi="Calibri" w:cs="Calibri"/>
-          <w:b/>
-          <w:bCs/>
-          <w:spacing w:val="-4"/>
-          <w:sz w:val="20"/>
-          <w:szCs w:val="20"/>
-        </w:rPr>
-        <w:t xml:space="preserve"> </w:t>
-      </w:r>
-      <w:r>
-        <w:rPr>
-          <w:rFonts w:ascii="Calibri" w:eastAsia="Calibri" w:hAnsi="Calibri" w:cs="Calibri"/>
-          <w:b/>
-          <w:bCs/>
-          <w:sz w:val="20"/>
-          <w:szCs w:val="20"/>
-        </w:rPr>
-        <w:t>560048,</w:t>
+        <w:t>sales@beanalytic.com,</w:t>
       </w:r>
       <w:r>
         <w:rPr>
@@ -6016,6 +6146,8 @@
         </w:rPr>
         <w:t xml:space="preserve"> </w:t>
       </w:r>
+    </w:hyperlink>
+    <w:hyperlink r:id="rId2">
       <w:r>
         <w:rPr>
           <w:rFonts w:ascii="Calibri" w:eastAsia="Calibri" w:hAnsi="Calibri" w:cs="Calibri"/>
@@ -6024,117 +6156,773 @@
           <w:sz w:val="20"/>
           <w:szCs w:val="20"/>
         </w:rPr>
-        <w:t>India.</w:t>
+        <w:t>www.beanalytic.com</w:t>
+      </w:r>
+    </w:hyperlink>
+  </w:p>
+  <w:p>
+    <w:pPr>
+      <w:pStyle w:val="Footer"/>
+    </w:pPr>
+  </w:p>
+</w:ftr>
+</file>
+
+<file path=word/footnotes.xml><?xml version="1.0" encoding="utf-8"?>
+<w:footnotes xmlns:wpc="http://schemas.microsoft.com/office/word/2010/wordprocessingCanvas" xmlns:cx="http://schemas.microsoft.com/office/drawing/2014/chartex" xmlns:cx1="http://schemas.microsoft.com/office/drawing/2015/9/8/chartex" xmlns:cx2="http://schemas.microsoft.com/office/drawing/2015/10/21/chartex" xmlns:cx3="http://schemas.microsoft.com/office/drawing/2016/5/9/chartex" xmlns:cx4="http://schemas.microsoft.com/office/drawing/2016/5/10/chartex" xmlns:cx5="http://schemas.microsoft.com/office/drawing/2016/5/11/chartex" xmlns:cx6="http://schemas.microsoft.com/office/drawing/2016/5/12/chartex" xmlns:cx7="http://schemas.microsoft.com/office/drawing/2016/5/13/chartex" xmlns:cx8="http://schemas.microsoft.com/office/drawing/2016/5/14/chartex" xmlns:mc="http://schemas.openxmlformats.org/markup-compatibility/2006" xmlns:aink="http://schemas.microsoft.com/office/drawing/2016/ink" xmlns:am3d="http://schemas.microsoft.com/office/drawing/2017/model3d" xmlns:o="urn:schemas-microsoft-com:office:office" xmlns:oel="http://schemas.microsoft.com/office/2019/extlst" xmlns:r="http://schemas.openxmlformats.org/officeDocument/2006/relationships" xmlns:m="http://schemas.openxmlformats.org/officeDocument/2006/math" xmlns:v="urn:schemas-microsoft-com:vml" xmlns:wp14="http://schemas.microsoft.com/office/word/2010/wordprocessingDrawing" xmlns:wp="http://schemas.openxmlformats.org/drawingml/2006/wordprocessingDrawing" xmlns:w10="urn:schemas-microsoft-com:office:word" xmlns:w="http://schemas.openxmlformats.org/wordprocessingml/2006/main" xmlns:w14="http://schemas.microsoft.com/office/word/2010/wordml" xmlns:w15="http://schemas.microsoft.com/office/word/2012/wordml" xmlns:w16cex="http://schemas.microsoft.com/office/word/2018/wordml/cex" xmlns:w16cid="http://schemas.microsoft.com/office/word/2016/wordml/cid" xmlns:w16="http://schemas.microsoft.com/office/word/2018/wordml" xmlns:w16du="http://schemas.microsoft.com/office/word/2023/wordml/word16du" xmlns:w16sdtdh="http://schemas.microsoft.com/office/word/2020/wordml/sdtdatahash" xmlns:w16sdtfl="http://schemas.microsoft.com/office/word/2024/wordml/sdtformatlock" xmlns:w16se="http://schemas.microsoft.com/office/word/2015/wordml/symex" xmlns:wpg="http://schemas.microsoft.com/office/word/2010/wordprocessingGroup" xmlns:wpi="http://schemas.microsoft.com/office/word/2010/wordprocessingInk" xmlns:wne="http://schemas.microsoft.com/office/word/2006/wordml" xmlns:wps="http://schemas.microsoft.com/office/word/2010/wordprocessingShape" mc:Ignorable="w14 w15 w16se w16cid w16 w16cex w16sdtdh w16sdtfl w16du wp14">
+  <w:footnote w:type="separator" w:id="-1">
+    <w:p>
+      <w:r>
+        <w:separator/>
       </w:r>
     </w:p>
+  </w:footnote>
+  <w:footnote w:type="continuationSeparator" w:id="0">
     <w:p>
-      <w:pPr>
-        <w:widowControl w:val="0"/>
-        <w:autoSpaceDE w:val="0"/>
-        <w:autoSpaceDN w:val="0"/>
-        <w:spacing w:before="1"/>
-        <w:ind w:left="2368" w:right="3044"/>
-        <w:jc w:val="center"/>
-        <w:rPr>
-          <w:rFonts w:ascii="Calibri" w:eastAsia="Calibri" w:hAnsi="Calibri" w:cs="Calibri"/>
-          <w:b/>
-          <w:bCs/>
-          <w:sz w:val="20"/>
-          <w:szCs w:val="20"/>
-        </w:rPr>
-      </w:pPr>
       <w:r>
-        <w:rPr>
-          <w:rFonts w:ascii="Calibri" w:eastAsia="Calibri" w:hAnsi="Calibri" w:cs="Calibri"/>
-          <w:b/>
-          <w:bCs/>
-          <w:spacing w:val="-1"/>
-          <w:sz w:val="20"/>
-          <w:szCs w:val="20"/>
-        </w:rPr>
-        <w:t>Ph:</w:t>
+        <w:continuationSeparator/>
       </w:r>
-      <w:r>
-        <w:rPr>
-          <w:rFonts w:ascii="Calibri" w:eastAsia="Calibri" w:hAnsi="Calibri" w:cs="Calibri"/>
-          <w:b/>
-          <w:bCs/>
-          <w:spacing w:val="-8"/>
-          <w:sz w:val="20"/>
-          <w:szCs w:val="20"/>
-        </w:rPr>
-        <w:t xml:space="preserve"> </w:t>
-      </w:r>
-      <w:r>
-        <w:rPr>
-          <w:rFonts w:ascii="Calibri" w:eastAsia="Calibri" w:hAnsi="Calibri" w:cs="Calibri"/>
-          <w:b/>
-          <w:bCs/>
-          <w:spacing w:val="-1"/>
-          <w:sz w:val="20"/>
-          <w:szCs w:val="20"/>
-        </w:rPr>
-        <w:t>91-80-95000449,</w:t>
-      </w:r>
-      <w:r>
-        <w:rPr>
-          <w:rFonts w:ascii="Calibri" w:eastAsia="Calibri" w:hAnsi="Calibri" w:cs="Calibri"/>
-          <w:b/>
-          <w:bCs/>
-          <w:spacing w:val="-8"/>
-          <w:sz w:val="20"/>
-          <w:szCs w:val="20"/>
-        </w:rPr>
-        <w:t xml:space="preserve"> </w:t>
-      </w:r>
-      <w:hyperlink r:id="rId9">
-        <w:r>
-          <w:rPr>
-            <w:rFonts w:ascii="Calibri" w:eastAsia="Calibri" w:hAnsi="Calibri" w:cs="Calibri"/>
-            <w:b/>
-            <w:bCs/>
-            <w:sz w:val="20"/>
-            <w:szCs w:val="20"/>
-          </w:rPr>
-          <w:t>sales@beanalytic.com,</w:t>
-        </w:r>
-        <w:r>
-          <w:rPr>
-            <w:rFonts w:ascii="Calibri" w:eastAsia="Calibri" w:hAnsi="Calibri" w:cs="Calibri"/>
-            <w:b/>
-            <w:bCs/>
-            <w:spacing w:val="-3"/>
-            <w:sz w:val="20"/>
-            <w:szCs w:val="20"/>
-          </w:rPr>
-          <w:t xml:space="preserve"> </w:t>
-        </w:r>
-      </w:hyperlink>
-      <w:hyperlink r:id="rId10">
-        <w:r>
-          <w:rPr>
-            <w:rFonts w:ascii="Calibri" w:eastAsia="Calibri" w:hAnsi="Calibri" w:cs="Calibri"/>
-            <w:b/>
-            <w:bCs/>
-            <w:sz w:val="20"/>
-            <w:szCs w:val="20"/>
-          </w:rPr>
-          <w:t>www.beanalytic.com</w:t>
-        </w:r>
-      </w:hyperlink>
     </w:p>
-    <w:sectPr>
-      <w:pgSz w:w="15840" w:h="12240" w:orient="landscape"/>
-      <w:pgMar w:top="240" w:right="140" w:bottom="0" w:left="400" w:header="720" w:footer="720" w:gutter="0"/>
-      <w:cols w:space="720"/>
-    </w:sectPr>
-  </w:body>
-</w:document>
+  </w:footnote>
+</w:footnotes>
+</file>
+
+<file path=word/header1.xml><?xml version="1.0" encoding="utf-8"?>
+<w:hdr xmlns:wpc="http://schemas.microsoft.com/office/word/2010/wordprocessingCanvas" xmlns:cx="http://schemas.microsoft.com/office/drawing/2014/chartex" xmlns:cx1="http://schemas.microsoft.com/office/drawing/2015/9/8/chartex" xmlns:cx2="http://schemas.microsoft.com/office/drawing/2015/10/21/chartex" xmlns:cx3="http://schemas.microsoft.com/office/drawing/2016/5/9/chartex" xmlns:cx4="http://schemas.microsoft.com/office/drawing/2016/5/10/chartex" xmlns:cx5="http://schemas.microsoft.com/office/drawing/2016/5/11/chartex" xmlns:cx6="http://schemas.microsoft.com/office/drawing/2016/5/12/chartex" xmlns:cx7="http://schemas.microsoft.com/office/drawing/2016/5/13/chartex" xmlns:cx8="http://schemas.microsoft.com/office/drawing/2016/5/14/chartex" xmlns:mc="http://schemas.openxmlformats.org/markup-compatibility/2006" xmlns:aink="http://schemas.microsoft.com/office/drawing/2016/ink" xmlns:am3d="http://schemas.microsoft.com/office/drawing/2017/model3d" xmlns:o="urn:schemas-microsoft-com:office:office" xmlns:oel="http://schemas.microsoft.com/office/2019/extlst" xmlns:r="http://schemas.openxmlformats.org/officeDocument/2006/relationships" xmlns:m="http://schemas.openxmlformats.org/officeDocument/2006/math" xmlns:v="urn:schemas-microsoft-com:vml" xmlns:wp14="http://schemas.microsoft.com/office/word/2010/wordprocessingDrawing" xmlns:wp="http://schemas.openxmlformats.org/drawingml/2006/wordprocessingDrawing" xmlns:w10="urn:schemas-microsoft-com:office:word" xmlns:w="http://schemas.openxmlformats.org/wordprocessingml/2006/main" xmlns:w14="http://schemas.microsoft.com/office/word/2010/wordml" xmlns:w15="http://schemas.microsoft.com/office/word/2012/wordml" xmlns:w16cex="http://schemas.microsoft.com/office/word/2018/wordml/cex" xmlns:w16cid="http://schemas.microsoft.com/office/word/2016/wordml/cid" xmlns:w16="http://schemas.microsoft.com/office/word/2018/wordml" xmlns:w16du="http://schemas.microsoft.com/office/word/2023/wordml/word16du" xmlns:w16sdtdh="http://schemas.microsoft.com/office/word/2020/wordml/sdtdatahash" xmlns:w16sdtfl="http://schemas.microsoft.com/office/word/2024/wordml/sdtformatlock" xmlns:w16se="http://schemas.microsoft.com/office/word/2015/wordml/symex" xmlns:wpg="http://schemas.microsoft.com/office/word/2010/wordprocessingGroup" xmlns:wpi="http://schemas.microsoft.com/office/word/2010/wordprocessingInk" xmlns:wne="http://schemas.microsoft.com/office/word/2006/wordml" xmlns:wps="http://schemas.microsoft.com/office/word/2010/wordprocessingShape" mc:Ignorable="w14 w15 w16se w16cid w16 w16cex w16sdtdh w16sdtfl w16du wp14">
+  <w:tbl>
+    <w:tblPr>
+      <w:tblStyle w:val="TableGrid"/>
+      <w:tblW w:w="0" w:type="auto"/>
+      <w:tblBorders>
+        <w:top w:val="none" w:sz="0" w:space="0" w:color="auto"/>
+        <w:left w:val="none" w:sz="0" w:space="0" w:color="auto"/>
+        <w:bottom w:val="none" w:sz="0" w:space="0" w:color="auto"/>
+        <w:right w:val="none" w:sz="0" w:space="0" w:color="auto"/>
+        <w:insideH w:val="none" w:sz="0" w:space="0" w:color="auto"/>
+        <w:insideV w:val="none" w:sz="0" w:space="0" w:color="auto"/>
+      </w:tblBorders>
+      <w:tblLook w:val="04A0" w:firstRow="1" w:lastRow="0" w:firstColumn="1" w:lastColumn="0" w:noHBand="0" w:noVBand="1"/>
+    </w:tblPr>
+    <w:tblGrid>
+      <w:gridCol w:w="3524"/>
+      <w:gridCol w:w="3948"/>
+      <w:gridCol w:w="3101"/>
+    </w:tblGrid>
+    <w:tr>
+      <w:trPr>
+        <w:trHeight w:val="848"/>
+      </w:trPr>
+      <w:tc>
+        <w:tcPr>
+          <w:tcW w:w="3524" w:type="dxa"/>
+        </w:tcPr>
+        <w:p>
+          <w:pPr>
+            <w:pStyle w:val="Header"/>
+            <w:jc w:val="center"/>
+          </w:pPr>
+        </w:p>
+      </w:tc>
+      <w:tc>
+        <w:tcPr>
+          <w:tcW w:w="3948" w:type="dxa"/>
+        </w:tcPr>
+        <w:p>
+          <w:pPr>
+            <w:pStyle w:val="Header"/>
+            <w:jc w:val="center"/>
+          </w:pPr>
+          <w:r>
+            <w:rPr>
+              <w:rFonts w:ascii="Calibri" w:eastAsia="Calibri" w:hAnsi="Calibri" w:cs="Calibri"/>
+              <w:b/>
+              <w:bCs/>
+              <w:sz w:val="36"/>
+              <w:szCs w:val="36"/>
+            </w:rPr>
+            <w:t>JOB-CARD</w:t>
+          </w:r>
+        </w:p>
+      </w:tc>
+      <w:tc>
+        <w:tcPr>
+          <w:tcW w:w="3101" w:type="dxa"/>
+        </w:tcPr>
+        <w:p>
+          <w:pPr>
+            <w:pStyle w:val="Header"/>
+            <w:jc w:val="center"/>
+            <w:rPr>
+              <w:rFonts w:ascii="Calibri" w:eastAsia="Calibri" w:hAnsi="Calibri" w:cs="Calibri"/>
+              <w:sz w:val="20"/>
+              <w:szCs w:val="22"/>
+            </w:rPr>
+          </w:pPr>
+          <w:r>
+            <w:rPr>
+              <w:rFonts w:ascii="Calibri" w:eastAsia="Calibri" w:hAnsi="Calibri" w:cs="Calibri"/>
+              <w:sz w:val="20"/>
+              <w:szCs w:val="22"/>
+            </w:rPr>
+            <w:t>Doc. No. BEA/EMC/TR/JC</w:t>
+          </w:r>
+        </w:p>
+        <w:p>
+          <w:pPr>
+            <w:pStyle w:val="Header"/>
+            <w:jc w:val="center"/>
+            <w:rPr>
+              <w:rFonts w:ascii="Calibri" w:eastAsia="Calibri" w:hAnsi="Calibri" w:cs="Calibri"/>
+              <w:sz w:val="20"/>
+              <w:szCs w:val="22"/>
+            </w:rPr>
+          </w:pPr>
+          <w:r>
+            <w:rPr>
+              <w:rFonts w:ascii="Calibri" w:eastAsia="Calibri" w:hAnsi="Calibri" w:cs="Calibri"/>
+              <w:sz w:val="20"/>
+              <w:szCs w:val="22"/>
+            </w:rPr>
+            <w:t>/</w:t>
+          </w:r>
+          <w:r>
+            <w:rPr>
+              <w:rFonts w:ascii="Calibri" w:eastAsia="Calibri" w:hAnsi="Calibri" w:cs="Calibri"/>
+              <w:spacing w:val="-43"/>
+              <w:sz w:val="20"/>
+              <w:szCs w:val="22"/>
+            </w:rPr>
+            <w:t xml:space="preserve"> </w:t>
+          </w:r>
+          <w:r>
+            <w:rPr>
+              <w:rFonts w:ascii="Calibri" w:eastAsia="Calibri" w:hAnsi="Calibri" w:cs="Calibri"/>
+              <w:sz w:val="20"/>
+              <w:szCs w:val="22"/>
+            </w:rPr>
+            <w:t>ISO/IEC</w:t>
+          </w:r>
+          <w:r>
+            <w:rPr>
+              <w:rFonts w:ascii="Calibri" w:eastAsia="Calibri" w:hAnsi="Calibri" w:cs="Calibri"/>
+              <w:spacing w:val="-7"/>
+              <w:sz w:val="20"/>
+              <w:szCs w:val="22"/>
+            </w:rPr>
+            <w:t xml:space="preserve"> </w:t>
+          </w:r>
+          <w:r>
+            <w:rPr>
+              <w:rFonts w:ascii="Calibri" w:eastAsia="Calibri" w:hAnsi="Calibri" w:cs="Calibri"/>
+              <w:sz w:val="20"/>
+              <w:szCs w:val="22"/>
+            </w:rPr>
+            <w:t>17025:2017</w:t>
+          </w:r>
+        </w:p>
+      </w:tc>
+    </w:tr>
+  </w:tbl>
+  <w:p>
+    <w:pPr>
+      <w:pStyle w:val="Header"/>
+      <w:jc w:val="center"/>
+    </w:pPr>
+    <w:r>
+      <w:rPr>
+        <w:noProof/>
+      </w:rPr>
+      <w:drawing>
+        <wp:anchor distT="0" distB="0" distL="0" distR="0" simplePos="0" relativeHeight="251658240" behindDoc="0" locked="0" layoutInCell="1" allowOverlap="1" wp14:anchorId="150C3ACF" wp14:editId="28044D89">
+          <wp:simplePos x="0" y="0"/>
+          <wp:positionH relativeFrom="page">
+            <wp:posOffset>424180</wp:posOffset>
+          </wp:positionH>
+          <wp:positionV relativeFrom="paragraph">
+            <wp:posOffset>-539115</wp:posOffset>
+          </wp:positionV>
+          <wp:extent cx="1209916" cy="472440"/>
+          <wp:effectExtent l="0" t="0" r="0" b="0"/>
+          <wp:wrapNone/>
+          <wp:docPr id="670764670" name="image1.jpeg" descr="H:\Documents and Settings\pskumar\My Documents\My Pictures\logoscreensh.jpg"/>
+          <wp:cNvGraphicFramePr>
+            <a:graphicFrameLocks xmlns:a="http://schemas.openxmlformats.org/drawingml/2006/main" noChangeAspect="1"/>
+          </wp:cNvGraphicFramePr>
+          <a:graphic xmlns:a="http://schemas.openxmlformats.org/drawingml/2006/main">
+            <a:graphicData uri="http://schemas.openxmlformats.org/drawingml/2006/picture">
+              <pic:pic xmlns:pic="http://schemas.openxmlformats.org/drawingml/2006/picture">
+                <pic:nvPicPr>
+                  <pic:cNvPr id="1" name="image1.jpeg"/>
+                  <pic:cNvPicPr/>
+                </pic:nvPicPr>
+                <pic:blipFill>
+                  <a:blip r:embed="rId1" cstate="print"/>
+                  <a:stretch>
+                    <a:fillRect/>
+                  </a:stretch>
+                </pic:blipFill>
+                <pic:spPr>
+                  <a:xfrm>
+                    <a:off x="0" y="0"/>
+                    <a:ext cx="1209916" cy="472440"/>
+                  </a:xfrm>
+                  <a:prstGeom prst="rect">
+                    <a:avLst/>
+                  </a:prstGeom>
+                </pic:spPr>
+              </pic:pic>
+            </a:graphicData>
+          </a:graphic>
+        </wp:anchor>
+      </w:drawing>
+    </w:r>
+    <w:r>
+      <w:rPr>
+        <w:noProof/>
+      </w:rPr>
+      <w:pict w14:anchorId="0DCD1C0D">
+        <v:shapetype id="_x0000_t32" coordsize="21600,21600" o:spt="32" o:oned="t" path="m,l21600,21600e" filled="f">
+          <v:path arrowok="t" fillok="f" o:connecttype="none"/>
+          <o:lock v:ext="edit" shapetype="t"/>
+        </v:shapetype>
+        <v:shape id="_x0000_s1026" type="#_x0000_t32" style="position:absolute;left:0;text-align:left;margin-left:-9.2pt;margin-top:4.9pt;width:537pt;height:0;z-index:251660288;mso-position-horizontal-relative:text;mso-position-vertical-relative:text" o:connectortype="straight"/>
+      </w:pict>
+    </w:r>
+  </w:p>
+</w:hdr>
+</file>
+
+<file path=word/header2.xml><?xml version="1.0" encoding="utf-8"?>
+<w:hdr xmlns:wpc="http://schemas.microsoft.com/office/word/2010/wordprocessingCanvas" xmlns:cx="http://schemas.microsoft.com/office/drawing/2014/chartex" xmlns:cx1="http://schemas.microsoft.com/office/drawing/2015/9/8/chartex" xmlns:cx2="http://schemas.microsoft.com/office/drawing/2015/10/21/chartex" xmlns:cx3="http://schemas.microsoft.com/office/drawing/2016/5/9/chartex" xmlns:cx4="http://schemas.microsoft.com/office/drawing/2016/5/10/chartex" xmlns:cx5="http://schemas.microsoft.com/office/drawing/2016/5/11/chartex" xmlns:cx6="http://schemas.microsoft.com/office/drawing/2016/5/12/chartex" xmlns:cx7="http://schemas.microsoft.com/office/drawing/2016/5/13/chartex" xmlns:cx8="http://schemas.microsoft.com/office/drawing/2016/5/14/chartex" xmlns:mc="http://schemas.openxmlformats.org/markup-compatibility/2006" xmlns:aink="http://schemas.microsoft.com/office/drawing/2016/ink" xmlns:am3d="http://schemas.microsoft.com/office/drawing/2017/model3d" xmlns:o="urn:schemas-microsoft-com:office:office" xmlns:oel="http://schemas.microsoft.com/office/2019/extlst" xmlns:r="http://schemas.openxmlformats.org/officeDocument/2006/relationships" xmlns:m="http://schemas.openxmlformats.org/officeDocument/2006/math" xmlns:v="urn:schemas-microsoft-com:vml" xmlns:wp14="http://schemas.microsoft.com/office/word/2010/wordprocessingDrawing" xmlns:wp="http://schemas.openxmlformats.org/drawingml/2006/wordprocessingDrawing" xmlns:w10="urn:schemas-microsoft-com:office:word" xmlns:w="http://schemas.openxmlformats.org/wordprocessingml/2006/main" xmlns:w14="http://schemas.microsoft.com/office/word/2010/wordml" xmlns:w15="http://schemas.microsoft.com/office/word/2012/wordml" xmlns:w16cex="http://schemas.microsoft.com/office/word/2018/wordml/cex" xmlns:w16cid="http://schemas.microsoft.com/office/word/2016/wordml/cid" xmlns:w16="http://schemas.microsoft.com/office/word/2018/wordml" xmlns:w16du="http://schemas.microsoft.com/office/word/2023/wordml/word16du" xmlns:w16sdtdh="http://schemas.microsoft.com/office/word/2020/wordml/sdtdatahash" xmlns:w16sdtfl="http://schemas.microsoft.com/office/word/2024/wordml/sdtformatlock" xmlns:w16se="http://schemas.microsoft.com/office/word/2015/wordml/symex" xmlns:wpg="http://schemas.microsoft.com/office/word/2010/wordprocessingGroup" xmlns:wpi="http://schemas.microsoft.com/office/word/2010/wordprocessingInk" xmlns:wne="http://schemas.microsoft.com/office/word/2006/wordml" xmlns:wps="http://schemas.microsoft.com/office/word/2010/wordprocessingShape" mc:Ignorable="w14 w15 w16se w16cid w16 w16cex w16sdtdh w16sdtfl w16du wp14">
+  <w:tbl>
+    <w:tblPr>
+      <w:tblStyle w:val="TableGrid"/>
+      <w:tblW w:w="0" w:type="auto"/>
+      <w:tblBorders>
+        <w:top w:val="none" w:sz="0" w:space="0" w:color="auto"/>
+        <w:left w:val="none" w:sz="0" w:space="0" w:color="auto"/>
+        <w:bottom w:val="none" w:sz="0" w:space="0" w:color="auto"/>
+        <w:right w:val="none" w:sz="0" w:space="0" w:color="auto"/>
+        <w:insideH w:val="none" w:sz="0" w:space="0" w:color="auto"/>
+        <w:insideV w:val="none" w:sz="0" w:space="0" w:color="auto"/>
+      </w:tblBorders>
+      <w:tblLook w:val="04A0" w:firstRow="1" w:lastRow="0" w:firstColumn="1" w:lastColumn="0" w:noHBand="0" w:noVBand="1"/>
+    </w:tblPr>
+    <w:tblGrid>
+      <w:gridCol w:w="3502"/>
+      <w:gridCol w:w="4180"/>
+      <w:gridCol w:w="3504"/>
+    </w:tblGrid>
+    <w:tr>
+      <w:trPr>
+        <w:trHeight w:val="981"/>
+      </w:trPr>
+      <w:tc>
+        <w:tcPr>
+          <w:tcW w:w="5033" w:type="dxa"/>
+        </w:tcPr>
+        <w:p>
+          <w:pPr>
+            <w:pStyle w:val="Header"/>
+            <w:jc w:val="center"/>
+          </w:pPr>
+          <w:r>
+            <w:rPr>
+              <w:noProof/>
+            </w:rPr>
+            <w:drawing>
+              <wp:anchor distT="0" distB="0" distL="0" distR="0" simplePos="0" relativeHeight="251663360" behindDoc="0" locked="0" layoutInCell="1" allowOverlap="1" wp14:anchorId="197E8C6F" wp14:editId="40203515">
+                <wp:simplePos x="0" y="0"/>
+                <wp:positionH relativeFrom="page">
+                  <wp:posOffset>855980</wp:posOffset>
+                </wp:positionH>
+                <wp:positionV relativeFrom="paragraph">
+                  <wp:posOffset>13429</wp:posOffset>
+                </wp:positionV>
+                <wp:extent cx="1209916" cy="472440"/>
+                <wp:effectExtent l="0" t="0" r="0" b="0"/>
+                <wp:wrapNone/>
+                <wp:docPr id="470182333" name="image1.jpeg" descr="H:\Documents and Settings\pskumar\My Documents\My Pictures\logoscreensh.jpg"/>
+                <wp:cNvGraphicFramePr>
+                  <a:graphicFrameLocks xmlns:a="http://schemas.openxmlformats.org/drawingml/2006/main" noChangeAspect="1"/>
+                </wp:cNvGraphicFramePr>
+                <a:graphic xmlns:a="http://schemas.openxmlformats.org/drawingml/2006/main">
+                  <a:graphicData uri="http://schemas.openxmlformats.org/drawingml/2006/picture">
+                    <pic:pic xmlns:pic="http://schemas.openxmlformats.org/drawingml/2006/picture">
+                      <pic:nvPicPr>
+                        <pic:cNvPr id="1" name="image1.jpeg"/>
+                        <pic:cNvPicPr/>
+                      </pic:nvPicPr>
+                      <pic:blipFill>
+                        <a:blip r:embed="rId1" cstate="print"/>
+                        <a:stretch>
+                          <a:fillRect/>
+                        </a:stretch>
+                      </pic:blipFill>
+                      <pic:spPr>
+                        <a:xfrm>
+                          <a:off x="0" y="0"/>
+                          <a:ext cx="1209916" cy="472440"/>
+                        </a:xfrm>
+                        <a:prstGeom prst="rect">
+                          <a:avLst/>
+                        </a:prstGeom>
+                      </pic:spPr>
+                    </pic:pic>
+                  </a:graphicData>
+                </a:graphic>
+              </wp:anchor>
+            </w:drawing>
+          </w:r>
+        </w:p>
+      </w:tc>
+      <w:tc>
+        <w:tcPr>
+          <w:tcW w:w="5639" w:type="dxa"/>
+        </w:tcPr>
+        <w:p>
+          <w:pPr>
+            <w:pStyle w:val="Header"/>
+          </w:pPr>
+          <w:r>
+            <w:rPr>
+              <w:rFonts w:ascii="Calibri" w:eastAsia="Calibri" w:hAnsi="Calibri" w:cs="Calibri"/>
+              <w:b/>
+              <w:bCs/>
+              <w:sz w:val="36"/>
+              <w:szCs w:val="36"/>
+            </w:rPr>
+            <w:t xml:space="preserve">                      </w:t>
+          </w:r>
+          <w:r>
+            <w:rPr>
+              <w:rFonts w:ascii="Calibri" w:eastAsia="Calibri" w:hAnsi="Calibri" w:cs="Calibri"/>
+              <w:b/>
+              <w:bCs/>
+              <w:sz w:val="36"/>
+              <w:szCs w:val="36"/>
+            </w:rPr>
+            <w:t>JOB-CARD</w:t>
+          </w:r>
+        </w:p>
+      </w:tc>
+      <w:tc>
+        <w:tcPr>
+          <w:tcW w:w="4429" w:type="dxa"/>
+        </w:tcPr>
+        <w:p>
+          <w:pPr>
+            <w:pStyle w:val="Header"/>
+            <w:jc w:val="center"/>
+            <w:rPr>
+              <w:rFonts w:ascii="Calibri" w:eastAsia="Calibri" w:hAnsi="Calibri" w:cs="Calibri"/>
+              <w:sz w:val="20"/>
+              <w:szCs w:val="22"/>
+            </w:rPr>
+          </w:pPr>
+          <w:r>
+            <w:rPr>
+              <w:rFonts w:ascii="Calibri" w:eastAsia="Calibri" w:hAnsi="Calibri" w:cs="Calibri"/>
+              <w:sz w:val="20"/>
+              <w:szCs w:val="22"/>
+            </w:rPr>
+            <w:t xml:space="preserve">                   </w:t>
+          </w:r>
+          <w:r>
+            <w:rPr>
+              <w:rFonts w:ascii="Calibri" w:eastAsia="Calibri" w:hAnsi="Calibri" w:cs="Calibri"/>
+              <w:sz w:val="20"/>
+              <w:szCs w:val="22"/>
+            </w:rPr>
+            <w:t>Doc. No. BEA/EMC/TR/JC</w:t>
+          </w:r>
+        </w:p>
+        <w:p>
+          <w:pPr>
+            <w:pStyle w:val="Header"/>
+            <w:jc w:val="center"/>
+            <w:rPr>
+              <w:rFonts w:ascii="Calibri" w:eastAsia="Calibri" w:hAnsi="Calibri" w:cs="Calibri"/>
+              <w:sz w:val="20"/>
+              <w:szCs w:val="22"/>
+            </w:rPr>
+          </w:pPr>
+          <w:r>
+            <w:rPr>
+              <w:rFonts w:ascii="Calibri" w:eastAsia="Calibri" w:hAnsi="Calibri" w:cs="Calibri"/>
+              <w:sz w:val="20"/>
+              <w:szCs w:val="22"/>
+            </w:rPr>
+            <w:t xml:space="preserve">              </w:t>
+          </w:r>
+          <w:r>
+            <w:rPr>
+              <w:rFonts w:ascii="Calibri" w:eastAsia="Calibri" w:hAnsi="Calibri" w:cs="Calibri"/>
+              <w:sz w:val="20"/>
+              <w:szCs w:val="22"/>
+            </w:rPr>
+            <w:t>/</w:t>
+          </w:r>
+          <w:r>
+            <w:rPr>
+              <w:rFonts w:ascii="Calibri" w:eastAsia="Calibri" w:hAnsi="Calibri" w:cs="Calibri"/>
+              <w:spacing w:val="-43"/>
+              <w:sz w:val="20"/>
+              <w:szCs w:val="22"/>
+            </w:rPr>
+            <w:t xml:space="preserve"> </w:t>
+          </w:r>
+          <w:r>
+            <w:rPr>
+              <w:rFonts w:ascii="Calibri" w:eastAsia="Calibri" w:hAnsi="Calibri" w:cs="Calibri"/>
+              <w:sz w:val="20"/>
+              <w:szCs w:val="22"/>
+            </w:rPr>
+            <w:t>ISO/IEC</w:t>
+          </w:r>
+          <w:r>
+            <w:rPr>
+              <w:rFonts w:ascii="Calibri" w:eastAsia="Calibri" w:hAnsi="Calibri" w:cs="Calibri"/>
+              <w:spacing w:val="-7"/>
+              <w:sz w:val="20"/>
+              <w:szCs w:val="22"/>
+            </w:rPr>
+            <w:t xml:space="preserve"> </w:t>
+          </w:r>
+          <w:r>
+            <w:rPr>
+              <w:rFonts w:ascii="Calibri" w:eastAsia="Calibri" w:hAnsi="Calibri" w:cs="Calibri"/>
+              <w:sz w:val="20"/>
+              <w:szCs w:val="22"/>
+            </w:rPr>
+            <w:t>17025:2017</w:t>
+          </w:r>
+        </w:p>
+      </w:tc>
+    </w:tr>
+  </w:tbl>
+  <w:p>
+    <w:pPr>
+      <w:pStyle w:val="Header"/>
+      <w:jc w:val="center"/>
+    </w:pPr>
+    <w:r>
+      <w:rPr>
+        <w:noProof/>
+      </w:rPr>
+      <w:pict w14:anchorId="5F5B4555">
+        <v:shapetype id="_x0000_t32" coordsize="21600,21600" o:spt="32" o:oned="t" path="m,l21600,21600e" filled="f">
+          <v:path arrowok="t" fillok="f" o:connecttype="none"/>
+          <o:lock v:ext="edit" shapetype="t"/>
+        </v:shapetype>
+        <v:shape id="_x0000_s1027" type="#_x0000_t32" style="position:absolute;left:0;text-align:left;margin-left:-9.2pt;margin-top:4.9pt;width:762.6pt;height:0;z-index:251662336;mso-position-horizontal-relative:text;mso-position-vertical-relative:text" o:connectortype="straight"/>
+      </w:pict>
+    </w:r>
+  </w:p>
+</w:hdr>
 </file>
 
 <file path=word/numbering.xml><?xml version="1.0" encoding="utf-8"?>
 <w:numbering xmlns:wpc="http://schemas.microsoft.com/office/word/2010/wordprocessingCanvas" xmlns:cx="http://schemas.microsoft.com/office/drawing/2014/chartex" xmlns:cx1="http://schemas.microsoft.com/office/drawing/2015/9/8/chartex" xmlns:cx2="http://schemas.microsoft.com/office/drawing/2015/10/21/chartex" xmlns:cx3="http://schemas.microsoft.com/office/drawing/2016/5/9/chartex" xmlns:cx4="http://schemas.microsoft.com/office/drawing/2016/5/10/chartex" xmlns:cx5="http://schemas.microsoft.com/office/drawing/2016/5/11/chartex" xmlns:cx6="http://schemas.microsoft.com/office/drawing/2016/5/12/chartex" xmlns:cx7="http://schemas.microsoft.com/office/drawing/2016/5/13/chartex" xmlns:cx8="http://schemas.microsoft.com/office/drawing/2016/5/14/chartex" xmlns:mc="http://schemas.openxmlformats.org/markup-compatibility/2006" xmlns:aink="http://schemas.microsoft.com/office/drawing/2016/ink" xmlns:am3d="http://schemas.microsoft.com/office/drawing/2017/model3d" xmlns:o="urn:schemas-microsoft-com:office:office" xmlns:oel="http://schemas.microsoft.com/office/2019/extlst" xmlns:r="http://schemas.openxmlformats.org/officeDocument/2006/relationships" xmlns:m="http://schemas.openxmlformats.org/officeDocument/2006/math" xmlns:v="urn:schemas-microsoft-com:vml" xmlns:wp14="http://schemas.microsoft.com/office/word/2010/wordprocessingDrawing" xmlns:wp="http://schemas.openxmlformats.org/drawingml/2006/wordprocessingDrawing" xmlns:w10="urn:schemas-microsoft-com:office:word" xmlns:w="http://schemas.openxmlformats.org/wordprocessingml/2006/main" xmlns:w14="http://schemas.microsoft.com/office/word/2010/wordml" xmlns:w15="http://schemas.microsoft.com/office/word/2012/wordml" xmlns:w16cex="http://schemas.microsoft.com/office/word/2018/wordml/cex" xmlns:w16cid="http://schemas.microsoft.com/office/word/2016/wordml/cid" xmlns:w16="http://schemas.microsoft.com/office/word/2018/wordml" xmlns:w16du="http://schemas.microsoft.com/office/word/2023/wordml/word16du" xmlns:w16sdtdh="http://schemas.microsoft.com/office/word/2020/wordml/sdtdatahash" xmlns:w16sdtfl="http://schemas.microsoft.com/office/word/2024/wordml/sdtformatlock" xmlns:w16se="http://schemas.microsoft.com/office/word/2015/wordml/symex" xmlns:wpg="http://schemas.microsoft.com/office/word/2010/wordprocessingGroup" xmlns:wpi="http://schemas.microsoft.com/office/word/2010/wordprocessingInk" xmlns:wne="http://schemas.microsoft.com/office/word/2006/wordml" xmlns:wps="http://schemas.microsoft.com/office/word/2010/wordprocessingShape" mc:Ignorable="w14 w15 w16se w16cid w16 w16cex w16sdtdh w16sdtfl w16du wp14">
   <w:abstractNum w:abstractNumId="0" w15:restartNumberingAfterBreak="0">
+    <w:nsid w:val="0F9F7CBF"/>
+    <w:multiLevelType w:val="multilevel"/>
+    <w:tmpl w:val="11C65C8C"/>
+    <w:lvl w:ilvl="0">
+      <w:start w:val="1"/>
+      <w:numFmt w:val="bullet"/>
+      <w:lvlText w:val=""/>
+      <w:lvlJc w:val="left"/>
+      <w:pPr>
+        <w:tabs>
+          <w:tab w:val="num" w:pos="720"/>
+        </w:tabs>
+        <w:ind w:left="720" w:hanging="360"/>
+      </w:pPr>
+      <w:rPr>
+        <w:rFonts w:ascii="Symbol" w:hAnsi="Symbol" w:hint="default"/>
+        <w:sz w:val="20"/>
+      </w:rPr>
+    </w:lvl>
+    <w:lvl w:ilvl="1" w:tentative="1">
+      <w:start w:val="1"/>
+      <w:numFmt w:val="bullet"/>
+      <w:lvlText w:val=""/>
+      <w:lvlJc w:val="left"/>
+      <w:pPr>
+        <w:tabs>
+          <w:tab w:val="num" w:pos="1440"/>
+        </w:tabs>
+        <w:ind w:left="1440" w:hanging="360"/>
+      </w:pPr>
+      <w:rPr>
+        <w:rFonts w:ascii="Symbol" w:hAnsi="Symbol" w:hint="default"/>
+        <w:sz w:val="20"/>
+      </w:rPr>
+    </w:lvl>
+    <w:lvl w:ilvl="2" w:tentative="1">
+      <w:start w:val="1"/>
+      <w:numFmt w:val="bullet"/>
+      <w:lvlText w:val=""/>
+      <w:lvlJc w:val="left"/>
+      <w:pPr>
+        <w:tabs>
+          <w:tab w:val="num" w:pos="2160"/>
+        </w:tabs>
+        <w:ind w:left="2160" w:hanging="360"/>
+      </w:pPr>
+      <w:rPr>
+        <w:rFonts w:ascii="Symbol" w:hAnsi="Symbol" w:hint="default"/>
+        <w:sz w:val="20"/>
+      </w:rPr>
+    </w:lvl>
+    <w:lvl w:ilvl="3" w:tentative="1">
+      <w:start w:val="1"/>
+      <w:numFmt w:val="bullet"/>
+      <w:lvlText w:val=""/>
+      <w:lvlJc w:val="left"/>
+      <w:pPr>
+        <w:tabs>
+          <w:tab w:val="num" w:pos="2880"/>
+        </w:tabs>
+        <w:ind w:left="2880" w:hanging="360"/>
+      </w:pPr>
+      <w:rPr>
+        <w:rFonts w:ascii="Symbol" w:hAnsi="Symbol" w:hint="default"/>
+        <w:sz w:val="20"/>
+      </w:rPr>
+    </w:lvl>
+    <w:lvl w:ilvl="4" w:tentative="1">
+      <w:start w:val="1"/>
+      <w:numFmt w:val="bullet"/>
+      <w:lvlText w:val=""/>
+      <w:lvlJc w:val="left"/>
+      <w:pPr>
+        <w:tabs>
+          <w:tab w:val="num" w:pos="3600"/>
+        </w:tabs>
+        <w:ind w:left="3600" w:hanging="360"/>
+      </w:pPr>
+      <w:rPr>
+        <w:rFonts w:ascii="Symbol" w:hAnsi="Symbol" w:hint="default"/>
+        <w:sz w:val="20"/>
+      </w:rPr>
+    </w:lvl>
+    <w:lvl w:ilvl="5" w:tentative="1">
+      <w:start w:val="1"/>
+      <w:numFmt w:val="bullet"/>
+      <w:lvlText w:val=""/>
+      <w:lvlJc w:val="left"/>
+      <w:pPr>
+        <w:tabs>
+          <w:tab w:val="num" w:pos="4320"/>
+        </w:tabs>
+        <w:ind w:left="4320" w:hanging="360"/>
+      </w:pPr>
+      <w:rPr>
+        <w:rFonts w:ascii="Symbol" w:hAnsi="Symbol" w:hint="default"/>
+        <w:sz w:val="20"/>
+      </w:rPr>
+    </w:lvl>
+    <w:lvl w:ilvl="6" w:tentative="1">
+      <w:start w:val="1"/>
+      <w:numFmt w:val="bullet"/>
+      <w:lvlText w:val=""/>
+      <w:lvlJc w:val="left"/>
+      <w:pPr>
+        <w:tabs>
+          <w:tab w:val="num" w:pos="5040"/>
+        </w:tabs>
+        <w:ind w:left="5040" w:hanging="360"/>
+      </w:pPr>
+      <w:rPr>
+        <w:rFonts w:ascii="Symbol" w:hAnsi="Symbol" w:hint="default"/>
+        <w:sz w:val="20"/>
+      </w:rPr>
+    </w:lvl>
+    <w:lvl w:ilvl="7" w:tentative="1">
+      <w:start w:val="1"/>
+      <w:numFmt w:val="bullet"/>
+      <w:lvlText w:val=""/>
+      <w:lvlJc w:val="left"/>
+      <w:pPr>
+        <w:tabs>
+          <w:tab w:val="num" w:pos="5760"/>
+        </w:tabs>
+        <w:ind w:left="5760" w:hanging="360"/>
+      </w:pPr>
+      <w:rPr>
+        <w:rFonts w:ascii="Symbol" w:hAnsi="Symbol" w:hint="default"/>
+        <w:sz w:val="20"/>
+      </w:rPr>
+    </w:lvl>
+    <w:lvl w:ilvl="8" w:tentative="1">
+      <w:start w:val="1"/>
+      <w:numFmt w:val="bullet"/>
+      <w:lvlText w:val=""/>
+      <w:lvlJc w:val="left"/>
+      <w:pPr>
+        <w:tabs>
+          <w:tab w:val="num" w:pos="6480"/>
+        </w:tabs>
+        <w:ind w:left="6480" w:hanging="360"/>
+      </w:pPr>
+      <w:rPr>
+        <w:rFonts w:ascii="Symbol" w:hAnsi="Symbol" w:hint="default"/>
+        <w:sz w:val="20"/>
+      </w:rPr>
+    </w:lvl>
+  </w:abstractNum>
+  <w:abstractNum w:abstractNumId="1" w15:restartNumberingAfterBreak="0">
+    <w:nsid w:val="2DF96091"/>
+    <w:multiLevelType w:val="multilevel"/>
+    <w:tmpl w:val="E5AA3096"/>
+    <w:lvl w:ilvl="0">
+      <w:start w:val="1"/>
+      <w:numFmt w:val="bullet"/>
+      <w:lvlText w:val=""/>
+      <w:lvlJc w:val="left"/>
+      <w:pPr>
+        <w:tabs>
+          <w:tab w:val="num" w:pos="720"/>
+        </w:tabs>
+        <w:ind w:left="720" w:hanging="360"/>
+      </w:pPr>
+      <w:rPr>
+        <w:rFonts w:ascii="Symbol" w:hAnsi="Symbol" w:hint="default"/>
+        <w:sz w:val="20"/>
+      </w:rPr>
+    </w:lvl>
+    <w:lvl w:ilvl="1" w:tentative="1">
+      <w:start w:val="1"/>
+      <w:numFmt w:val="bullet"/>
+      <w:lvlText w:val=""/>
+      <w:lvlJc w:val="left"/>
+      <w:pPr>
+        <w:tabs>
+          <w:tab w:val="num" w:pos="1440"/>
+        </w:tabs>
+        <w:ind w:left="1440" w:hanging="360"/>
+      </w:pPr>
+      <w:rPr>
+        <w:rFonts w:ascii="Symbol" w:hAnsi="Symbol" w:hint="default"/>
+        <w:sz w:val="20"/>
+      </w:rPr>
+    </w:lvl>
+    <w:lvl w:ilvl="2" w:tentative="1">
+      <w:start w:val="1"/>
+      <w:numFmt w:val="bullet"/>
+      <w:lvlText w:val=""/>
+      <w:lvlJc w:val="left"/>
+      <w:pPr>
+        <w:tabs>
+          <w:tab w:val="num" w:pos="2160"/>
+        </w:tabs>
+        <w:ind w:left="2160" w:hanging="360"/>
+      </w:pPr>
+      <w:rPr>
+        <w:rFonts w:ascii="Symbol" w:hAnsi="Symbol" w:hint="default"/>
+        <w:sz w:val="20"/>
+      </w:rPr>
+    </w:lvl>
+    <w:lvl w:ilvl="3" w:tentative="1">
+      <w:start w:val="1"/>
+      <w:numFmt w:val="bullet"/>
+      <w:lvlText w:val=""/>
+      <w:lvlJc w:val="left"/>
+      <w:pPr>
+        <w:tabs>
+          <w:tab w:val="num" w:pos="2880"/>
+        </w:tabs>
+        <w:ind w:left="2880" w:hanging="360"/>
+      </w:pPr>
+      <w:rPr>
+        <w:rFonts w:ascii="Symbol" w:hAnsi="Symbol" w:hint="default"/>
+        <w:sz w:val="20"/>
+      </w:rPr>
+    </w:lvl>
+    <w:lvl w:ilvl="4" w:tentative="1">
+      <w:start w:val="1"/>
+      <w:numFmt w:val="bullet"/>
+      <w:lvlText w:val=""/>
+      <w:lvlJc w:val="left"/>
+      <w:pPr>
+        <w:tabs>
+          <w:tab w:val="num" w:pos="3600"/>
+        </w:tabs>
+        <w:ind w:left="3600" w:hanging="360"/>
+      </w:pPr>
+      <w:rPr>
+        <w:rFonts w:ascii="Symbol" w:hAnsi="Symbol" w:hint="default"/>
+        <w:sz w:val="20"/>
+      </w:rPr>
+    </w:lvl>
+    <w:lvl w:ilvl="5" w:tentative="1">
+      <w:start w:val="1"/>
+      <w:numFmt w:val="bullet"/>
+      <w:lvlText w:val=""/>
+      <w:lvlJc w:val="left"/>
+      <w:pPr>
+        <w:tabs>
+          <w:tab w:val="num" w:pos="4320"/>
+        </w:tabs>
+        <w:ind w:left="4320" w:hanging="360"/>
+      </w:pPr>
+      <w:rPr>
+        <w:rFonts w:ascii="Symbol" w:hAnsi="Symbol" w:hint="default"/>
+        <w:sz w:val="20"/>
+      </w:rPr>
+    </w:lvl>
+    <w:lvl w:ilvl="6" w:tentative="1">
+      <w:start w:val="1"/>
+      <w:numFmt w:val="bullet"/>
+      <w:lvlText w:val=""/>
+      <w:lvlJc w:val="left"/>
+      <w:pPr>
+        <w:tabs>
+          <w:tab w:val="num" w:pos="5040"/>
+        </w:tabs>
+        <w:ind w:left="5040" w:hanging="360"/>
+      </w:pPr>
+      <w:rPr>
+        <w:rFonts w:ascii="Symbol" w:hAnsi="Symbol" w:hint="default"/>
+        <w:sz w:val="20"/>
+      </w:rPr>
+    </w:lvl>
+    <w:lvl w:ilvl="7" w:tentative="1">
+      <w:start w:val="1"/>
+      <w:numFmt w:val="bullet"/>
+      <w:lvlText w:val=""/>
+      <w:lvlJc w:val="left"/>
+      <w:pPr>
+        <w:tabs>
+          <w:tab w:val="num" w:pos="5760"/>
+        </w:tabs>
+        <w:ind w:left="5760" w:hanging="360"/>
+      </w:pPr>
+      <w:rPr>
+        <w:rFonts w:ascii="Symbol" w:hAnsi="Symbol" w:hint="default"/>
+        <w:sz w:val="20"/>
+      </w:rPr>
+    </w:lvl>
+    <w:lvl w:ilvl="8" w:tentative="1">
+      <w:start w:val="1"/>
+      <w:numFmt w:val="bullet"/>
+      <w:lvlText w:val=""/>
+      <w:lvlJc w:val="left"/>
+      <w:pPr>
+        <w:tabs>
+          <w:tab w:val="num" w:pos="6480"/>
+        </w:tabs>
+        <w:ind w:left="6480" w:hanging="360"/>
+      </w:pPr>
+      <w:rPr>
+        <w:rFonts w:ascii="Symbol" w:hAnsi="Symbol" w:hint="default"/>
+        <w:sz w:val="20"/>
+      </w:rPr>
+    </w:lvl>
+  </w:abstractNum>
+  <w:abstractNum w:abstractNumId="2" w15:restartNumberingAfterBreak="0">
     <w:nsid w:val="32FE0545"/>
     <w:multiLevelType w:val="hybridMultilevel"/>
     <w:tmpl w:val="00000000"/>
@@ -6250,7 +7038,165 @@
       </w:rPr>
     </w:lvl>
   </w:abstractNum>
+  <w:abstractNum w:abstractNumId="3" w15:restartNumberingAfterBreak="0">
+    <w:nsid w:val="79B84846"/>
+    <w:multiLevelType w:val="multilevel"/>
+    <w:tmpl w:val="D89A0C3E"/>
+    <w:lvl w:ilvl="0">
+      <w:start w:val="1"/>
+      <w:numFmt w:val="bullet"/>
+      <w:lvlText w:val=""/>
+      <w:lvlJc w:val="left"/>
+      <w:pPr>
+        <w:tabs>
+          <w:tab w:val="num" w:pos="720"/>
+        </w:tabs>
+        <w:ind w:left="720" w:hanging="360"/>
+      </w:pPr>
+      <w:rPr>
+        <w:rFonts w:ascii="Symbol" w:hAnsi="Symbol" w:hint="default"/>
+        <w:sz w:val="20"/>
+      </w:rPr>
+    </w:lvl>
+    <w:lvl w:ilvl="1" w:tentative="1">
+      <w:start w:val="1"/>
+      <w:numFmt w:val="bullet"/>
+      <w:lvlText w:val=""/>
+      <w:lvlJc w:val="left"/>
+      <w:pPr>
+        <w:tabs>
+          <w:tab w:val="num" w:pos="1440"/>
+        </w:tabs>
+        <w:ind w:left="1440" w:hanging="360"/>
+      </w:pPr>
+      <w:rPr>
+        <w:rFonts w:ascii="Symbol" w:hAnsi="Symbol" w:hint="default"/>
+        <w:sz w:val="20"/>
+      </w:rPr>
+    </w:lvl>
+    <w:lvl w:ilvl="2" w:tentative="1">
+      <w:start w:val="1"/>
+      <w:numFmt w:val="bullet"/>
+      <w:lvlText w:val=""/>
+      <w:lvlJc w:val="left"/>
+      <w:pPr>
+        <w:tabs>
+          <w:tab w:val="num" w:pos="2160"/>
+        </w:tabs>
+        <w:ind w:left="2160" w:hanging="360"/>
+      </w:pPr>
+      <w:rPr>
+        <w:rFonts w:ascii="Symbol" w:hAnsi="Symbol" w:hint="default"/>
+        <w:sz w:val="20"/>
+      </w:rPr>
+    </w:lvl>
+    <w:lvl w:ilvl="3" w:tentative="1">
+      <w:start w:val="1"/>
+      <w:numFmt w:val="bullet"/>
+      <w:lvlText w:val=""/>
+      <w:lvlJc w:val="left"/>
+      <w:pPr>
+        <w:tabs>
+          <w:tab w:val="num" w:pos="2880"/>
+        </w:tabs>
+        <w:ind w:left="2880" w:hanging="360"/>
+      </w:pPr>
+      <w:rPr>
+        <w:rFonts w:ascii="Symbol" w:hAnsi="Symbol" w:hint="default"/>
+        <w:sz w:val="20"/>
+      </w:rPr>
+    </w:lvl>
+    <w:lvl w:ilvl="4" w:tentative="1">
+      <w:start w:val="1"/>
+      <w:numFmt w:val="bullet"/>
+      <w:lvlText w:val=""/>
+      <w:lvlJc w:val="left"/>
+      <w:pPr>
+        <w:tabs>
+          <w:tab w:val="num" w:pos="3600"/>
+        </w:tabs>
+        <w:ind w:left="3600" w:hanging="360"/>
+      </w:pPr>
+      <w:rPr>
+        <w:rFonts w:ascii="Symbol" w:hAnsi="Symbol" w:hint="default"/>
+        <w:sz w:val="20"/>
+      </w:rPr>
+    </w:lvl>
+    <w:lvl w:ilvl="5" w:tentative="1">
+      <w:start w:val="1"/>
+      <w:numFmt w:val="bullet"/>
+      <w:lvlText w:val=""/>
+      <w:lvlJc w:val="left"/>
+      <w:pPr>
+        <w:tabs>
+          <w:tab w:val="num" w:pos="4320"/>
+        </w:tabs>
+        <w:ind w:left="4320" w:hanging="360"/>
+      </w:pPr>
+      <w:rPr>
+        <w:rFonts w:ascii="Symbol" w:hAnsi="Symbol" w:hint="default"/>
+        <w:sz w:val="20"/>
+      </w:rPr>
+    </w:lvl>
+    <w:lvl w:ilvl="6" w:tentative="1">
+      <w:start w:val="1"/>
+      <w:numFmt w:val="bullet"/>
+      <w:lvlText w:val=""/>
+      <w:lvlJc w:val="left"/>
+      <w:pPr>
+        <w:tabs>
+          <w:tab w:val="num" w:pos="5040"/>
+        </w:tabs>
+        <w:ind w:left="5040" w:hanging="360"/>
+      </w:pPr>
+      <w:rPr>
+        <w:rFonts w:ascii="Symbol" w:hAnsi="Symbol" w:hint="default"/>
+        <w:sz w:val="20"/>
+      </w:rPr>
+    </w:lvl>
+    <w:lvl w:ilvl="7" w:tentative="1">
+      <w:start w:val="1"/>
+      <w:numFmt w:val="bullet"/>
+      <w:lvlText w:val=""/>
+      <w:lvlJc w:val="left"/>
+      <w:pPr>
+        <w:tabs>
+          <w:tab w:val="num" w:pos="5760"/>
+        </w:tabs>
+        <w:ind w:left="5760" w:hanging="360"/>
+      </w:pPr>
+      <w:rPr>
+        <w:rFonts w:ascii="Symbol" w:hAnsi="Symbol" w:hint="default"/>
+        <w:sz w:val="20"/>
+      </w:rPr>
+    </w:lvl>
+    <w:lvl w:ilvl="8" w:tentative="1">
+      <w:start w:val="1"/>
+      <w:numFmt w:val="bullet"/>
+      <w:lvlText w:val=""/>
+      <w:lvlJc w:val="left"/>
+      <w:pPr>
+        <w:tabs>
+          <w:tab w:val="num" w:pos="6480"/>
+        </w:tabs>
+        <w:ind w:left="6480" w:hanging="360"/>
+      </w:pPr>
+      <w:rPr>
+        <w:rFonts w:ascii="Symbol" w:hAnsi="Symbol" w:hint="default"/>
+        <w:sz w:val="20"/>
+      </w:rPr>
+    </w:lvl>
+  </w:abstractNum>
   <w:num w:numId="1" w16cid:durableId="1837380428">
+    <w:abstractNumId w:val="2"/>
+  </w:num>
+  <w:num w:numId="2" w16cid:durableId="723673274">
+    <w:abstractNumId w:val="1"/>
+  </w:num>
+  <w:num w:numId="3" w16cid:durableId="1997610581">
+    <w:abstractNumId w:val="3"/>
+  </w:num>
+  <w:num w:numId="4" w16cid:durableId="2097247484">
     <w:abstractNumId w:val="0"/>
   </w:num>
 </w:numbering>
@@ -6560,6 +7506,7 @@
   <w:style w:type="character" w:default="1" w:styleId="DefaultParagraphFont">
     <w:name w:val="Default Paragraph Font"/>
     <w:uiPriority w:val="1"/>
+    <w:semiHidden/>
     <w:unhideWhenUsed/>
   </w:style>
   <w:style w:type="table" w:default="1" w:styleId="TableNormal">
@@ -6724,6 +7671,50 @@
       <w:rFonts w:ascii="Calibri" w:eastAsia="Calibri" w:hAnsi="Calibri" w:cs="Calibri"/>
       <w:b/>
       <w:bCs/>
+    </w:rPr>
+  </w:style>
+  <w:style w:type="paragraph" w:styleId="Header">
+    <w:name w:val="header"/>
+    <w:basedOn w:val="Normal"/>
+    <w:link w:val="HeaderChar"/>
+    <w:rsid w:val="005D45BE"/>
+    <w:pPr>
+      <w:tabs>
+        <w:tab w:val="center" w:pos="4513"/>
+        <w:tab w:val="right" w:pos="9026"/>
+      </w:tabs>
+    </w:pPr>
+  </w:style>
+  <w:style w:type="character" w:customStyle="1" w:styleId="HeaderChar">
+    <w:name w:val="Header Char"/>
+    <w:basedOn w:val="DefaultParagraphFont"/>
+    <w:link w:val="Header"/>
+    <w:rsid w:val="005D45BE"/>
+    <w:rPr>
+      <w:sz w:val="24"/>
+      <w:szCs w:val="24"/>
+    </w:rPr>
+  </w:style>
+  <w:style w:type="paragraph" w:styleId="Footer">
+    <w:name w:val="footer"/>
+    <w:basedOn w:val="Normal"/>
+    <w:link w:val="FooterChar"/>
+    <w:rsid w:val="005D45BE"/>
+    <w:pPr>
+      <w:tabs>
+        <w:tab w:val="center" w:pos="4513"/>
+        <w:tab w:val="right" w:pos="9026"/>
+      </w:tabs>
+    </w:pPr>
+  </w:style>
+  <w:style w:type="character" w:customStyle="1" w:styleId="FooterChar">
+    <w:name w:val="Footer Char"/>
+    <w:basedOn w:val="DefaultParagraphFont"/>
+    <w:link w:val="Footer"/>
+    <w:rsid w:val="005D45BE"/>
+    <w:rPr>
+      <w:sz w:val="24"/>
+      <w:szCs w:val="24"/>
     </w:rPr>
   </w:style>
 </w:styles>

</xml_diff>